<commit_message>
feat: enhance PSIR template and data structure
- Added trueName field to IdentifyingData interface for better identification.
- Updated seed script to include trueName and additional fields for letter details and case numbers.
- Modified PSIR document template to utilize dynamic placeholders for letter details, case numbers, and other personal information.
- Improved overall structure and readability of the PSIR document by replacing static text with placeholders for dynamic data insertion.
</commit_message>
<xml_diff>
--- a/templates/PSIR.docx
+++ b/templates/PSIR.docx
@@ -53,7 +53,7 @@
           <w:szCs w:val="24"/>
           <w:lang w:val="en-PH"/>
         </w:rPr>
-        <w:t>February 13, 2026</w:t>
+        <w:t>{Created_Date}</w:t>
       </w:r>
     </w:p>
     <w:p>
@@ -79,29 +79,6 @@
           <w:lang w:val="en-PH"/>
         </w:rPr>
       </w:pPr>
-    </w:p>
-    <w:p>
-      <w:pPr>
-        <w:spacing w:line="276" w:lineRule="auto"/>
-        <w:jc w:val="both"/>
-        <w:rPr>
-          <w:rFonts w:ascii="Arial" w:hAnsi="Arial" w:cs="Arial"/>
-          <w:sz w:val="24"/>
-          <w:szCs w:val="24"/>
-          <w:lang w:val="en-PH"/>
-        </w:rPr>
-      </w:pPr>
-      <w:r>
-        <w:rPr>
-          <w:rFonts w:ascii="Arial" w:hAnsi="Arial" w:cs="Arial"/>
-          <w:b/>
-          <w:noProof/>
-          <w:sz w:val="24"/>
-          <w:szCs w:val="24"/>
-          <w:lang w:val="en-PH"/>
-        </w:rPr>
-        <w:t>HON. SAMSON ARIEL C. CAYETUNA</w:t>
-      </w:r>
     </w:p>
     <w:p>
       <w:pPr>
@@ -113,19 +90,20 @@
         <w:rPr>
           <w:rFonts w:ascii="Arial" w:hAnsi="Arial" w:cs="Arial"/>
           <w:b/>
+          <w:noProof/>
           <w:sz w:val="24"/>
           <w:szCs w:val="24"/>
-          <w:lang w:val="en-PH"/>
         </w:rPr>
       </w:pPr>
       <w:r>
         <w:rPr>
           <w:rFonts w:ascii="Arial" w:hAnsi="Arial" w:cs="Arial"/>
+          <w:b/>
+          <w:noProof/>
           <w:sz w:val="24"/>
           <w:szCs w:val="24"/>
-          <w:lang w:val="en-PH"/>
-        </w:rPr>
-        <w:t>Acting Presiding Judge</w:t>
+        </w:rPr>
+        <w:t>{Letter_Judge}</w:t>
       </w:r>
     </w:p>
     <w:p>
@@ -136,18 +114,15 @@
           <w:rFonts w:ascii="Arial" w:hAnsi="Arial" w:cs="Arial"/>
           <w:sz w:val="24"/>
           <w:szCs w:val="24"/>
-          <w:lang w:val="en-PH"/>
         </w:rPr>
       </w:pPr>
       <w:r>
         <w:rPr>
           <w:rFonts w:ascii="Arial" w:hAnsi="Arial" w:cs="Arial"/>
-          <w:noProof/>
           <w:sz w:val="24"/>
           <w:szCs w:val="24"/>
-          <w:lang w:val="en-PH"/>
-        </w:rPr>
-        <w:t>RTC BRANCH 3</w:t>
+        </w:rPr>
+        <w:t>{Letter_Position}</w:t>
       </w:r>
     </w:p>
     <w:p>
@@ -156,19 +131,38 @@
         <w:jc w:val="both"/>
         <w:rPr>
           <w:rFonts w:ascii="Arial" w:hAnsi="Arial" w:cs="Arial"/>
+          <w:noProof/>
           <w:sz w:val="24"/>
           <w:szCs w:val="24"/>
-          <w:lang w:val="en-PH"/>
         </w:rPr>
       </w:pPr>
       <w:r>
         <w:rPr>
           <w:rFonts w:ascii="Arial" w:hAnsi="Arial" w:cs="Arial"/>
+          <w:noProof/>
           <w:sz w:val="24"/>
           <w:szCs w:val="24"/>
-          <w:lang w:val="en-PH"/>
-        </w:rPr>
-        <w:t>Tagbilaran City</w:t>
+        </w:rPr>
+        <w:t>{Letter_Court}</w:t>
+      </w:r>
+    </w:p>
+    <w:p>
+      <w:pPr>
+        <w:spacing w:line="276" w:lineRule="auto"/>
+        <w:jc w:val="both"/>
+        <w:rPr>
+          <w:rFonts w:ascii="Arial" w:hAnsi="Arial" w:cs="Arial"/>
+          <w:sz w:val="24"/>
+          <w:szCs w:val="24"/>
+        </w:rPr>
+      </w:pPr>
+      <w:r>
+        <w:rPr>
+          <w:rFonts w:ascii="Arial" w:hAnsi="Arial" w:cs="Arial"/>
+          <w:sz w:val="24"/>
+          <w:szCs w:val="24"/>
+        </w:rPr>
+        <w:t>{Letter_Address}</w:t>
       </w:r>
     </w:p>
     <w:p>
@@ -401,15 +395,15 @@
           <w:sz w:val="24"/>
           <w:szCs w:val="24"/>
         </w:rPr>
-        <w:t>{Case_Number}</w:t>
+        <w:t>{Criminal_Case_Number}</w:t>
       </w:r>
       <w:r>
         <w:rPr>
           <w:rFonts w:ascii="Arial" w:hAnsi="Arial" w:cs="Arial"/>
           <w:bCs/>
+          <w:noProof/>
           <w:sz w:val="24"/>
           <w:szCs w:val="24"/>
-          <w:lang w:val="en-PH"/>
         </w:rPr>
         <w:t xml:space="preserve"> </w:t>
       </w:r>
@@ -1350,7 +1344,7 @@
                                       <pic:cNvPicPr/>
                                     </pic:nvPicPr>
                                     <pic:blipFill>
-                                      <a:blip r:embed="rId8" cstate="print"/>
+                                      <a:blip r:embed="rId11" cstate="print"/>
                                       <a:srcRect/>
                                       <a:stretch/>
                                     </pic:blipFill>
@@ -1378,7 +1372,7 @@
                           </w:rPr>
                           <w:t xml:space="preserve"> </w:t>
                         </w:r>
-                        <w:hyperlink r:id="rId11" w:history="1">
+                        <w:hyperlink r:id="rId12" w:history="1">
                           <w:r>
                             <w:rPr>
                               <w:rStyle w:val="Hyperlink"/>
@@ -1438,7 +1432,7 @@
                   <o:lock v:ext="edit" aspectratio="t"/>
                 </v:shapetype>
                 <v:shape id="Image" o:spid="_x0000_s1031" type="#_x0000_t75" style="position:absolute;top:4191;width:9239;height:9048;visibility:visible;mso-wrap-style:square" o:gfxdata="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">
-                  <v:imagedata r:id="rId12" o:title=""/>
+                  <v:imagedata r:id="rId13" o:title=""/>
                 </v:shape>
               </v:group>
             </w:pict>
@@ -2007,6 +2001,14 @@
                 <w:szCs w:val="24"/>
               </w:rPr>
             </w:pPr>
+            <w:r>
+              <w:rPr>
+                <w:rFonts w:ascii="Arial" w:hAnsi="Arial" w:cs="Arial"/>
+                <w:sz w:val="22"/>
+                <w:szCs w:val="24"/>
+              </w:rPr>
+              <w:t>{True_Name}</w:t>
+            </w:r>
           </w:p>
         </w:tc>
       </w:tr>
@@ -2183,6 +2185,14 @@
                 <w:szCs w:val="24"/>
               </w:rPr>
             </w:pPr>
+            <w:r>
+              <w:rPr>
+                <w:rFonts w:ascii="Arial" w:hAnsi="Arial" w:cs="Arial"/>
+                <w:sz w:val="22"/>
+                <w:szCs w:val="24"/>
+              </w:rPr>
+              <w:t>{Educational_Attainment}</w:t>
+            </w:r>
           </w:p>
         </w:tc>
       </w:tr>
@@ -2359,6 +2369,14 @@
                 <w:szCs w:val="24"/>
               </w:rPr>
             </w:pPr>
+            <w:r>
+              <w:rPr>
+                <w:rFonts w:ascii="Arial" w:hAnsi="Arial" w:cs="Arial"/>
+                <w:sz w:val="24"/>
+                <w:szCs w:val="24"/>
+              </w:rPr>
+              <w:t>{Religion}</w:t>
+            </w:r>
           </w:p>
         </w:tc>
       </w:tr>
@@ -3343,6 +3361,15 @@
                 <w:szCs w:val="24"/>
               </w:rPr>
             </w:pPr>
+            <w:r>
+              <w:rPr>
+                <w:rFonts w:ascii="Arial" w:hAnsi="Arial" w:cs="Arial"/>
+                <w:color w:val="000000" w:themeColor="text1"/>
+                <w:sz w:val="22"/>
+                <w:szCs w:val="24"/>
+              </w:rPr>
+              <w:t>{Identifying_Marks}</w:t>
+            </w:r>
           </w:p>
         </w:tc>
       </w:tr>
@@ -3418,8 +3445,18 @@
                 <w:rFonts w:ascii="Arial" w:hAnsi="Arial" w:cs="Arial"/>
                 <w:sz w:val="24"/>
                 <w:szCs w:val="24"/>
-              </w:rPr>
-            </w:pPr>
+                <w:lang w:val="fr-FR"/>
+              </w:rPr>
+            </w:pPr>
+            <w:r>
+              <w:rPr>
+                <w:rFonts w:ascii="Arial" w:hAnsi="Arial" w:cs="Arial"/>
+                <w:sz w:val="24"/>
+                <w:szCs w:val="24"/>
+                <w:lang w:val="fr-FR"/>
+              </w:rPr>
+              <w:t>{Present_Address}</w:t>
+            </w:r>
           </w:p>
         </w:tc>
       </w:tr>
@@ -3665,7 +3702,7 @@
                 <w:sz w:val="24"/>
                 <w:szCs w:val="32"/>
               </w:rPr>
-              <w:t>Po</w:t>
+              <w:t>{Charged_With}</w:t>
             </w:r>
           </w:p>
         </w:tc>
@@ -3756,6 +3793,14 @@
                 <w:szCs w:val="24"/>
               </w:rPr>
             </w:pPr>
+            <w:r>
+              <w:rPr>
+                <w:rFonts w:ascii="Arial" w:hAnsi="Arial" w:cs="Arial"/>
+                <w:sz w:val="22"/>
+                <w:szCs w:val="24"/>
+              </w:rPr>
+              <w:t>{Charged_Date}</w:t>
+            </w:r>
           </w:p>
         </w:tc>
       </w:tr>
@@ -3831,6 +3876,14 @@
                 <w:szCs w:val="24"/>
               </w:rPr>
             </w:pPr>
+            <w:r>
+              <w:rPr>
+                <w:rFonts w:ascii="Arial" w:hAnsi="Arial" w:cs="Arial"/>
+                <w:sz w:val="22"/>
+                <w:szCs w:val="24"/>
+              </w:rPr>
+              <w:t>{Charged_Date}</w:t>
+            </w:r>
           </w:p>
         </w:tc>
         <w:tc>
@@ -3921,6 +3974,14 @@
                 <w:szCs w:val="24"/>
               </w:rPr>
             </w:pPr>
+            <w:r>
+              <w:rPr>
+                <w:rFonts w:ascii="Arial" w:hAnsi="Arial" w:cs="Arial"/>
+                <w:sz w:val="24"/>
+                <w:szCs w:val="24"/>
+              </w:rPr>
+              <w:t>{Convicted_Date}</w:t>
+            </w:r>
           </w:p>
         </w:tc>
       </w:tr>
@@ -3990,6 +4051,14 @@
               </w:rPr>
               <w:t>:</w:t>
             </w:r>
+            <w:r>
+              <w:rPr>
+                <w:rFonts w:ascii="Arial" w:hAnsi="Arial" w:cs="Arial"/>
+                <w:sz w:val="22"/>
+                <w:szCs w:val="24"/>
+              </w:rPr>
+              <w:t>{Sentence}</w:t>
+            </w:r>
           </w:p>
         </w:tc>
       </w:tr>
@@ -4065,6 +4134,30 @@
                 <w:szCs w:val="24"/>
               </w:rPr>
             </w:pPr>
+            <w:r>
+              <w:rPr>
+                <w:rFonts w:ascii="Arial" w:hAnsi="Arial" w:cs="Arial"/>
+                <w:sz w:val="22"/>
+                <w:szCs w:val="24"/>
+              </w:rPr>
+              <w:t>{</w:t>
+            </w:r>
+            <w:r>
+              <w:rPr>
+                <w:rFonts w:ascii="Arial" w:hAnsi="Arial" w:cs="Arial"/>
+                <w:sz w:val="22"/>
+                <w:szCs w:val="24"/>
+              </w:rPr>
+              <w:t>Letter_</w:t>
+            </w:r>
+            <w:r>
+              <w:rPr>
+                <w:rFonts w:ascii="Arial" w:hAnsi="Arial" w:cs="Arial"/>
+                <w:sz w:val="22"/>
+                <w:szCs w:val="24"/>
+              </w:rPr>
+              <w:t>Judge}</w:t>
+            </w:r>
           </w:p>
         </w:tc>
         <w:tc>
@@ -4159,6 +4252,30 @@
                 <w:szCs w:val="24"/>
               </w:rPr>
             </w:pPr>
+            <w:r>
+              <w:rPr>
+                <w:rFonts w:ascii="Arial" w:hAnsi="Arial" w:cs="Arial"/>
+                <w:sz w:val="24"/>
+                <w:szCs w:val="24"/>
+              </w:rPr>
+              <w:t>{</w:t>
+            </w:r>
+            <w:r>
+              <w:rPr>
+                <w:rFonts w:ascii="Arial" w:hAnsi="Arial" w:cs="Arial"/>
+                <w:sz w:val="24"/>
+                <w:szCs w:val="24"/>
+              </w:rPr>
+              <w:t>Letter_</w:t>
+            </w:r>
+            <w:r>
+              <w:rPr>
+                <w:rFonts w:ascii="Arial" w:hAnsi="Arial" w:cs="Arial"/>
+                <w:sz w:val="24"/>
+                <w:szCs w:val="24"/>
+              </w:rPr>
+              <w:t>Court}</w:t>
+            </w:r>
           </w:p>
         </w:tc>
       </w:tr>
@@ -4240,49 +4357,33 @@
                 <w:sz w:val="22"/>
                 <w:szCs w:val="22"/>
               </w:rPr>
-              <w:t>{Status_On_Trial}</w:t>
-            </w:r>
-            <w:r>
-              <w:rPr>
-                <w:rFonts w:ascii="Arial" w:hAnsi="Arial" w:cs="Arial"/>
-                <w:sz w:val="22"/>
-                <w:szCs w:val="22"/>
-                <w:lang w:val="en-PH" w:eastAsia="en-PH"/>
-              </w:rPr>
-              <w:t xml:space="preserve"> On Bail   </w:t>
-            </w:r>
-            <w:r>
-              <w:rPr>
-                <w:rFonts w:ascii="Arial" w:hAnsi="Arial" w:cs="Arial"/>
-                <w:sz w:val="22"/>
-                <w:szCs w:val="22"/>
-              </w:rPr>
-              <w:t>{</w:t>
-            </w:r>
-            <w:r>
-              <w:rPr>
-                <w:rFonts w:ascii="Arial" w:hAnsi="Arial" w:cs="Arial"/>
-                <w:sz w:val="22"/>
-                <w:szCs w:val="22"/>
-              </w:rPr>
-              <w:t>Status_On_Detention</w:t>
-            </w:r>
-            <w:r>
-              <w:rPr>
-                <w:rFonts w:ascii="Arial" w:hAnsi="Arial" w:cs="Arial"/>
-                <w:sz w:val="22"/>
-                <w:szCs w:val="22"/>
-              </w:rPr>
-              <w:t>}</w:t>
-            </w:r>
-            <w:r>
-              <w:rPr>
-                <w:rFonts w:ascii="Arial" w:hAnsi="Arial" w:cs="Arial"/>
-                <w:sz w:val="22"/>
-                <w:szCs w:val="22"/>
-                <w:lang w:val="en-PH" w:eastAsia="en-PH"/>
-              </w:rPr>
-              <w:t xml:space="preserve"> On Detention</w:t>
+              <w:t>{Custodial_On_Bail}</w:t>
+            </w:r>
+            <w:r>
+              <w:rPr>
+                <w:rFonts w:ascii="Arial" w:hAnsi="Arial" w:cs="Arial"/>
+                <w:sz w:val="22"/>
+                <w:szCs w:val="22"/>
+                <w:lang w:val="en-PH" w:eastAsia="en-PH"/>
+              </w:rPr>
+              <w:t xml:space="preserve">On Bail   </w:t>
+            </w:r>
+            <w:r>
+              <w:rPr>
+                <w:rFonts w:ascii="Arial" w:hAnsi="Arial" w:cs="Arial"/>
+                <w:sz w:val="22"/>
+                <w:szCs w:val="22"/>
+              </w:rPr>
+              <w:t>{Custodial_On_Detention}</w:t>
+            </w:r>
+            <w:r>
+              <w:rPr>
+                <w:rFonts w:ascii="Arial" w:hAnsi="Arial" w:cs="Arial"/>
+                <w:sz w:val="22"/>
+                <w:szCs w:val="22"/>
+                <w:lang w:val="en-PH" w:eastAsia="en-PH"/>
+              </w:rPr>
+              <w:t>On Detention</w:t>
             </w:r>
           </w:p>
         </w:tc>
@@ -4338,25 +4439,37 @@
                 <w:rFonts w:ascii="Arial" w:hAnsi="Arial" w:cs="Arial"/>
                 <w:sz w:val="22"/>
                 <w:szCs w:val="22"/>
-                <w:lang w:val="en-PH" w:eastAsia="en-PH"/>
-              </w:rPr>
-            </w:pPr>
-            <w:r>
-              <w:rPr>
-                <w:rFonts w:ascii="MS Gothic" w:eastAsia="MS Gothic" w:hAnsi="MS Gothic" w:cs="Arial" w:hint="eastAsia"/>
-                <w:sz w:val="24"/>
-                <w:szCs w:val="24"/>
-              </w:rPr>
-              <w:t>☐</w:t>
-            </w:r>
-            <w:r>
-              <w:rPr>
-                <w:rFonts w:ascii="Arial" w:hAnsi="Arial" w:cs="Arial"/>
-                <w:sz w:val="22"/>
-                <w:szCs w:val="22"/>
-                <w:lang w:val="en-PH" w:eastAsia="en-PH"/>
-              </w:rPr>
-              <w:t xml:space="preserve"> ROR – Custodian: </w:t>
+                <w:lang w:val="fr-FR" w:eastAsia="en-PH"/>
+              </w:rPr>
+            </w:pPr>
+            <w:r>
+              <w:rPr>
+                <w:rFonts w:ascii="Arial" w:hAnsi="Arial" w:cs="Arial"/>
+                <w:sz w:val="22"/>
+                <w:szCs w:val="22"/>
+                <w:lang w:val="fr-FR" w:eastAsia="en-PH"/>
+              </w:rPr>
+              <w:t>{Custodial_ROR}</w:t>
+            </w:r>
+          </w:p>
+          <w:p>
+            <w:pPr>
+              <w:suppressAutoHyphens w:val="0"/>
+              <w:rPr>
+                <w:rFonts w:ascii="Arial" w:hAnsi="Arial" w:cs="Arial"/>
+                <w:sz w:val="22"/>
+                <w:szCs w:val="22"/>
+                <w:lang w:val="en-PH" w:eastAsia="en-PH"/>
+              </w:rPr>
+            </w:pPr>
+            <w:r>
+              <w:rPr>
+                <w:rFonts w:ascii="Arial" w:hAnsi="Arial" w:cs="Arial"/>
+                <w:sz w:val="22"/>
+                <w:szCs w:val="22"/>
+                <w:lang w:val="en-PH" w:eastAsia="en-PH"/>
+              </w:rPr>
+              <w:t xml:space="preserve">ROR – Custodian: </w:t>
             </w:r>
           </w:p>
         </w:tc>
@@ -4377,6 +4490,16 @@
                 <w:lang w:val="en-PH" w:eastAsia="en-PH"/>
               </w:rPr>
             </w:pPr>
+            <w:r>
+              <w:rPr>
+                <w:rFonts w:ascii="Arial" w:hAnsi="Arial" w:cs="Arial"/>
+                <w:sz w:val="22"/>
+                <w:szCs w:val="22"/>
+                <w:u w:val="single"/>
+                <w:lang w:val="en-PH" w:eastAsia="en-PH"/>
+              </w:rPr>
+              <w:t>{ROR_Custodian}</w:t>
+            </w:r>
           </w:p>
         </w:tc>
       </w:tr>
@@ -4550,11 +4673,11 @@
         <w:tblLook w:val="04A0" w:firstRow="1" w:lastRow="0" w:firstColumn="1" w:lastColumn="0" w:noHBand="0" w:noVBand="1"/>
       </w:tblPr>
       <w:tblGrid>
-        <w:gridCol w:w="1705"/>
-        <w:gridCol w:w="1620"/>
-        <w:gridCol w:w="1440"/>
-        <w:gridCol w:w="1530"/>
-        <w:gridCol w:w="4050"/>
+        <w:gridCol w:w="1597"/>
+        <w:gridCol w:w="2351"/>
+        <w:gridCol w:w="1762"/>
+        <w:gridCol w:w="2362"/>
+        <w:gridCol w:w="2507"/>
       </w:tblGrid>
       <w:tr>
         <w:tc>
@@ -4733,6 +4856,13 @@
                 <w:szCs w:val="24"/>
               </w:rPr>
             </w:pPr>
+            <w:r>
+              <w:rPr>
+                <w:rFonts w:ascii="Arial" w:hAnsi="Arial" w:cs="Arial"/>
+                <w:szCs w:val="24"/>
+              </w:rPr>
+              <w:t>{NBI_Case_Number}</w:t>
+            </w:r>
           </w:p>
         </w:tc>
         <w:tc>
@@ -4748,6 +4878,13 @@
                 <w:szCs w:val="24"/>
               </w:rPr>
             </w:pPr>
+            <w:r>
+              <w:rPr>
+                <w:rFonts w:ascii="Arial" w:hAnsi="Arial" w:cs="Arial"/>
+                <w:szCs w:val="24"/>
+              </w:rPr>
+              <w:t>{NBI_Offense}</w:t>
+            </w:r>
           </w:p>
         </w:tc>
         <w:tc>
@@ -4763,6 +4900,13 @@
                 <w:szCs w:val="24"/>
               </w:rPr>
             </w:pPr>
+            <w:r>
+              <w:rPr>
+                <w:rFonts w:ascii="Arial" w:hAnsi="Arial" w:cs="Arial"/>
+                <w:szCs w:val="24"/>
+              </w:rPr>
+              <w:t>{NBI_Date_Charged}</w:t>
+            </w:r>
           </w:p>
         </w:tc>
         <w:tc>
@@ -4783,7 +4927,7 @@
                 <w:rFonts w:ascii="Arial" w:hAnsi="Arial" w:cs="Arial"/>
                 <w:szCs w:val="24"/>
               </w:rPr>
-              <w:t>No record on file</w:t>
+              <w:t>{NBI_Decision_Status}</w:t>
             </w:r>
           </w:p>
         </w:tc>
@@ -4825,6 +4969,13 @@
                 <w:szCs w:val="24"/>
               </w:rPr>
             </w:pPr>
+            <w:r>
+              <w:rPr>
+                <w:rFonts w:ascii="Arial" w:hAnsi="Arial" w:cs="Arial"/>
+                <w:szCs w:val="24"/>
+              </w:rPr>
+              <w:t>{CMRD_Case_Number}</w:t>
+            </w:r>
           </w:p>
         </w:tc>
         <w:tc>
@@ -4840,6 +4991,13 @@
                 <w:szCs w:val="24"/>
               </w:rPr>
             </w:pPr>
+            <w:r>
+              <w:rPr>
+                <w:rFonts w:ascii="Arial" w:hAnsi="Arial" w:cs="Arial"/>
+                <w:szCs w:val="24"/>
+              </w:rPr>
+              <w:t>{CMRD_Offense}</w:t>
+            </w:r>
           </w:p>
         </w:tc>
         <w:tc>
@@ -4855,6 +5013,13 @@
                 <w:szCs w:val="24"/>
               </w:rPr>
             </w:pPr>
+            <w:r>
+              <w:rPr>
+                <w:rFonts w:ascii="Arial" w:hAnsi="Arial" w:cs="Arial"/>
+                <w:szCs w:val="24"/>
+              </w:rPr>
+              <w:t>{CMRD_Date_Charged}</w:t>
+            </w:r>
           </w:p>
         </w:tc>
         <w:tc>
@@ -4875,7 +5040,7 @@
                 <w:rFonts w:ascii="Arial" w:hAnsi="Arial" w:cs="Arial"/>
                 <w:szCs w:val="24"/>
               </w:rPr>
-              <w:t>No derogatory record</w:t>
+              <w:t>{CMRD_Decision_Status}</w:t>
             </w:r>
           </w:p>
         </w:tc>
@@ -4920,6 +5085,13 @@
                 <w:szCs w:val="24"/>
               </w:rPr>
             </w:pPr>
+            <w:r>
+              <w:rPr>
+                <w:rFonts w:ascii="Arial" w:hAnsi="Arial" w:cs="Arial"/>
+                <w:szCs w:val="24"/>
+              </w:rPr>
+              <w:t>{Others_Case_Number}</w:t>
+            </w:r>
           </w:p>
         </w:tc>
         <w:tc>
@@ -4935,6 +5107,13 @@
                 <w:szCs w:val="24"/>
               </w:rPr>
             </w:pPr>
+            <w:r>
+              <w:rPr>
+                <w:rFonts w:ascii="Arial" w:hAnsi="Arial" w:cs="Arial"/>
+                <w:szCs w:val="24"/>
+              </w:rPr>
+              <w:t>{Others_Offense}</w:t>
+            </w:r>
           </w:p>
         </w:tc>
         <w:tc>
@@ -4950,6 +5129,13 @@
                 <w:szCs w:val="24"/>
               </w:rPr>
             </w:pPr>
+            <w:r>
+              <w:rPr>
+                <w:rFonts w:ascii="Arial" w:hAnsi="Arial" w:cs="Arial"/>
+                <w:szCs w:val="24"/>
+              </w:rPr>
+              <w:t>{Others_Date_Charged}</w:t>
+            </w:r>
           </w:p>
         </w:tc>
         <w:tc>
@@ -4970,7 +5156,7 @@
                 <w:rFonts w:ascii="Arial" w:hAnsi="Arial" w:cs="Arial"/>
                 <w:szCs w:val="24"/>
               </w:rPr>
-              <w:t>None</w:t>
+              <w:t>{Others_Decision_Status}</w:t>
             </w:r>
           </w:p>
         </w:tc>
@@ -5773,11 +5959,12 @@
             </w:pPr>
             <w:r>
               <w:rPr>
-                <w:rFonts w:ascii="MS Gothic" w:eastAsia="MS Gothic" w:hAnsi="MS Gothic" w:cs="Arial" w:hint="eastAsia"/>
-                <w:sz w:val="24"/>
-                <w:szCs w:val="24"/>
-              </w:rPr>
-              <w:t>☐</w:t>
+                <w:rFonts w:ascii="Arial" w:hAnsi="Arial" w:cs="Arial"/>
+                <w:sz w:val="22"/>
+                <w:szCs w:val="22"/>
+                <w:lang w:val="en-PH" w:eastAsia="en-PH"/>
+              </w:rPr>
+              <w:t>{Status_Poor}</w:t>
             </w:r>
             <w:r>
               <w:rPr>
@@ -5868,11 +6055,12 @@
             </w:pPr>
             <w:r>
               <w:rPr>
-                <w:rFonts w:ascii="MS Gothic" w:eastAsia="MS Gothic" w:hAnsi="MS Gothic" w:cs="Arial" w:hint="eastAsia"/>
-                <w:sz w:val="24"/>
-                <w:szCs w:val="24"/>
-              </w:rPr>
-              <w:t>☐</w:t>
+                <w:rFonts w:ascii="Arial" w:hAnsi="Arial" w:cs="Arial"/>
+                <w:sz w:val="22"/>
+                <w:szCs w:val="22"/>
+                <w:lang w:val="en-PH" w:eastAsia="en-PH"/>
+              </w:rPr>
+              <w:t>{Relationship_Very_Satisfactory}</w:t>
             </w:r>
             <w:r>
               <w:rPr>
@@ -5963,11 +6151,12 @@
             </w:pPr>
             <w:r>
               <w:rPr>
-                <w:rFonts w:ascii="MS Gothic" w:eastAsia="MS Gothic" w:hAnsi="MS Gothic" w:cs="Arial" w:hint="eastAsia"/>
-                <w:sz w:val="24"/>
-                <w:szCs w:val="24"/>
-              </w:rPr>
-              <w:t>☐</w:t>
+                <w:rFonts w:ascii="Arial" w:hAnsi="Arial" w:cs="Arial"/>
+                <w:sz w:val="22"/>
+                <w:szCs w:val="22"/>
+                <w:lang w:val="en-PH" w:eastAsia="en-PH"/>
+              </w:rPr>
+              <w:t>{Reputation_Very_Satisfactory}</w:t>
             </w:r>
             <w:r>
               <w:rPr>
@@ -6088,20 +6277,39 @@
             </w:pPr>
             <w:r>
               <w:rPr>
-                <w:rFonts w:ascii="MS Gothic" w:eastAsia="MS Gothic" w:hAnsi="MS Gothic" w:cs="Arial" w:hint="eastAsia"/>
-                <w:sz w:val="24"/>
-                <w:szCs w:val="24"/>
-              </w:rPr>
-              <w:t>☐</w:t>
-            </w:r>
-            <w:r>
-              <w:rPr>
-                <w:rFonts w:ascii="Arial" w:hAnsi="Arial" w:cs="Arial"/>
-                <w:sz w:val="22"/>
-                <w:szCs w:val="22"/>
-                <w:lang w:val="en-PH" w:eastAsia="en-PH"/>
-              </w:rPr>
-              <w:t xml:space="preserve"> Low-income Class (but </w:t>
+                <w:rFonts w:ascii="Arial" w:hAnsi="Arial" w:cs="Arial"/>
+                <w:sz w:val="22"/>
+                <w:szCs w:val="22"/>
+                <w:lang w:val="en-PH" w:eastAsia="en-PH"/>
+              </w:rPr>
+              <w:t>{Status_</w:t>
+            </w:r>
+            <w:r>
+              <w:rPr>
+                <w:rFonts w:ascii="Arial" w:hAnsi="Arial" w:cs="Arial"/>
+                <w:sz w:val="22"/>
+                <w:szCs w:val="22"/>
+                <w:lang w:val="en-PH" w:eastAsia="en-PH"/>
+              </w:rPr>
+              <w:t>Low_Income</w:t>
+            </w:r>
+            <w:r>
+              <w:rPr>
+                <w:rFonts w:ascii="Arial" w:hAnsi="Arial" w:cs="Arial"/>
+                <w:sz w:val="22"/>
+                <w:szCs w:val="22"/>
+                <w:lang w:val="en-PH" w:eastAsia="en-PH"/>
+              </w:rPr>
+              <w:t>}</w:t>
+            </w:r>
+            <w:r>
+              <w:rPr>
+                <w:rFonts w:ascii="Arial" w:hAnsi="Arial" w:cs="Arial"/>
+                <w:sz w:val="22"/>
+                <w:szCs w:val="22"/>
+                <w:lang w:val="en-PH" w:eastAsia="en-PH"/>
+              </w:rPr>
+              <w:t xml:space="preserve">Low-income Class (but </w:t>
             </w:r>
           </w:p>
           <w:p>
@@ -6203,11 +6411,12 @@
             </w:pPr>
             <w:r>
               <w:rPr>
-                <w:rFonts w:ascii="MS Gothic" w:eastAsia="MS Gothic" w:hAnsi="MS Gothic" w:cs="Arial" w:hint="eastAsia"/>
-                <w:sz w:val="24"/>
-                <w:szCs w:val="24"/>
-              </w:rPr>
-              <w:t>☒</w:t>
+                <w:rFonts w:ascii="Arial" w:hAnsi="Arial" w:cs="Arial"/>
+                <w:sz w:val="22"/>
+                <w:szCs w:val="22"/>
+                <w:lang w:val="en-PH" w:eastAsia="en-PH"/>
+              </w:rPr>
+              <w:t>{Relationship_Satisfactory}</w:t>
             </w:r>
             <w:r>
               <w:rPr>
@@ -6297,11 +6506,12 @@
             </w:pPr>
             <w:r>
               <w:rPr>
-                <w:rFonts w:ascii="MS Gothic" w:eastAsia="MS Gothic" w:hAnsi="MS Gothic" w:cs="Arial" w:hint="eastAsia"/>
-                <w:sz w:val="24"/>
-                <w:szCs w:val="24"/>
-              </w:rPr>
-              <w:t>☒</w:t>
+                <w:rFonts w:ascii="Arial" w:hAnsi="Arial" w:cs="Arial"/>
+                <w:sz w:val="22"/>
+                <w:szCs w:val="22"/>
+                <w:lang w:val="en-PH" w:eastAsia="en-PH"/>
+              </w:rPr>
+              <w:t>{Reputation_Satisfactory}</w:t>
             </w:r>
             <w:r>
               <w:rPr>
@@ -6494,11 +6704,12 @@
             </w:pPr>
             <w:r>
               <w:rPr>
-                <w:rFonts w:ascii="MS Gothic" w:eastAsia="MS Gothic" w:hAnsi="MS Gothic" w:cs="Arial" w:hint="eastAsia"/>
-                <w:sz w:val="24"/>
-                <w:szCs w:val="24"/>
-              </w:rPr>
-              <w:t>☐</w:t>
+                <w:rFonts w:ascii="Arial" w:hAnsi="Arial" w:cs="Arial"/>
+                <w:sz w:val="22"/>
+                <w:szCs w:val="22"/>
+                <w:lang w:val="en-PH" w:eastAsia="en-PH"/>
+              </w:rPr>
+              <w:t>{Relationship_Poor}</w:t>
             </w:r>
             <w:r>
               <w:rPr>
@@ -6584,11 +6795,12 @@
             </w:pPr>
             <w:r>
               <w:rPr>
-                <w:rFonts w:ascii="MS Gothic" w:eastAsia="MS Gothic" w:hAnsi="MS Gothic" w:cs="Arial" w:hint="eastAsia"/>
-                <w:sz w:val="24"/>
-                <w:szCs w:val="24"/>
-              </w:rPr>
-              <w:t>☐</w:t>
+                <w:rFonts w:ascii="Arial" w:hAnsi="Arial" w:cs="Arial"/>
+                <w:sz w:val="22"/>
+                <w:szCs w:val="22"/>
+                <w:lang w:val="en-PH" w:eastAsia="en-PH"/>
+              </w:rPr>
+              <w:t>{Reputation_Poor}</w:t>
             </w:r>
             <w:r>
               <w:rPr>
@@ -6708,11 +6920,30 @@
             </w:pPr>
             <w:r>
               <w:rPr>
-                <w:rFonts w:ascii="MS Gothic" w:eastAsia="MS Gothic" w:hAnsi="MS Gothic" w:cs="Arial" w:hint="eastAsia"/>
-                <w:sz w:val="24"/>
-                <w:szCs w:val="24"/>
-              </w:rPr>
-              <w:t>☒</w:t>
+                <w:rFonts w:ascii="Arial" w:hAnsi="Arial" w:cs="Arial"/>
+                <w:sz w:val="22"/>
+                <w:szCs w:val="22"/>
+                <w:lang w:val="en-PH" w:eastAsia="en-PH"/>
+              </w:rPr>
+              <w:t>{Status_</w:t>
+            </w:r>
+            <w:r>
+              <w:rPr>
+                <w:rFonts w:ascii="Arial" w:hAnsi="Arial" w:cs="Arial"/>
+                <w:sz w:val="22"/>
+                <w:szCs w:val="22"/>
+                <w:lang w:val="en-PH" w:eastAsia="en-PH"/>
+              </w:rPr>
+              <w:t>Low_Middle</w:t>
+            </w:r>
+            <w:r>
+              <w:rPr>
+                <w:rFonts w:ascii="Arial" w:hAnsi="Arial" w:cs="Arial"/>
+                <w:sz w:val="22"/>
+                <w:szCs w:val="22"/>
+                <w:lang w:val="en-PH" w:eastAsia="en-PH"/>
+              </w:rPr>
+              <w:t>}</w:t>
             </w:r>
             <w:r>
               <w:rPr>
@@ -6986,11 +7217,30 @@
             </w:pPr>
             <w:r>
               <w:rPr>
-                <w:rFonts w:ascii="MS Gothic" w:eastAsia="MS Gothic" w:hAnsi="MS Gothic" w:cs="Arial" w:hint="eastAsia"/>
-                <w:sz w:val="24"/>
-                <w:szCs w:val="24"/>
-              </w:rPr>
-              <w:t>☐</w:t>
+                <w:rFonts w:ascii="Arial" w:hAnsi="Arial" w:cs="Arial"/>
+                <w:sz w:val="22"/>
+                <w:szCs w:val="22"/>
+                <w:lang w:val="en-PH" w:eastAsia="en-PH"/>
+              </w:rPr>
+              <w:t>{Status_</w:t>
+            </w:r>
+            <w:r>
+              <w:rPr>
+                <w:rFonts w:ascii="Arial" w:hAnsi="Arial" w:cs="Arial"/>
+                <w:sz w:val="22"/>
+                <w:szCs w:val="22"/>
+                <w:lang w:val="en-PH" w:eastAsia="en-PH"/>
+              </w:rPr>
+              <w:t>Middle_Middle</w:t>
+            </w:r>
+            <w:r>
+              <w:rPr>
+                <w:rFonts w:ascii="Arial" w:hAnsi="Arial" w:cs="Arial"/>
+                <w:sz w:val="22"/>
+                <w:szCs w:val="22"/>
+                <w:lang w:val="en-PH" w:eastAsia="en-PH"/>
+              </w:rPr>
+              <w:t>}</w:t>
             </w:r>
             <w:r>
               <w:rPr>
@@ -7285,11 +7535,30 @@
             </w:pPr>
             <w:r>
               <w:rPr>
-                <w:rFonts w:ascii="MS Gothic" w:eastAsia="MS Gothic" w:hAnsi="MS Gothic" w:cs="Arial" w:hint="eastAsia"/>
-                <w:sz w:val="24"/>
-                <w:szCs w:val="24"/>
-              </w:rPr>
-              <w:t>☐</w:t>
+                <w:rFonts w:ascii="Arial" w:hAnsi="Arial" w:cs="Arial"/>
+                <w:sz w:val="22"/>
+                <w:szCs w:val="22"/>
+                <w:lang w:val="en-PH" w:eastAsia="en-PH"/>
+              </w:rPr>
+              <w:t>{Status_</w:t>
+            </w:r>
+            <w:r>
+              <w:rPr>
+                <w:rFonts w:ascii="Arial" w:hAnsi="Arial" w:cs="Arial"/>
+                <w:sz w:val="22"/>
+                <w:szCs w:val="22"/>
+                <w:lang w:val="en-PH" w:eastAsia="en-PH"/>
+              </w:rPr>
+              <w:t>Upper_Middle</w:t>
+            </w:r>
+            <w:r>
+              <w:rPr>
+                <w:rFonts w:ascii="Arial" w:hAnsi="Arial" w:cs="Arial"/>
+                <w:sz w:val="22"/>
+                <w:szCs w:val="22"/>
+                <w:lang w:val="en-PH" w:eastAsia="en-PH"/>
+              </w:rPr>
+              <w:t>}</w:t>
             </w:r>
             <w:r>
               <w:rPr>
@@ -7583,20 +7852,39 @@
             </w:pPr>
             <w:r>
               <w:rPr>
-                <w:rFonts w:ascii="MS Gothic" w:eastAsia="MS Gothic" w:hAnsi="MS Gothic" w:cs="Arial" w:hint="eastAsia"/>
-                <w:sz w:val="24"/>
-                <w:szCs w:val="24"/>
-              </w:rPr>
-              <w:t>☐</w:t>
-            </w:r>
-            <w:r>
-              <w:rPr>
-                <w:rFonts w:ascii="Arial" w:hAnsi="Arial" w:cs="Arial"/>
-                <w:sz w:val="22"/>
-                <w:szCs w:val="22"/>
-                <w:lang w:val="en-PH" w:eastAsia="en-PH"/>
-              </w:rPr>
-              <w:t xml:space="preserve"> Upper-income Class (but </w:t>
+                <w:rFonts w:ascii="Arial" w:hAnsi="Arial" w:cs="Arial"/>
+                <w:sz w:val="22"/>
+                <w:szCs w:val="22"/>
+                <w:lang w:val="en-PH" w:eastAsia="en-PH"/>
+              </w:rPr>
+              <w:t>{Status_</w:t>
+            </w:r>
+            <w:r>
+              <w:rPr>
+                <w:rFonts w:ascii="Arial" w:hAnsi="Arial" w:cs="Arial"/>
+                <w:sz w:val="22"/>
+                <w:szCs w:val="22"/>
+                <w:lang w:val="en-PH" w:eastAsia="en-PH"/>
+              </w:rPr>
+              <w:t>Upper_Income</w:t>
+            </w:r>
+            <w:r>
+              <w:rPr>
+                <w:rFonts w:ascii="Arial" w:hAnsi="Arial" w:cs="Arial"/>
+                <w:sz w:val="22"/>
+                <w:szCs w:val="22"/>
+                <w:lang w:val="en-PH" w:eastAsia="en-PH"/>
+              </w:rPr>
+              <w:t>}</w:t>
+            </w:r>
+            <w:r>
+              <w:rPr>
+                <w:rFonts w:ascii="Arial" w:hAnsi="Arial" w:cs="Arial"/>
+                <w:sz w:val="22"/>
+                <w:szCs w:val="22"/>
+                <w:lang w:val="en-PH" w:eastAsia="en-PH"/>
+              </w:rPr>
+              <w:t xml:space="preserve">Upper-income Class (but </w:t>
             </w:r>
           </w:p>
           <w:p>
@@ -7871,11 +8159,30 @@
             </w:pPr>
             <w:r>
               <w:rPr>
-                <w:rFonts w:ascii="MS Gothic" w:eastAsia="MS Gothic" w:hAnsi="MS Gothic" w:cs="Arial" w:hint="eastAsia"/>
-                <w:sz w:val="24"/>
-                <w:szCs w:val="24"/>
-              </w:rPr>
-              <w:t>☐</w:t>
+                <w:rFonts w:ascii="Arial" w:hAnsi="Arial" w:cs="Arial"/>
+                <w:sz w:val="22"/>
+                <w:szCs w:val="22"/>
+                <w:lang w:val="en-PH" w:eastAsia="en-PH"/>
+              </w:rPr>
+              <w:t>{Status_</w:t>
+            </w:r>
+            <w:r>
+              <w:rPr>
+                <w:rFonts w:ascii="Arial" w:hAnsi="Arial" w:cs="Arial"/>
+                <w:sz w:val="22"/>
+                <w:szCs w:val="22"/>
+                <w:lang w:val="en-PH" w:eastAsia="en-PH"/>
+              </w:rPr>
+              <w:t>Rich</w:t>
+            </w:r>
+            <w:r>
+              <w:rPr>
+                <w:rFonts w:ascii="Arial" w:hAnsi="Arial" w:cs="Arial"/>
+                <w:sz w:val="22"/>
+                <w:szCs w:val="22"/>
+                <w:lang w:val="en-PH" w:eastAsia="en-PH"/>
+              </w:rPr>
+              <w:t>}</w:t>
             </w:r>
             <w:r>
               <w:rPr>
@@ -8754,11 +9061,12 @@
             </w:pPr>
             <w:r>
               <w:rPr>
-                <w:rFonts w:ascii="MS Gothic" w:eastAsia="MS Gothic" w:hAnsi="MS Gothic" w:cs="Arial" w:hint="eastAsia"/>
-                <w:sz w:val="24"/>
-                <w:szCs w:val="24"/>
-              </w:rPr>
-              <w:t>☐</w:t>
+                <w:rFonts w:ascii="Arial" w:hAnsi="Arial" w:cs="Arial"/>
+                <w:sz w:val="22"/>
+                <w:szCs w:val="22"/>
+                <w:lang w:val="en-PH" w:eastAsia="en-PH"/>
+              </w:rPr>
+              <w:t>{Support_Very_Satisfactory}</w:t>
             </w:r>
             <w:r>
               <w:rPr>
@@ -8872,11 +9180,12 @@
             </w:pPr>
             <w:r>
               <w:rPr>
-                <w:rFonts w:ascii="MS Gothic" w:eastAsia="MS Gothic" w:hAnsi="MS Gothic" w:cs="Arial" w:hint="eastAsia"/>
-                <w:sz w:val="24"/>
-                <w:szCs w:val="24"/>
-              </w:rPr>
-              <w:t>☐</w:t>
+                <w:rFonts w:ascii="Arial" w:hAnsi="Arial" w:cs="Arial"/>
+                <w:sz w:val="22"/>
+                <w:szCs w:val="22"/>
+                <w:lang w:val="en-PH" w:eastAsia="en-PH"/>
+              </w:rPr>
+              <w:t>{Community_Very_Satisfactory}</w:t>
             </w:r>
             <w:r>
               <w:rPr>
@@ -8967,11 +9276,12 @@
             </w:pPr>
             <w:r>
               <w:rPr>
-                <w:rFonts w:ascii="MS Gothic" w:eastAsia="MS Gothic" w:hAnsi="MS Gothic" w:cs="Arial" w:hint="eastAsia"/>
-                <w:sz w:val="24"/>
-                <w:szCs w:val="24"/>
-              </w:rPr>
-              <w:t>☐</w:t>
+                <w:rFonts w:ascii="Arial" w:hAnsi="Arial" w:cs="Arial"/>
+                <w:sz w:val="22"/>
+                <w:szCs w:val="22"/>
+                <w:lang w:val="en-PH" w:eastAsia="en-PH"/>
+              </w:rPr>
+              <w:t>{WellBeing_Very_Satisfactory}</w:t>
             </w:r>
             <w:r>
               <w:rPr>
@@ -9091,11 +9401,12 @@
             </w:pPr>
             <w:r>
               <w:rPr>
-                <w:rFonts w:ascii="MS Gothic" w:eastAsia="MS Gothic" w:hAnsi="MS Gothic" w:cs="Arial" w:hint="eastAsia"/>
-                <w:sz w:val="24"/>
-                <w:szCs w:val="24"/>
-              </w:rPr>
-              <w:t>☒</w:t>
+                <w:rFonts w:ascii="Arial" w:hAnsi="Arial" w:cs="Arial"/>
+                <w:sz w:val="22"/>
+                <w:szCs w:val="22"/>
+                <w:lang w:val="en-PH" w:eastAsia="en-PH"/>
+              </w:rPr>
+              <w:t>{Support_Satisfactory}</w:t>
             </w:r>
             <w:r>
               <w:rPr>
@@ -9209,11 +9520,12 @@
             </w:pPr>
             <w:r>
               <w:rPr>
-                <w:rFonts w:ascii="MS Gothic" w:eastAsia="MS Gothic" w:hAnsi="MS Gothic" w:cs="Arial" w:hint="eastAsia"/>
-                <w:sz w:val="24"/>
-                <w:szCs w:val="24"/>
-              </w:rPr>
-              <w:t>☒</w:t>
+                <w:rFonts w:ascii="Arial" w:hAnsi="Arial" w:cs="Arial"/>
+                <w:sz w:val="22"/>
+                <w:szCs w:val="22"/>
+                <w:lang w:val="en-PH" w:eastAsia="en-PH"/>
+              </w:rPr>
+              <w:t>{Community_Satisfactory}</w:t>
             </w:r>
             <w:r>
               <w:rPr>
@@ -9304,11 +9616,12 @@
             </w:pPr>
             <w:r>
               <w:rPr>
-                <w:rFonts w:ascii="MS Gothic" w:eastAsia="MS Gothic" w:hAnsi="MS Gothic" w:cs="Arial" w:hint="eastAsia"/>
-                <w:sz w:val="24"/>
-                <w:szCs w:val="24"/>
-              </w:rPr>
-              <w:t>☒</w:t>
+                <w:rFonts w:ascii="Arial" w:hAnsi="Arial" w:cs="Arial"/>
+                <w:sz w:val="22"/>
+                <w:szCs w:val="22"/>
+                <w:lang w:val="en-PH" w:eastAsia="en-PH"/>
+              </w:rPr>
+              <w:t>{WellBeing_Satisfactory}</w:t>
             </w:r>
             <w:r>
               <w:rPr>
@@ -9428,11 +9741,12 @@
             </w:pPr>
             <w:r>
               <w:rPr>
-                <w:rFonts w:ascii="MS Gothic" w:eastAsia="MS Gothic" w:hAnsi="MS Gothic" w:cs="Arial" w:hint="eastAsia"/>
-                <w:sz w:val="24"/>
-                <w:szCs w:val="24"/>
-              </w:rPr>
-              <w:t>☐</w:t>
+                <w:rFonts w:ascii="Arial" w:hAnsi="Arial" w:cs="Arial"/>
+                <w:sz w:val="22"/>
+                <w:szCs w:val="22"/>
+                <w:lang w:val="en-PH" w:eastAsia="en-PH"/>
+              </w:rPr>
+              <w:t>{Support_Poor}</w:t>
             </w:r>
             <w:r>
               <w:rPr>
@@ -9546,11 +9860,12 @@
             </w:pPr>
             <w:r>
               <w:rPr>
-                <w:rFonts w:ascii="MS Gothic" w:eastAsia="MS Gothic" w:hAnsi="MS Gothic" w:cs="Arial" w:hint="eastAsia"/>
-                <w:sz w:val="24"/>
-                <w:szCs w:val="24"/>
-              </w:rPr>
-              <w:t>☐</w:t>
+                <w:rFonts w:ascii="Arial" w:hAnsi="Arial" w:cs="Arial"/>
+                <w:sz w:val="22"/>
+                <w:szCs w:val="22"/>
+                <w:lang w:val="en-PH" w:eastAsia="en-PH"/>
+              </w:rPr>
+              <w:t>{Community_Poor}</w:t>
             </w:r>
             <w:r>
               <w:rPr>
@@ -9641,11 +9956,12 @@
             </w:pPr>
             <w:r>
               <w:rPr>
-                <w:rFonts w:ascii="MS Gothic" w:eastAsia="MS Gothic" w:hAnsi="MS Gothic" w:cs="Arial" w:hint="eastAsia"/>
-                <w:sz w:val="24"/>
-                <w:szCs w:val="24"/>
-              </w:rPr>
-              <w:t>☐</w:t>
+                <w:rFonts w:ascii="Arial" w:hAnsi="Arial" w:cs="Arial"/>
+                <w:sz w:val="22"/>
+                <w:szCs w:val="22"/>
+                <w:lang w:val="en-PH" w:eastAsia="en-PH"/>
+              </w:rPr>
+              <w:t>{WellBeing_Poor}</w:t>
             </w:r>
             <w:r>
               <w:rPr>
@@ -9738,246 +10054,182 @@
     </w:p>
     <w:p>
       <w:pPr>
-        <w:spacing w:after="160" w:line="259" w:lineRule="auto"/>
-        <w:ind w:firstLine="360"/>
+        <w:suppressAutoHyphens w:val="0"/>
+        <w:ind w:firstLine="720"/>
+        <w:jc w:val="both"/>
+        <w:rPr>
+          <w:rFonts w:ascii="Arial" w:hAnsi="Arial" w:cs="Arial"/>
+          <w:color w:val="EE0000"/>
+          <w:sz w:val="21"/>
+          <w:szCs w:val="21"/>
+          <w:lang w:val="en-PH"/>
+        </w:rPr>
+      </w:pPr>
+      <w:r>
         <w:rPr>
           <w:rFonts w:ascii="Arial" w:hAnsi="Arial" w:cs="Arial"/>
           <w:sz w:val="22"/>
           <w:szCs w:val="22"/>
         </w:rPr>
-      </w:pPr>
-      <w:r>
-        <w:rPr>
-          <w:rFonts w:ascii="Arial" w:hAnsi="Arial" w:cs="Arial"/>
-          <w:sz w:val="22"/>
-          <w:szCs w:val="22"/>
-        </w:rPr>
-        <w:t>The petitioner is charged with multiple violations of Republic Act No. 7610, also known as the "Special Protection of Children Against Abuse, Exploitation, and Discrimination Act,” involving acts of sexual abuse and lascivious conduct against a minor committed between September and November 2023. The incidents involved the same victim, who was under his household care at the time. These offenses constitute a serious breach of trust and responsibility and resulted in emotional and psychological harm to the child.</w:t>
+        <w:t>{Circumstances}</w:t>
       </w:r>
     </w:p>
     <w:p>
       <w:pPr>
-        <w:spacing w:after="160" w:line="259" w:lineRule="auto"/>
-        <w:rPr>
-          <w:rFonts w:ascii="Arial" w:hAnsi="Arial" w:cs="Arial"/>
-          <w:sz w:val="22"/>
-          <w:szCs w:val="22"/>
+        <w:pStyle w:val="ListParagraph"/>
+        <w:numPr>
+          <w:ilvl w:val="0"/>
+          <w:numId w:val="1"/>
+        </w:numPr>
+        <w:spacing w:line="276" w:lineRule="auto"/>
+        <w:ind w:left="360" w:hanging="360"/>
+        <w:jc w:val="center"/>
+        <w:rPr>
+          <w:rFonts w:ascii="Arial" w:hAnsi="Arial" w:cs="Arial"/>
+          <w:b/>
+          <w:sz w:val="24"/>
+          <w:szCs w:val="24"/>
         </w:rPr>
       </w:pPr>
       <w:r>
         <w:rPr>
           <w:rFonts w:ascii="Arial" w:hAnsi="Arial" w:cs="Arial"/>
-          <w:sz w:val="22"/>
-          <w:szCs w:val="22"/>
-        </w:rPr>
-        <w:t>‎</w:t>
-      </w:r>
-      <w:r>
-        <w:rPr>
-          <w:rFonts w:ascii="Arial" w:hAnsi="Arial" w:cs="Arial"/>
-          <w:sz w:val="22"/>
-          <w:szCs w:val="22"/>
-        </w:rPr>
-        <w:tab/>
-        <w:t>Based on records and interviews with family members, neighbors, and community representatives, the applicant is generally perceived as kind, respectful, and cooperative. He is known to maintain peaceful relationships and has no reported history of criminal involvement prior to the present case. Informants stated that he interacts well with others and demonstrates responsible behavior in his daily life.</w:t>
+          <w:b/>
+          <w:sz w:val="24"/>
+          <w:szCs w:val="24"/>
+        </w:rPr>
+        <w:t>PROJECTED THRUSTS OF REHABILITATION</w:t>
       </w:r>
     </w:p>
     <w:p>
       <w:pPr>
-        <w:spacing w:after="160" w:line="259" w:lineRule="auto"/>
-        <w:rPr>
-          <w:rFonts w:ascii="Arial" w:hAnsi="Arial" w:cs="Arial"/>
-          <w:sz w:val="22"/>
-          <w:szCs w:val="22"/>
+        <w:pStyle w:val="ListParagraph"/>
+        <w:numPr>
+          <w:ilvl w:val="0"/>
+          <w:numId w:val="3"/>
+        </w:numPr>
+        <w:spacing w:line="276" w:lineRule="auto"/>
+        <w:jc w:val="both"/>
+        <w:rPr>
+          <w:rFonts w:ascii="Arial" w:hAnsi="Arial" w:cs="Arial"/>
+          <w:sz w:val="21"/>
+          <w:szCs w:val="21"/>
         </w:rPr>
       </w:pPr>
       <w:r>
         <w:rPr>
           <w:rFonts w:ascii="Arial" w:hAnsi="Arial" w:cs="Arial"/>
-          <w:sz w:val="22"/>
-          <w:szCs w:val="22"/>
-        </w:rPr>
-        <w:t>‎</w:t>
-      </w:r>
-      <w:r>
-        <w:rPr>
-          <w:rFonts w:ascii="Arial" w:hAnsi="Arial" w:cs="Arial"/>
-          <w:sz w:val="22"/>
-          <w:szCs w:val="22"/>
-        </w:rPr>
-        <w:tab/>
-        <w:t>The applicant admitted to the acts and did not deny responsibility. He stated that the incidents occurred while he was under the influence of alcohol. Although intoxication does not excuse his misconduct, his admission reflects accountability and awareness of the consequences of his actions. He has shown willingness to cooperate with authorities and comply with legal procedures.</w:t>
+          <w:sz w:val="21"/>
+          <w:szCs w:val="21"/>
+        </w:rPr>
+        <w:t>Monthly report-in-person;</w:t>
       </w:r>
     </w:p>
     <w:p>
       <w:pPr>
-        <w:spacing w:after="160" w:line="259" w:lineRule="auto"/>
-        <w:rPr>
-          <w:rFonts w:ascii="Arial" w:hAnsi="Arial" w:cs="Arial"/>
-          <w:sz w:val="22"/>
-          <w:szCs w:val="22"/>
+        <w:pStyle w:val="ListParagraph"/>
+        <w:numPr>
+          <w:ilvl w:val="0"/>
+          <w:numId w:val="3"/>
+        </w:numPr>
+        <w:spacing w:line="276" w:lineRule="auto"/>
+        <w:jc w:val="both"/>
+        <w:rPr>
+          <w:rFonts w:ascii="Arial" w:hAnsi="Arial" w:cs="Arial"/>
+          <w:sz w:val="21"/>
+          <w:szCs w:val="21"/>
         </w:rPr>
       </w:pPr>
       <w:r>
         <w:rPr>
           <w:rFonts w:ascii="Arial" w:hAnsi="Arial" w:cs="Arial"/>
-          <w:sz w:val="22"/>
-          <w:szCs w:val="22"/>
-        </w:rPr>
-        <w:t>‎</w:t>
-      </w:r>
-      <w:r>
-        <w:rPr>
-          <w:rFonts w:ascii="Arial" w:hAnsi="Arial" w:cs="Arial"/>
-          <w:sz w:val="22"/>
-          <w:szCs w:val="22"/>
-        </w:rPr>
-        <w:tab/>
-        <w:t>The repeated nature of the incidents indicates a pattern of inappropriate behavior rather than an isolated lapse in judgment. As the live-in partner of the victim’s grandmother, the applicant occupied a position of trust, which he violated. The victim’s disclosure and immediate reporting by the family highlight the seriousness of the impact on the child and her well-being.</w:t>
+          <w:sz w:val="21"/>
+          <w:szCs w:val="21"/>
+        </w:rPr>
+        <w:t>Scheduled and unscheduled home visits;</w:t>
       </w:r>
     </w:p>
     <w:p>
       <w:pPr>
-        <w:spacing w:after="160" w:line="259" w:lineRule="auto"/>
-        <w:rPr>
-          <w:rFonts w:ascii="Arial" w:hAnsi="Arial" w:cs="Arial"/>
-          <w:sz w:val="22"/>
-          <w:szCs w:val="22"/>
+        <w:pStyle w:val="ListParagraph"/>
+        <w:numPr>
+          <w:ilvl w:val="0"/>
+          <w:numId w:val="3"/>
+        </w:numPr>
+        <w:spacing w:line="276" w:lineRule="auto"/>
+        <w:jc w:val="both"/>
+        <w:rPr>
+          <w:rFonts w:ascii="Arial" w:hAnsi="Arial" w:cs="Arial"/>
+          <w:sz w:val="21"/>
+          <w:szCs w:val="21"/>
         </w:rPr>
       </w:pPr>
       <w:r>
         <w:rPr>
           <w:rFonts w:ascii="Arial" w:hAnsi="Arial" w:cs="Arial"/>
-          <w:sz w:val="22"/>
-          <w:szCs w:val="22"/>
-        </w:rPr>
-        <w:t>‎</w:t>
-      </w:r>
-      <w:r>
-        <w:rPr>
-          <w:rFonts w:ascii="Arial" w:hAnsi="Arial" w:cs="Arial"/>
-          <w:sz w:val="22"/>
-          <w:szCs w:val="22"/>
-        </w:rPr>
-        <w:tab/>
-        <w:t>Despite the gravity of the offenses, the investigation revealed mitigating circumstances. The applicant expressed sincere remorse, demonstrated cooperation, and complied with legal processes. Community members and family described him as supportive and respectful. He also maintains regular family responsibilities, particularly in bringing and fetching his grandchildren to and from school, which reflects stability and involvement in family life.</w:t>
+          <w:sz w:val="21"/>
+          <w:szCs w:val="21"/>
+        </w:rPr>
+        <w:t>Community work services (CWS) in the barangay, and participation in mangrove and/or tree planting, coastal clean-up, and other socio-civic activities;</w:t>
       </w:r>
     </w:p>
     <w:p>
       <w:pPr>
-        <w:spacing w:after="160" w:line="259" w:lineRule="auto"/>
-        <w:rPr>
-          <w:rFonts w:ascii="Arial" w:hAnsi="Arial" w:cs="Arial"/>
-          <w:sz w:val="22"/>
-          <w:szCs w:val="22"/>
+        <w:pStyle w:val="ListParagraph"/>
+        <w:numPr>
+          <w:ilvl w:val="0"/>
+          <w:numId w:val="3"/>
+        </w:numPr>
+        <w:spacing w:line="276" w:lineRule="auto"/>
+        <w:jc w:val="both"/>
+        <w:rPr>
+          <w:rFonts w:ascii="Arial" w:hAnsi="Arial" w:cs="Arial"/>
+          <w:sz w:val="21"/>
+          <w:szCs w:val="21"/>
         </w:rPr>
       </w:pPr>
       <w:r>
         <w:rPr>
           <w:rFonts w:ascii="Arial" w:hAnsi="Arial" w:cs="Arial"/>
-          <w:sz w:val="22"/>
-          <w:szCs w:val="22"/>
-        </w:rPr>
-        <w:t>‎</w:t>
-      </w:r>
-      <w:r>
-        <w:rPr>
-          <w:rFonts w:ascii="Arial" w:hAnsi="Arial" w:cs="Arial"/>
-          <w:sz w:val="22"/>
-          <w:szCs w:val="22"/>
-        </w:rPr>
-        <w:tab/>
-        <w:t>There is no record of prior criminal involvement, and this appears to be his first offense. He has shown willingness to reform and participate in rehabilitative programs. His openness to supervision and correction indicates potential for positive behavioral change.</w:t>
+          <w:sz w:val="21"/>
+          <w:szCs w:val="21"/>
+        </w:rPr>
+        <w:t>Therapeutic Community Ladderized Program; and/or</w:t>
       </w:r>
     </w:p>
     <w:p>
       <w:pPr>
-        <w:spacing w:after="160" w:line="259" w:lineRule="auto"/>
-        <w:rPr>
-          <w:rFonts w:ascii="Arial" w:hAnsi="Arial" w:cs="Arial"/>
-          <w:sz w:val="22"/>
-          <w:szCs w:val="22"/>
+        <w:pStyle w:val="ListParagraph"/>
+        <w:numPr>
+          <w:ilvl w:val="0"/>
+          <w:numId w:val="3"/>
+        </w:numPr>
+        <w:spacing w:line="276" w:lineRule="auto"/>
+        <w:jc w:val="both"/>
+        <w:rPr>
+          <w:rFonts w:ascii="Arial" w:hAnsi="Arial" w:cs="Arial"/>
+          <w:sz w:val="21"/>
+          <w:szCs w:val="21"/>
         </w:rPr>
       </w:pPr>
       <w:r>
         <w:rPr>
           <w:rFonts w:ascii="Arial" w:hAnsi="Arial" w:cs="Arial"/>
-          <w:sz w:val="22"/>
-          <w:szCs w:val="22"/>
-        </w:rPr>
-        <w:t>‎</w:t>
-      </w:r>
-      <w:r>
-        <w:rPr>
-          <w:rFonts w:ascii="Arial" w:hAnsi="Arial" w:cs="Arial"/>
-          <w:sz w:val="22"/>
-          <w:szCs w:val="22"/>
-        </w:rPr>
-        <w:tab/>
-        <w:t xml:space="preserve">The purpose of probation is to promote rehabilitation while ensuring accountability and public safety. In view of the applicant’s admission, community support, family stability, and expressed </w:t>
-      </w:r>
-      <w:r>
-        <w:rPr>
-          <w:rFonts w:ascii="Arial" w:hAnsi="Arial" w:cs="Arial"/>
-          <w:sz w:val="22"/>
-          <w:szCs w:val="22"/>
-        </w:rPr>
-        <w:lastRenderedPageBreak/>
-        <w:t>commitment to change, it is respectfully assessed that he may benefit from community-based correction under close supervision.</w:t>
+          <w:sz w:val="21"/>
+          <w:szCs w:val="21"/>
+        </w:rPr>
+        <w:t>Other reinforcing rehabilitation programs are to be initiated by the Parole and Probation Administration, whichever is fitting to the rehabilitation needs of the client</w:t>
       </w:r>
     </w:p>
     <w:p>
       <w:pPr>
-        <w:spacing w:after="160" w:line="259" w:lineRule="auto"/>
-        <w:rPr>
-          <w:rFonts w:ascii="Arial" w:hAnsi="Arial" w:cs="Arial"/>
-          <w:sz w:val="22"/>
-          <w:szCs w:val="22"/>
-        </w:rPr>
-      </w:pPr>
-      <w:r>
-        <w:rPr>
-          <w:rFonts w:ascii="Arial" w:hAnsi="Arial" w:cs="Arial"/>
-          <w:sz w:val="22"/>
-          <w:szCs w:val="22"/>
-        </w:rPr>
-        <w:t>‎</w:t>
-      </w:r>
-      <w:r>
-        <w:rPr>
-          <w:rFonts w:ascii="Arial" w:hAnsi="Arial" w:cs="Arial"/>
-          <w:sz w:val="22"/>
-          <w:szCs w:val="22"/>
-        </w:rPr>
-        <w:tab/>
-        <w:t>In view of the totality of circumstances, the applicant is considered suitable for probation, subject to strict compliance with all conditions imposed by the Court.</w:t>
-      </w:r>
-    </w:p>
-    <w:p>
-      <w:pPr>
-        <w:suppressAutoHyphens w:val="0"/>
-        <w:ind w:firstLine="720"/>
+        <w:pStyle w:val="ListParagraph"/>
+        <w:spacing w:line="276" w:lineRule="auto"/>
         <w:jc w:val="both"/>
         <w:rPr>
           <w:rFonts w:ascii="Arial" w:hAnsi="Arial" w:cs="Arial"/>
-          <w:color w:val="000000"/>
-          <w:sz w:val="22"/>
-          <w:szCs w:val="22"/>
-          <w:shd w:val="clear" w:color="auto" w:fill="F7F7F7"/>
-        </w:rPr>
-      </w:pPr>
-    </w:p>
-    <w:p>
-      <w:pPr>
-        <w:suppressAutoHyphens w:val="0"/>
-        <w:ind w:firstLine="720"/>
-        <w:jc w:val="both"/>
-        <w:rPr>
-          <w:rFonts w:ascii="Arial" w:hAnsi="Arial" w:cs="Arial"/>
-          <w:color w:val="EE0000"/>
           <w:sz w:val="21"/>
           <w:szCs w:val="21"/>
-          <w:lang w:val="en-PH"/>
         </w:rPr>
       </w:pPr>
     </w:p>
@@ -10005,165 +10257,6 @@
           <w:sz w:val="24"/>
           <w:szCs w:val="24"/>
         </w:rPr>
-        <w:t>PROJECTED THRUSTS OF REHABILITATION</w:t>
-      </w:r>
-    </w:p>
-    <w:p>
-      <w:pPr>
-        <w:pStyle w:val="ListParagraph"/>
-        <w:numPr>
-          <w:ilvl w:val="0"/>
-          <w:numId w:val="3"/>
-        </w:numPr>
-        <w:spacing w:line="276" w:lineRule="auto"/>
-        <w:jc w:val="both"/>
-        <w:rPr>
-          <w:rFonts w:ascii="Arial" w:hAnsi="Arial" w:cs="Arial"/>
-          <w:sz w:val="21"/>
-          <w:szCs w:val="21"/>
-        </w:rPr>
-      </w:pPr>
-      <w:r>
-        <w:rPr>
-          <w:rFonts w:ascii="Arial" w:hAnsi="Arial" w:cs="Arial"/>
-          <w:sz w:val="21"/>
-          <w:szCs w:val="21"/>
-        </w:rPr>
-        <w:t>Monthly report-in-person;</w:t>
-      </w:r>
-    </w:p>
-    <w:p>
-      <w:pPr>
-        <w:pStyle w:val="ListParagraph"/>
-        <w:numPr>
-          <w:ilvl w:val="0"/>
-          <w:numId w:val="3"/>
-        </w:numPr>
-        <w:spacing w:line="276" w:lineRule="auto"/>
-        <w:jc w:val="both"/>
-        <w:rPr>
-          <w:rFonts w:ascii="Arial" w:hAnsi="Arial" w:cs="Arial"/>
-          <w:sz w:val="21"/>
-          <w:szCs w:val="21"/>
-        </w:rPr>
-      </w:pPr>
-      <w:r>
-        <w:rPr>
-          <w:rFonts w:ascii="Arial" w:hAnsi="Arial" w:cs="Arial"/>
-          <w:sz w:val="21"/>
-          <w:szCs w:val="21"/>
-        </w:rPr>
-        <w:t>Scheduled and unscheduled home visits;</w:t>
-      </w:r>
-    </w:p>
-    <w:p>
-      <w:pPr>
-        <w:pStyle w:val="ListParagraph"/>
-        <w:numPr>
-          <w:ilvl w:val="0"/>
-          <w:numId w:val="3"/>
-        </w:numPr>
-        <w:spacing w:line="276" w:lineRule="auto"/>
-        <w:jc w:val="both"/>
-        <w:rPr>
-          <w:rFonts w:ascii="Arial" w:hAnsi="Arial" w:cs="Arial"/>
-          <w:sz w:val="21"/>
-          <w:szCs w:val="21"/>
-        </w:rPr>
-      </w:pPr>
-      <w:r>
-        <w:rPr>
-          <w:rFonts w:ascii="Arial" w:hAnsi="Arial" w:cs="Arial"/>
-          <w:sz w:val="21"/>
-          <w:szCs w:val="21"/>
-        </w:rPr>
-        <w:t>Community work services (CWS) in the barangay, and participation in mangrove and/or tree planting, coastal clean-up, and other socio-civic activities;</w:t>
-      </w:r>
-    </w:p>
-    <w:p>
-      <w:pPr>
-        <w:pStyle w:val="ListParagraph"/>
-        <w:numPr>
-          <w:ilvl w:val="0"/>
-          <w:numId w:val="3"/>
-        </w:numPr>
-        <w:spacing w:line="276" w:lineRule="auto"/>
-        <w:jc w:val="both"/>
-        <w:rPr>
-          <w:rFonts w:ascii="Arial" w:hAnsi="Arial" w:cs="Arial"/>
-          <w:sz w:val="21"/>
-          <w:szCs w:val="21"/>
-        </w:rPr>
-      </w:pPr>
-      <w:r>
-        <w:rPr>
-          <w:rFonts w:ascii="Arial" w:hAnsi="Arial" w:cs="Arial"/>
-          <w:sz w:val="21"/>
-          <w:szCs w:val="21"/>
-        </w:rPr>
-        <w:t>Therapeutic Community Ladderized Program; and/or</w:t>
-      </w:r>
-    </w:p>
-    <w:p>
-      <w:pPr>
-        <w:pStyle w:val="ListParagraph"/>
-        <w:numPr>
-          <w:ilvl w:val="0"/>
-          <w:numId w:val="3"/>
-        </w:numPr>
-        <w:spacing w:line="276" w:lineRule="auto"/>
-        <w:jc w:val="both"/>
-        <w:rPr>
-          <w:rFonts w:ascii="Arial" w:hAnsi="Arial" w:cs="Arial"/>
-          <w:sz w:val="21"/>
-          <w:szCs w:val="21"/>
-        </w:rPr>
-      </w:pPr>
-      <w:r>
-        <w:rPr>
-          <w:rFonts w:ascii="Arial" w:hAnsi="Arial" w:cs="Arial"/>
-          <w:sz w:val="21"/>
-          <w:szCs w:val="21"/>
-        </w:rPr>
-        <w:t>Other reinforcing rehabilitation programs are to be initiated by the Parole and Probation Administration, whichever is fitting to the rehabilitation needs of the client</w:t>
-      </w:r>
-    </w:p>
-    <w:p>
-      <w:pPr>
-        <w:pStyle w:val="ListParagraph"/>
-        <w:spacing w:line="276" w:lineRule="auto"/>
-        <w:jc w:val="both"/>
-        <w:rPr>
-          <w:rFonts w:ascii="Arial" w:hAnsi="Arial" w:cs="Arial"/>
-          <w:sz w:val="21"/>
-          <w:szCs w:val="21"/>
-        </w:rPr>
-      </w:pPr>
-    </w:p>
-    <w:p>
-      <w:pPr>
-        <w:pStyle w:val="ListParagraph"/>
-        <w:numPr>
-          <w:ilvl w:val="0"/>
-          <w:numId w:val="1"/>
-        </w:numPr>
-        <w:spacing w:line="276" w:lineRule="auto"/>
-        <w:ind w:left="360" w:hanging="360"/>
-        <w:jc w:val="center"/>
-        <w:rPr>
-          <w:rFonts w:ascii="Arial" w:hAnsi="Arial" w:cs="Arial"/>
-          <w:b/>
-          <w:sz w:val="24"/>
-          <w:szCs w:val="24"/>
-        </w:rPr>
-      </w:pPr>
-      <w:r>
-        <w:rPr>
-          <w:rFonts w:ascii="Arial" w:hAnsi="Arial" w:cs="Arial"/>
-          <w:b/>
-          <w:sz w:val="24"/>
-          <w:szCs w:val="24"/>
-        </w:rPr>
         <w:t>RECOMMENDATION</w:t>
       </w:r>
     </w:p>
@@ -10215,7 +10308,7 @@
           <w:sz w:val="22"/>
           <w:szCs w:val="22"/>
         </w:rPr>
-        <w:t>PERITIINER'S NAME</w:t>
+        <w:t>{Last_Name}, {First_Name} {Middle_Name}</w:t>
       </w:r>
       <w:r>
         <w:rPr>
@@ -10448,7 +10541,40 @@
           <w:sz w:val="22"/>
           <w:szCs w:val="22"/>
         </w:rPr>
-        <w:t xml:space="preserve">Petitioner's Address </w:t>
+        <w:t>{Present</w:t>
+      </w:r>
+      <w:r>
+        <w:rPr>
+          <w:rFonts w:ascii="Arial" w:hAnsi="Arial" w:cs="Arial"/>
+          <w:b/>
+          <w:bCs/>
+          <w:noProof/>
+          <w:sz w:val="22"/>
+          <w:szCs w:val="22"/>
+        </w:rPr>
+        <w:t>_</w:t>
+      </w:r>
+      <w:r>
+        <w:rPr>
+          <w:rFonts w:ascii="Arial" w:hAnsi="Arial" w:cs="Arial"/>
+          <w:b/>
+          <w:bCs/>
+          <w:noProof/>
+          <w:sz w:val="22"/>
+          <w:szCs w:val="22"/>
+        </w:rPr>
+        <w:t>Address}</w:t>
+      </w:r>
+      <w:r>
+        <w:rPr>
+          <w:rFonts w:ascii="Arial" w:hAnsi="Arial" w:cs="Arial"/>
+          <w:b/>
+          <w:bCs/>
+          <w:noProof/>
+          <w:sz w:val="22"/>
+          <w:szCs w:val="22"/>
+        </w:rPr>
+        <w:t xml:space="preserve"> </w:t>
       </w:r>
       <w:r>
         <w:rPr>
@@ -10533,6 +10659,7 @@
           <w:szCs w:val="22"/>
           <w:lang w:eastAsia="zh-CN"/>
         </w:rPr>
+        <w:lastRenderedPageBreak/>
         <w:t xml:space="preserve">He shall conduct </w:t>
       </w:r>
       <w:r>
@@ -10543,7 +10670,17 @@
           <w:szCs w:val="22"/>
           <w:lang w:eastAsia="zh-CN"/>
         </w:rPr>
-        <w:t xml:space="preserve">Forty-Eight Hours (48) Hours </w:t>
+        <w:t>{Community_Service_Hours}</w:t>
+      </w:r>
+      <w:r>
+        <w:rPr>
+          <w:rFonts w:ascii="Arial" w:hAnsi="Arial" w:cs="Arial"/>
+          <w:b/>
+          <w:sz w:val="22"/>
+          <w:szCs w:val="22"/>
+          <w:lang w:eastAsia="zh-CN"/>
+        </w:rPr>
+        <w:t xml:space="preserve"> </w:t>
       </w:r>
       <w:r>
         <w:rPr>
@@ -10562,17 +10699,7 @@
           <w:szCs w:val="22"/>
           <w:lang w:val="en-AU" w:eastAsia="zh-CN"/>
         </w:rPr>
-        <w:t>Fifty (50)</w:t>
-      </w:r>
-      <w:r>
-        <w:rPr>
-          <w:rFonts w:ascii="Arial" w:hAnsi="Arial" w:cs="Arial"/>
-          <w:b/>
-          <w:sz w:val="22"/>
-          <w:szCs w:val="22"/>
-          <w:lang w:eastAsia="zh-CN"/>
-        </w:rPr>
-        <w:t xml:space="preserve"> fruit-bearing trees, trees that can be used as lumber</w:t>
+        <w:t>{Community_Service_Type}</w:t>
       </w:r>
       <w:r>
         <w:rPr>
@@ -10867,7 +10994,16 @@
           <w:sz w:val="22"/>
           <w:szCs w:val="22"/>
         </w:rPr>
-        <w:t>February 13, 2026.</w:t>
+        <w:t>{Created_Date}</w:t>
+      </w:r>
+      <w:r>
+        <w:rPr>
+          <w:rFonts w:ascii="Arial" w:hAnsi="Arial" w:cs="Arial"/>
+          <w:noProof/>
+          <w:sz w:val="22"/>
+          <w:szCs w:val="22"/>
+        </w:rPr>
+        <w:t>.</w:t>
       </w:r>
     </w:p>
     <w:tbl>
@@ -10985,7 +11121,6 @@
                 <w:szCs w:val="22"/>
                 <w:u w:val="single"/>
               </w:rPr>
-              <w:lastRenderedPageBreak/>
               <w:t>SPPO FAITH KIRSTIE T. YAM</w:t>
             </w:r>
           </w:p>
@@ -11164,10 +11299,10 @@
     <w:p>
       <w:pPr>
         <w:sectPr>
-          <w:headerReference w:type="default" r:id="rId13"/>
-          <w:footerReference w:type="default" r:id="rId14"/>
-          <w:headerReference w:type="first" r:id="rId15"/>
-          <w:footerReference w:type="first" r:id="rId16"/>
+          <w:headerReference w:type="default" r:id="rId14"/>
+          <w:footerReference w:type="default" r:id="rId15"/>
+          <w:headerReference w:type="first" r:id="rId16"/>
+          <w:footerReference w:type="first" r:id="rId17"/>
           <w:pgSz w:w="12242" w:h="18728" w:code="5"/>
           <w:pgMar w:top="1440" w:right="1080" w:bottom="1170" w:left="1080" w:header="450" w:footer="709" w:gutter="0"/>
           <w:pgNumType w:start="0"/>
@@ -11179,10 +11314,10 @@
     </w:p>
     <w:p/>
     <w:sectPr>
-      <w:headerReference w:type="default" r:id="rId17"/>
-      <w:footerReference w:type="default" r:id="rId18"/>
-      <w:headerReference w:type="first" r:id="rId19"/>
-      <w:footerReference w:type="first" r:id="rId20"/>
+      <w:headerReference w:type="default" r:id="rId18"/>
+      <w:footerReference w:type="default" r:id="rId19"/>
+      <w:headerReference w:type="first" r:id="rId20"/>
+      <w:footerReference w:type="first" r:id="rId21"/>
       <w:type w:val="continuous"/>
       <w:pgSz w:w="12242" w:h="18728" w:code="5"/>
       <w:pgMar w:top="1440" w:right="1080" w:bottom="1170" w:left="1080" w:header="450" w:footer="709" w:gutter="0"/>
@@ -12050,7 +12185,25 @@
         <w:szCs w:val="24"/>
         <w:lang w:val="en-PH"/>
       </w:rPr>
-      <w:t xml:space="preserve">           </w:t>
+      <w:t xml:space="preserve"> </w:t>
+    </w:r>
+    <w:r>
+      <w:rPr>
+        <w:rFonts w:ascii="Arial" w:hAnsi="Arial" w:cs="Arial"/>
+        <w:sz w:val="22"/>
+        <w:szCs w:val="24"/>
+        <w:lang w:val="en-PH"/>
+      </w:rPr>
+      <w:t>{Last_Name}, {First_Name}</w:t>
+    </w:r>
+    <w:r>
+      <w:rPr>
+        <w:rFonts w:ascii="Arial" w:hAnsi="Arial" w:cs="Arial"/>
+        <w:sz w:val="22"/>
+        <w:szCs w:val="24"/>
+        <w:lang w:val="en-PH"/>
+      </w:rPr>
+      <w:t xml:space="preserve">          </w:t>
     </w:r>
     <w:r>
       <w:rPr>
@@ -12102,6 +12255,15 @@
       </w:rPr>
       <w:t xml:space="preserve"> </w:t>
     </w:r>
+    <w:r>
+      <w:rPr>
+        <w:rFonts w:ascii="Arial" w:hAnsi="Arial" w:cs="Arial"/>
+        <w:color w:val="000000"/>
+        <w:sz w:val="22"/>
+        <w:szCs w:val="24"/>
+      </w:rPr>
+      <w:t>{Investigation_Docket_Number}</w:t>
+    </w:r>
   </w:p>
   <w:p>
     <w:pPr>
@@ -12121,7 +12283,30 @@
         <w:sz w:val="22"/>
         <w:szCs w:val="24"/>
       </w:rPr>
-      <w:t xml:space="preserve">Criminal Case Number: </w:t>
+      <w:t>Criminal Case Number:</w:t>
+    </w:r>
+    <w:r>
+      <w:t xml:space="preserve"> </w:t>
+    </w:r>
+    <w:r>
+      <w:rPr>
+        <w:rFonts w:ascii="Arial" w:hAnsi="Arial" w:cs="Arial"/>
+        <w:bCs/>
+        <w:color w:val="000000"/>
+        <w:sz w:val="22"/>
+        <w:szCs w:val="24"/>
+      </w:rPr>
+      <w:t>{Criminal_Case_Number}</w:t>
+    </w:r>
+    <w:r>
+      <w:rPr>
+        <w:rFonts w:ascii="Arial" w:hAnsi="Arial" w:cs="Arial"/>
+        <w:b/>
+        <w:color w:val="000000"/>
+        <w:sz w:val="22"/>
+        <w:szCs w:val="24"/>
+      </w:rPr>
+      <w:t xml:space="preserve"> </w:t>
     </w:r>
   </w:p>
 </w:hdr>
@@ -12739,7 +12924,7 @@
                                     <pic:cNvPicPr/>
                                   </pic:nvPicPr>
                                   <pic:blipFill>
-                                    <a:blip r:embed="rId1" cstate="print"/>
+                                    <a:blip r:embed="rId6" cstate="print"/>
                                     <a:srcRect/>
                                     <a:stretch/>
                                   </pic:blipFill>
@@ -12769,7 +12954,7 @@
                         </w:rPr>
                         <w:t xml:space="preserve"> </w:t>
                       </w:r>
-                      <w:hyperlink r:id="rId6" w:history="1">
+                      <w:hyperlink r:id="rId7" w:history="1">
                         <w:r>
                           <w:rPr>
                             <w:rStyle w:val="Hyperlink"/>
@@ -12802,7 +12987,7 @@
                         </w:rPr>
                         <w:t xml:space="preserve">Website: </w:t>
                       </w:r>
-                      <w:hyperlink r:id="rId7" w:history="1">
+                      <w:hyperlink r:id="rId8" w:history="1">
                         <w:r>
                           <w:rPr>
                             <w:rFonts w:ascii="Arial" w:hAnsi="Arial" w:cs="Arial"/>
@@ -12846,10 +13031,10 @@
                 <o:lock v:ext="edit" aspectratio="t"/>
               </v:shapetype>
               <v:shape id="Image" o:spid="_x0000_s1034" type="#_x0000_t75" style="position:absolute;left:2232;top:-3101;width:9366;height:9143;visibility:visible;mso-wrap-style:square" o:gfxdata="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">
-                <v:imagedata r:id="rId8" o:title=""/>
+                <v:imagedata r:id="rId9" o:title=""/>
               </v:shape>
               <v:shape id="Image" o:spid="_x0000_s1035" type="#_x0000_t75" style="position:absolute;left:54290;top:-3101;width:8903;height:8324;visibility:visible;mso-wrap-style:square" o:gfxdata="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">
-                <v:imagedata r:id="rId9" o:title=""/>
+                <v:imagedata r:id="rId10" o:title=""/>
               </v:shape>
               <v:line id="Straight Connector 179351327" o:spid="_x0000_s1036" style="position:absolute;visibility:visible;mso-wrap-style:square" from="-1378,8905" to="67015,8905" o:connectortype="straight" o:gfxdata="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" strokecolor="#eb613d" strokeweight=".51mm"/>
             </v:group>
@@ -13789,7 +13974,7 @@
                                     <pic:cNvPicPr/>
                                   </pic:nvPicPr>
                                   <pic:blipFill>
-                                    <a:blip r:embed="rId1" cstate="print"/>
+                                    <a:blip r:embed="rId6" cstate="print"/>
                                     <a:srcRect/>
                                     <a:stretch/>
                                   </pic:blipFill>
@@ -13819,7 +14004,7 @@
                         </w:rPr>
                         <w:t xml:space="preserve"> </w:t>
                       </w:r>
-                      <w:hyperlink r:id="rId6" w:history="1">
+                      <w:hyperlink r:id="rId7" w:history="1">
                         <w:r>
                           <w:rPr>
                             <w:rStyle w:val="Hyperlink"/>
@@ -13852,7 +14037,7 @@
                         </w:rPr>
                         <w:t xml:space="preserve">Website: </w:t>
                       </w:r>
-                      <w:hyperlink r:id="rId7" w:history="1">
+                      <w:hyperlink r:id="rId8" w:history="1">
                         <w:r>
                           <w:rPr>
                             <w:rFonts w:ascii="Arial" w:hAnsi="Arial" w:cs="Arial"/>
@@ -13896,10 +14081,10 @@
                 <o:lock v:ext="edit" aspectratio="t"/>
               </v:shapetype>
               <v:shape id="Image" o:spid="_x0000_s1040" type="#_x0000_t75" style="position:absolute;left:2232;top:-3101;width:9366;height:9143;visibility:visible;mso-wrap-style:square" o:gfxdata="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">
-                <v:imagedata r:id="rId8" o:title=""/>
+                <v:imagedata r:id="rId9" o:title=""/>
               </v:shape>
               <v:shape id="Image" o:spid="_x0000_s1041" type="#_x0000_t75" style="position:absolute;left:54290;top:-3101;width:8903;height:8324;visibility:visible;mso-wrap-style:square" o:gfxdata="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">
-                <v:imagedata r:id="rId9" o:title=""/>
+                <v:imagedata r:id="rId10" o:title=""/>
               </v:shape>
               <v:line id="Straight Connector 324931324" o:spid="_x0000_s1042" style="position:absolute;visibility:visible;mso-wrap-style:square" from="-1378,8905" to="67015,8905" o:connectortype="straight" o:gfxdata="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" strokecolor="#eb613d" strokeweight=".51mm"/>
             </v:group>
@@ -14952,7 +15137,6 @@
   <w:style w:type="character" w:default="1" w:styleId="DefaultParagraphFont">
     <w:name w:val="Default Paragraph Font"/>
     <w:uiPriority w:val="1"/>
-    <w:semiHidden/>
     <w:unhideWhenUsed/>
   </w:style>
   <w:style w:type="table" w:default="1" w:styleId="TableNormal">

</xml_diff>

<commit_message>
Refactor report export functionality to support DOCX format only
- Updated export buttons in ViewReportPage and ReportsList to generate DOCX files.
- Removed PDF generation code and related components, including pdf-generator and pdf-template.
- Modified the DOCX generation logic to include identifying data in the report number.
- Adjusted filename generation to only support DOCX format.
- Updated the PSIR template to include new sections for analysis and evaluation.
</commit_message>
<xml_diff>
--- a/templates/PSIR.docx
+++ b/templates/PSIR.docx
@@ -122,7 +122,25 @@
           <w:sz w:val="24"/>
           <w:szCs w:val="24"/>
         </w:rPr>
-        <w:t>{Letter_Position}</w:t>
+        <w:t>{</w:t>
+      </w:r>
+      <w:proofErr w:type="spellStart"/>
+      <w:r>
+        <w:rPr>
+          <w:rFonts w:ascii="Arial" w:hAnsi="Arial" w:cs="Arial"/>
+          <w:sz w:val="24"/>
+          <w:szCs w:val="24"/>
+        </w:rPr>
+        <w:t>Letter_Position</w:t>
+      </w:r>
+      <w:proofErr w:type="spellEnd"/>
+      <w:r>
+        <w:rPr>
+          <w:rFonts w:ascii="Arial" w:hAnsi="Arial" w:cs="Arial"/>
+          <w:sz w:val="24"/>
+          <w:szCs w:val="24"/>
+        </w:rPr>
+        <w:t>}</w:t>
       </w:r>
     </w:p>
     <w:p>
@@ -162,7 +180,25 @@
           <w:sz w:val="24"/>
           <w:szCs w:val="24"/>
         </w:rPr>
-        <w:t>{Letter_Address}</w:t>
+        <w:t>{</w:t>
+      </w:r>
+      <w:proofErr w:type="spellStart"/>
+      <w:r>
+        <w:rPr>
+          <w:rFonts w:ascii="Arial" w:hAnsi="Arial" w:cs="Arial"/>
+          <w:sz w:val="24"/>
+          <w:szCs w:val="24"/>
+        </w:rPr>
+        <w:t>Letter_Address</w:t>
+      </w:r>
+      <w:proofErr w:type="spellEnd"/>
+      <w:r>
+        <w:rPr>
+          <w:rFonts w:ascii="Arial" w:hAnsi="Arial" w:cs="Arial"/>
+          <w:sz w:val="24"/>
+          <w:szCs w:val="24"/>
+        </w:rPr>
+        <w:t>}</w:t>
       </w:r>
     </w:p>
     <w:p>
@@ -2007,7 +2043,25 @@
                 <w:sz w:val="22"/>
                 <w:szCs w:val="24"/>
               </w:rPr>
-              <w:t>{True_Name}</w:t>
+              <w:t>{</w:t>
+            </w:r>
+            <w:proofErr w:type="spellStart"/>
+            <w:r>
+              <w:rPr>
+                <w:rFonts w:ascii="Arial" w:hAnsi="Arial" w:cs="Arial"/>
+                <w:sz w:val="22"/>
+                <w:szCs w:val="24"/>
+              </w:rPr>
+              <w:t>True_Name</w:t>
+            </w:r>
+            <w:proofErr w:type="spellEnd"/>
+            <w:r>
+              <w:rPr>
+                <w:rFonts w:ascii="Arial" w:hAnsi="Arial" w:cs="Arial"/>
+                <w:sz w:val="22"/>
+                <w:szCs w:val="24"/>
+              </w:rPr>
+              <w:t>}</w:t>
             </w:r>
           </w:p>
         </w:tc>
@@ -2191,7 +2245,25 @@
                 <w:sz w:val="22"/>
                 <w:szCs w:val="24"/>
               </w:rPr>
-              <w:t>{Educational_Attainment}</w:t>
+              <w:t>{</w:t>
+            </w:r>
+            <w:proofErr w:type="spellStart"/>
+            <w:r>
+              <w:rPr>
+                <w:rFonts w:ascii="Arial" w:hAnsi="Arial" w:cs="Arial"/>
+                <w:sz w:val="22"/>
+                <w:szCs w:val="24"/>
+              </w:rPr>
+              <w:t>Educational_Attainment</w:t>
+            </w:r>
+            <w:proofErr w:type="spellEnd"/>
+            <w:r>
+              <w:rPr>
+                <w:rFonts w:ascii="Arial" w:hAnsi="Arial" w:cs="Arial"/>
+                <w:sz w:val="22"/>
+                <w:szCs w:val="24"/>
+              </w:rPr>
+              <w:t>}</w:t>
             </w:r>
           </w:p>
         </w:tc>
@@ -3036,8 +3108,18 @@
                 <w:sz w:val="22"/>
                 <w:szCs w:val="24"/>
               </w:rPr>
-              <w:t>{Civil_Status</w:t>
-            </w:r>
+              <w:t>{</w:t>
+            </w:r>
+            <w:proofErr w:type="spellStart"/>
+            <w:r>
+              <w:rPr>
+                <w:rFonts w:ascii="Arial" w:hAnsi="Arial" w:cs="Arial"/>
+                <w:sz w:val="22"/>
+                <w:szCs w:val="24"/>
+              </w:rPr>
+              <w:t>Civil_Status</w:t>
+            </w:r>
+            <w:proofErr w:type="spellEnd"/>
             <w:r>
               <w:rPr>
                 <w:rFonts w:ascii="Arial" w:hAnsi="Arial" w:cs="Arial"/>
@@ -3368,7 +3450,27 @@
                 <w:sz w:val="22"/>
                 <w:szCs w:val="24"/>
               </w:rPr>
-              <w:t>{Identifying_Marks}</w:t>
+              <w:t>{</w:t>
+            </w:r>
+            <w:proofErr w:type="spellStart"/>
+            <w:r>
+              <w:rPr>
+                <w:rFonts w:ascii="Arial" w:hAnsi="Arial" w:cs="Arial"/>
+                <w:color w:val="000000" w:themeColor="text1"/>
+                <w:sz w:val="22"/>
+                <w:szCs w:val="24"/>
+              </w:rPr>
+              <w:t>Identifying_Marks</w:t>
+            </w:r>
+            <w:proofErr w:type="spellEnd"/>
+            <w:r>
+              <w:rPr>
+                <w:rFonts w:ascii="Arial" w:hAnsi="Arial" w:cs="Arial"/>
+                <w:color w:val="000000" w:themeColor="text1"/>
+                <w:sz w:val="22"/>
+                <w:szCs w:val="24"/>
+              </w:rPr>
+              <w:t>}</w:t>
             </w:r>
           </w:p>
         </w:tc>
@@ -3455,7 +3557,27 @@
                 <w:szCs w:val="24"/>
                 <w:lang w:val="fr-FR"/>
               </w:rPr>
-              <w:t>{Present_Address}</w:t>
+              <w:t>{</w:t>
+            </w:r>
+            <w:proofErr w:type="spellStart"/>
+            <w:r>
+              <w:rPr>
+                <w:rFonts w:ascii="Arial" w:hAnsi="Arial" w:cs="Arial"/>
+                <w:sz w:val="24"/>
+                <w:szCs w:val="24"/>
+                <w:lang w:val="fr-FR"/>
+              </w:rPr>
+              <w:t>Present_Address</w:t>
+            </w:r>
+            <w:proofErr w:type="spellEnd"/>
+            <w:r>
+              <w:rPr>
+                <w:rFonts w:ascii="Arial" w:hAnsi="Arial" w:cs="Arial"/>
+                <w:sz w:val="24"/>
+                <w:szCs w:val="24"/>
+                <w:lang w:val="fr-FR"/>
+              </w:rPr>
+              <w:t>}</w:t>
             </w:r>
           </w:p>
         </w:tc>
@@ -3544,7 +3666,27 @@
                 <w:sz w:val="24"/>
                 <w:szCs w:val="24"/>
               </w:rPr>
-              <w:t>{Permanent_Address}</w:t>
+              <w:t>{</w:t>
+            </w:r>
+            <w:proofErr w:type="spellStart"/>
+            <w:r>
+              <w:rPr>
+                <w:rFonts w:ascii="Arial" w:hAnsi="Arial" w:cs="Arial"/>
+                <w:bCs/>
+                <w:sz w:val="24"/>
+                <w:szCs w:val="24"/>
+              </w:rPr>
+              <w:t>Permanent_Address</w:t>
+            </w:r>
+            <w:proofErr w:type="spellEnd"/>
+            <w:r>
+              <w:rPr>
+                <w:rFonts w:ascii="Arial" w:hAnsi="Arial" w:cs="Arial"/>
+                <w:bCs/>
+                <w:sz w:val="24"/>
+                <w:szCs w:val="24"/>
+              </w:rPr>
+              <w:t>}</w:t>
             </w:r>
           </w:p>
         </w:tc>
@@ -3702,7 +3844,25 @@
                 <w:sz w:val="24"/>
                 <w:szCs w:val="32"/>
               </w:rPr>
-              <w:t>{Charged_With}</w:t>
+              <w:t>{</w:t>
+            </w:r>
+            <w:proofErr w:type="spellStart"/>
+            <w:r>
+              <w:rPr>
+                <w:rFonts w:ascii="Arial" w:hAnsi="Arial" w:cs="Arial"/>
+                <w:sz w:val="24"/>
+                <w:szCs w:val="32"/>
+              </w:rPr>
+              <w:t>Charged_With</w:t>
+            </w:r>
+            <w:proofErr w:type="spellEnd"/>
+            <w:r>
+              <w:rPr>
+                <w:rFonts w:ascii="Arial" w:hAnsi="Arial" w:cs="Arial"/>
+                <w:sz w:val="24"/>
+                <w:szCs w:val="32"/>
+              </w:rPr>
+              <w:t>}</w:t>
             </w:r>
           </w:p>
         </w:tc>
@@ -3799,7 +3959,25 @@
                 <w:sz w:val="22"/>
                 <w:szCs w:val="24"/>
               </w:rPr>
-              <w:t>{Charged_Date}</w:t>
+              <w:t>{</w:t>
+            </w:r>
+            <w:proofErr w:type="spellStart"/>
+            <w:r>
+              <w:rPr>
+                <w:rFonts w:ascii="Arial" w:hAnsi="Arial" w:cs="Arial"/>
+                <w:sz w:val="22"/>
+                <w:szCs w:val="24"/>
+              </w:rPr>
+              <w:t>Charged_Date</w:t>
+            </w:r>
+            <w:proofErr w:type="spellEnd"/>
+            <w:r>
+              <w:rPr>
+                <w:rFonts w:ascii="Arial" w:hAnsi="Arial" w:cs="Arial"/>
+                <w:sz w:val="22"/>
+                <w:szCs w:val="24"/>
+              </w:rPr>
+              <w:t>}</w:t>
             </w:r>
           </w:p>
         </w:tc>
@@ -3882,7 +4060,25 @@
                 <w:sz w:val="22"/>
                 <w:szCs w:val="24"/>
               </w:rPr>
-              <w:t>{Charged_Date}</w:t>
+              <w:t>{</w:t>
+            </w:r>
+            <w:proofErr w:type="spellStart"/>
+            <w:r>
+              <w:rPr>
+                <w:rFonts w:ascii="Arial" w:hAnsi="Arial" w:cs="Arial"/>
+                <w:sz w:val="22"/>
+                <w:szCs w:val="24"/>
+              </w:rPr>
+              <w:t>Charged_Date</w:t>
+            </w:r>
+            <w:proofErr w:type="spellEnd"/>
+            <w:r>
+              <w:rPr>
+                <w:rFonts w:ascii="Arial" w:hAnsi="Arial" w:cs="Arial"/>
+                <w:sz w:val="22"/>
+                <w:szCs w:val="24"/>
+              </w:rPr>
+              <w:t>}</w:t>
             </w:r>
           </w:p>
         </w:tc>
@@ -3980,7 +4176,25 @@
                 <w:sz w:val="24"/>
                 <w:szCs w:val="24"/>
               </w:rPr>
-              <w:t>{Convicted_Date}</w:t>
+              <w:t>{</w:t>
+            </w:r>
+            <w:proofErr w:type="spellStart"/>
+            <w:r>
+              <w:rPr>
+                <w:rFonts w:ascii="Arial" w:hAnsi="Arial" w:cs="Arial"/>
+                <w:sz w:val="24"/>
+                <w:szCs w:val="24"/>
+              </w:rPr>
+              <w:t>Convicted_Date</w:t>
+            </w:r>
+            <w:proofErr w:type="spellEnd"/>
+            <w:r>
+              <w:rPr>
+                <w:rFonts w:ascii="Arial" w:hAnsi="Arial" w:cs="Arial"/>
+                <w:sz w:val="24"/>
+                <w:szCs w:val="24"/>
+              </w:rPr>
+              <w:t>}</w:t>
             </w:r>
           </w:p>
         </w:tc>
@@ -4042,6 +4256,7 @@
                 <w:rtl/>
               </w:rPr>
             </w:pPr>
+            <w:proofErr w:type="gramStart"/>
             <w:r>
               <w:rPr>
                 <w:rFonts w:ascii="Arial" w:hAnsi="Arial" w:cs="Arial"/>
@@ -4057,7 +4272,16 @@
                 <w:sz w:val="22"/>
                 <w:szCs w:val="24"/>
               </w:rPr>
-              <w:t>{Sentence}</w:t>
+              <w:t>{</w:t>
+            </w:r>
+            <w:proofErr w:type="gramEnd"/>
+            <w:r>
+              <w:rPr>
+                <w:rFonts w:ascii="Arial" w:hAnsi="Arial" w:cs="Arial"/>
+                <w:sz w:val="22"/>
+                <w:szCs w:val="24"/>
+              </w:rPr>
+              <w:t>Sentence}</w:t>
             </w:r>
           </w:p>
         </w:tc>
@@ -4142,6 +4366,7 @@
               </w:rPr>
               <w:t>{</w:t>
             </w:r>
+            <w:proofErr w:type="spellStart"/>
             <w:r>
               <w:rPr>
                 <w:rFonts w:ascii="Arial" w:hAnsi="Arial" w:cs="Arial"/>
@@ -4156,7 +4381,16 @@
                 <w:sz w:val="22"/>
                 <w:szCs w:val="24"/>
               </w:rPr>
-              <w:t>Judge}</w:t>
+              <w:t>Judge</w:t>
+            </w:r>
+            <w:proofErr w:type="spellEnd"/>
+            <w:r>
+              <w:rPr>
+                <w:rFonts w:ascii="Arial" w:hAnsi="Arial" w:cs="Arial"/>
+                <w:sz w:val="22"/>
+                <w:szCs w:val="24"/>
+              </w:rPr>
+              <w:t>}</w:t>
             </w:r>
           </w:p>
         </w:tc>
@@ -4260,6 +4494,7 @@
               </w:rPr>
               <w:t>{</w:t>
             </w:r>
+            <w:proofErr w:type="spellStart"/>
             <w:r>
               <w:rPr>
                 <w:rFonts w:ascii="Arial" w:hAnsi="Arial" w:cs="Arial"/>
@@ -4274,7 +4509,16 @@
                 <w:sz w:val="24"/>
                 <w:szCs w:val="24"/>
               </w:rPr>
-              <w:t>Court}</w:t>
+              <w:t>Court</w:t>
+            </w:r>
+            <w:proofErr w:type="spellEnd"/>
+            <w:r>
+              <w:rPr>
+                <w:rFonts w:ascii="Arial" w:hAnsi="Arial" w:cs="Arial"/>
+                <w:sz w:val="24"/>
+                <w:szCs w:val="24"/>
+              </w:rPr>
+              <w:t>}</w:t>
             </w:r>
           </w:p>
         </w:tc>
@@ -4357,33 +4601,118 @@
                 <w:sz w:val="22"/>
                 <w:szCs w:val="22"/>
               </w:rPr>
-              <w:t>{Custodial_On_Bail}</w:t>
-            </w:r>
-            <w:r>
-              <w:rPr>
-                <w:rFonts w:ascii="Arial" w:hAnsi="Arial" w:cs="Arial"/>
-                <w:sz w:val="22"/>
-                <w:szCs w:val="22"/>
-                <w:lang w:val="en-PH" w:eastAsia="en-PH"/>
-              </w:rPr>
-              <w:t xml:space="preserve">On Bail   </w:t>
-            </w:r>
-            <w:r>
-              <w:rPr>
-                <w:rFonts w:ascii="Arial" w:hAnsi="Arial" w:cs="Arial"/>
-                <w:sz w:val="22"/>
-                <w:szCs w:val="22"/>
-              </w:rPr>
-              <w:t>{Custodial_On_Detention}</w:t>
-            </w:r>
-            <w:r>
-              <w:rPr>
-                <w:rFonts w:ascii="Arial" w:hAnsi="Arial" w:cs="Arial"/>
-                <w:sz w:val="22"/>
-                <w:szCs w:val="22"/>
-                <w:lang w:val="en-PH" w:eastAsia="en-PH"/>
-              </w:rPr>
-              <w:t>On Detention</w:t>
+              <w:t>{</w:t>
+            </w:r>
+            <w:proofErr w:type="spellStart"/>
+            <w:r>
+              <w:rPr>
+                <w:rFonts w:ascii="Arial" w:hAnsi="Arial" w:cs="Arial"/>
+                <w:sz w:val="22"/>
+                <w:szCs w:val="22"/>
+              </w:rPr>
+              <w:t>Custodial_On_</w:t>
+            </w:r>
+            <w:proofErr w:type="gramStart"/>
+            <w:r>
+              <w:rPr>
+                <w:rFonts w:ascii="Arial" w:hAnsi="Arial" w:cs="Arial"/>
+                <w:sz w:val="22"/>
+                <w:szCs w:val="22"/>
+              </w:rPr>
+              <w:t>Bail</w:t>
+            </w:r>
+            <w:proofErr w:type="spellEnd"/>
+            <w:r>
+              <w:rPr>
+                <w:rFonts w:ascii="Arial" w:hAnsi="Arial" w:cs="Arial"/>
+                <w:sz w:val="22"/>
+                <w:szCs w:val="22"/>
+              </w:rPr>
+              <w:t>}</w:t>
+            </w:r>
+            <w:r>
+              <w:rPr>
+                <w:rFonts w:ascii="Arial" w:hAnsi="Arial" w:cs="Arial"/>
+                <w:sz w:val="22"/>
+                <w:szCs w:val="22"/>
+                <w:lang w:val="en-PH" w:eastAsia="en-PH"/>
+              </w:rPr>
+              <w:t>On</w:t>
+            </w:r>
+            <w:proofErr w:type="gramEnd"/>
+            <w:r>
+              <w:rPr>
+                <w:rFonts w:ascii="Arial" w:hAnsi="Arial" w:cs="Arial"/>
+                <w:sz w:val="22"/>
+                <w:szCs w:val="22"/>
+                <w:lang w:val="en-PH" w:eastAsia="en-PH"/>
+              </w:rPr>
+              <w:t xml:space="preserve"> Bail</w:t>
+            </w:r>
+            <w:proofErr w:type="gramStart"/>
+            <w:r>
+              <w:rPr>
+                <w:rFonts w:ascii="Arial" w:hAnsi="Arial" w:cs="Arial"/>
+                <w:sz w:val="22"/>
+                <w:szCs w:val="22"/>
+                <w:lang w:val="en-PH" w:eastAsia="en-PH"/>
+              </w:rPr>
+              <w:t xml:space="preserve">   </w:t>
+            </w:r>
+            <w:r>
+              <w:rPr>
+                <w:rFonts w:ascii="Arial" w:hAnsi="Arial" w:cs="Arial"/>
+                <w:sz w:val="22"/>
+                <w:szCs w:val="22"/>
+              </w:rPr>
+              <w:t>{</w:t>
+            </w:r>
+            <w:proofErr w:type="spellStart"/>
+            <w:proofErr w:type="gramEnd"/>
+            <w:r>
+              <w:rPr>
+                <w:rFonts w:ascii="Arial" w:hAnsi="Arial" w:cs="Arial"/>
+                <w:sz w:val="22"/>
+                <w:szCs w:val="22"/>
+              </w:rPr>
+              <w:t>Custodial_On_</w:t>
+            </w:r>
+            <w:proofErr w:type="gramStart"/>
+            <w:r>
+              <w:rPr>
+                <w:rFonts w:ascii="Arial" w:hAnsi="Arial" w:cs="Arial"/>
+                <w:sz w:val="22"/>
+                <w:szCs w:val="22"/>
+              </w:rPr>
+              <w:t>Detention</w:t>
+            </w:r>
+            <w:proofErr w:type="spellEnd"/>
+            <w:r>
+              <w:rPr>
+                <w:rFonts w:ascii="Arial" w:hAnsi="Arial" w:cs="Arial"/>
+                <w:sz w:val="22"/>
+                <w:szCs w:val="22"/>
+              </w:rPr>
+              <w:t>}</w:t>
+            </w:r>
+            <w:r>
+              <w:rPr>
+                <w:rFonts w:ascii="Arial" w:hAnsi="Arial" w:cs="Arial"/>
+                <w:sz w:val="22"/>
+                <w:szCs w:val="22"/>
+                <w:lang w:val="en-PH" w:eastAsia="en-PH"/>
+              </w:rPr>
+              <w:t>On</w:t>
+            </w:r>
+            <w:proofErr w:type="gramEnd"/>
+            <w:r>
+              <w:rPr>
+                <w:rFonts w:ascii="Arial" w:hAnsi="Arial" w:cs="Arial"/>
+                <w:sz w:val="22"/>
+                <w:szCs w:val="22"/>
+                <w:lang w:val="en-PH" w:eastAsia="en-PH"/>
+              </w:rPr>
+              <w:t xml:space="preserve"> Detention</w:t>
             </w:r>
           </w:p>
         </w:tc>
@@ -4449,7 +4778,27 @@
                 <w:szCs w:val="22"/>
                 <w:lang w:val="fr-FR" w:eastAsia="en-PH"/>
               </w:rPr>
-              <w:t>{Custodial_ROR}</w:t>
+              <w:t>{</w:t>
+            </w:r>
+            <w:proofErr w:type="spellStart"/>
+            <w:r>
+              <w:rPr>
+                <w:rFonts w:ascii="Arial" w:hAnsi="Arial" w:cs="Arial"/>
+                <w:sz w:val="22"/>
+                <w:szCs w:val="22"/>
+                <w:lang w:val="fr-FR" w:eastAsia="en-PH"/>
+              </w:rPr>
+              <w:t>Custodial_ROR</w:t>
+            </w:r>
+            <w:proofErr w:type="spellEnd"/>
+            <w:r>
+              <w:rPr>
+                <w:rFonts w:ascii="Arial" w:hAnsi="Arial" w:cs="Arial"/>
+                <w:sz w:val="22"/>
+                <w:szCs w:val="22"/>
+                <w:lang w:val="fr-FR" w:eastAsia="en-PH"/>
+              </w:rPr>
+              <w:t>}</w:t>
             </w:r>
           </w:p>
           <w:p>
@@ -4498,7 +4847,29 @@
                 <w:u w:val="single"/>
                 <w:lang w:val="en-PH" w:eastAsia="en-PH"/>
               </w:rPr>
-              <w:t>{ROR_Custodian}</w:t>
+              <w:t>{</w:t>
+            </w:r>
+            <w:proofErr w:type="spellStart"/>
+            <w:r>
+              <w:rPr>
+                <w:rFonts w:ascii="Arial" w:hAnsi="Arial" w:cs="Arial"/>
+                <w:sz w:val="22"/>
+                <w:szCs w:val="22"/>
+                <w:u w:val="single"/>
+                <w:lang w:val="en-PH" w:eastAsia="en-PH"/>
+              </w:rPr>
+              <w:t>ROR_Custodian</w:t>
+            </w:r>
+            <w:proofErr w:type="spellEnd"/>
+            <w:r>
+              <w:rPr>
+                <w:rFonts w:ascii="Arial" w:hAnsi="Arial" w:cs="Arial"/>
+                <w:sz w:val="22"/>
+                <w:szCs w:val="22"/>
+                <w:u w:val="single"/>
+                <w:lang w:val="en-PH" w:eastAsia="en-PH"/>
+              </w:rPr>
+              <w:t>}</w:t>
             </w:r>
           </w:p>
         </w:tc>
@@ -4861,7 +5232,23 @@
                 <w:rFonts w:ascii="Arial" w:hAnsi="Arial" w:cs="Arial"/>
                 <w:szCs w:val="24"/>
               </w:rPr>
-              <w:t>{NBI_Case_Number}</w:t>
+              <w:t>{</w:t>
+            </w:r>
+            <w:proofErr w:type="spellStart"/>
+            <w:r>
+              <w:rPr>
+                <w:rFonts w:ascii="Arial" w:hAnsi="Arial" w:cs="Arial"/>
+                <w:szCs w:val="24"/>
+              </w:rPr>
+              <w:t>NBI_Case_Number</w:t>
+            </w:r>
+            <w:proofErr w:type="spellEnd"/>
+            <w:r>
+              <w:rPr>
+                <w:rFonts w:ascii="Arial" w:hAnsi="Arial" w:cs="Arial"/>
+                <w:szCs w:val="24"/>
+              </w:rPr>
+              <w:t>}</w:t>
             </w:r>
           </w:p>
         </w:tc>
@@ -4883,7 +5270,23 @@
                 <w:rFonts w:ascii="Arial" w:hAnsi="Arial" w:cs="Arial"/>
                 <w:szCs w:val="24"/>
               </w:rPr>
-              <w:t>{NBI_Offense}</w:t>
+              <w:t>{</w:t>
+            </w:r>
+            <w:proofErr w:type="spellStart"/>
+            <w:r>
+              <w:rPr>
+                <w:rFonts w:ascii="Arial" w:hAnsi="Arial" w:cs="Arial"/>
+                <w:szCs w:val="24"/>
+              </w:rPr>
+              <w:t>NBI_Offense</w:t>
+            </w:r>
+            <w:proofErr w:type="spellEnd"/>
+            <w:r>
+              <w:rPr>
+                <w:rFonts w:ascii="Arial" w:hAnsi="Arial" w:cs="Arial"/>
+                <w:szCs w:val="24"/>
+              </w:rPr>
+              <w:t>}</w:t>
             </w:r>
           </w:p>
         </w:tc>
@@ -4905,7 +5308,23 @@
                 <w:rFonts w:ascii="Arial" w:hAnsi="Arial" w:cs="Arial"/>
                 <w:szCs w:val="24"/>
               </w:rPr>
-              <w:t>{NBI_Date_Charged}</w:t>
+              <w:t>{</w:t>
+            </w:r>
+            <w:proofErr w:type="spellStart"/>
+            <w:r>
+              <w:rPr>
+                <w:rFonts w:ascii="Arial" w:hAnsi="Arial" w:cs="Arial"/>
+                <w:szCs w:val="24"/>
+              </w:rPr>
+              <w:t>NBI_Date_Charged</w:t>
+            </w:r>
+            <w:proofErr w:type="spellEnd"/>
+            <w:r>
+              <w:rPr>
+                <w:rFonts w:ascii="Arial" w:hAnsi="Arial" w:cs="Arial"/>
+                <w:szCs w:val="24"/>
+              </w:rPr>
+              <w:t>}</w:t>
             </w:r>
           </w:p>
         </w:tc>
@@ -4927,7 +5346,23 @@
                 <w:rFonts w:ascii="Arial" w:hAnsi="Arial" w:cs="Arial"/>
                 <w:szCs w:val="24"/>
               </w:rPr>
-              <w:t>{NBI_Decision_Status}</w:t>
+              <w:t>{</w:t>
+            </w:r>
+            <w:proofErr w:type="spellStart"/>
+            <w:r>
+              <w:rPr>
+                <w:rFonts w:ascii="Arial" w:hAnsi="Arial" w:cs="Arial"/>
+                <w:szCs w:val="24"/>
+              </w:rPr>
+              <w:t>NBI_Decision_Status</w:t>
+            </w:r>
+            <w:proofErr w:type="spellEnd"/>
+            <w:r>
+              <w:rPr>
+                <w:rFonts w:ascii="Arial" w:hAnsi="Arial" w:cs="Arial"/>
+                <w:szCs w:val="24"/>
+              </w:rPr>
+              <w:t>}</w:t>
             </w:r>
           </w:p>
         </w:tc>
@@ -4974,7 +5409,23 @@
                 <w:rFonts w:ascii="Arial" w:hAnsi="Arial" w:cs="Arial"/>
                 <w:szCs w:val="24"/>
               </w:rPr>
-              <w:t>{CMRD_Case_Number}</w:t>
+              <w:t>{</w:t>
+            </w:r>
+            <w:proofErr w:type="spellStart"/>
+            <w:r>
+              <w:rPr>
+                <w:rFonts w:ascii="Arial" w:hAnsi="Arial" w:cs="Arial"/>
+                <w:szCs w:val="24"/>
+              </w:rPr>
+              <w:t>CMRD_Case_Number</w:t>
+            </w:r>
+            <w:proofErr w:type="spellEnd"/>
+            <w:r>
+              <w:rPr>
+                <w:rFonts w:ascii="Arial" w:hAnsi="Arial" w:cs="Arial"/>
+                <w:szCs w:val="24"/>
+              </w:rPr>
+              <w:t>}</w:t>
             </w:r>
           </w:p>
         </w:tc>
@@ -4996,7 +5447,23 @@
                 <w:rFonts w:ascii="Arial" w:hAnsi="Arial" w:cs="Arial"/>
                 <w:szCs w:val="24"/>
               </w:rPr>
-              <w:t>{CMRD_Offense}</w:t>
+              <w:t>{</w:t>
+            </w:r>
+            <w:proofErr w:type="spellStart"/>
+            <w:r>
+              <w:rPr>
+                <w:rFonts w:ascii="Arial" w:hAnsi="Arial" w:cs="Arial"/>
+                <w:szCs w:val="24"/>
+              </w:rPr>
+              <w:t>CMRD_Offense</w:t>
+            </w:r>
+            <w:proofErr w:type="spellEnd"/>
+            <w:r>
+              <w:rPr>
+                <w:rFonts w:ascii="Arial" w:hAnsi="Arial" w:cs="Arial"/>
+                <w:szCs w:val="24"/>
+              </w:rPr>
+              <w:t>}</w:t>
             </w:r>
           </w:p>
         </w:tc>
@@ -5018,7 +5485,23 @@
                 <w:rFonts w:ascii="Arial" w:hAnsi="Arial" w:cs="Arial"/>
                 <w:szCs w:val="24"/>
               </w:rPr>
-              <w:t>{CMRD_Date_Charged}</w:t>
+              <w:t>{</w:t>
+            </w:r>
+            <w:proofErr w:type="spellStart"/>
+            <w:r>
+              <w:rPr>
+                <w:rFonts w:ascii="Arial" w:hAnsi="Arial" w:cs="Arial"/>
+                <w:szCs w:val="24"/>
+              </w:rPr>
+              <w:t>CMRD_Date_Charged</w:t>
+            </w:r>
+            <w:proofErr w:type="spellEnd"/>
+            <w:r>
+              <w:rPr>
+                <w:rFonts w:ascii="Arial" w:hAnsi="Arial" w:cs="Arial"/>
+                <w:szCs w:val="24"/>
+              </w:rPr>
+              <w:t>}</w:t>
             </w:r>
           </w:p>
         </w:tc>
@@ -5040,7 +5523,23 @@
                 <w:rFonts w:ascii="Arial" w:hAnsi="Arial" w:cs="Arial"/>
                 <w:szCs w:val="24"/>
               </w:rPr>
-              <w:t>{CMRD_Decision_Status}</w:t>
+              <w:t>{</w:t>
+            </w:r>
+            <w:proofErr w:type="spellStart"/>
+            <w:r>
+              <w:rPr>
+                <w:rFonts w:ascii="Arial" w:hAnsi="Arial" w:cs="Arial"/>
+                <w:szCs w:val="24"/>
+              </w:rPr>
+              <w:t>CMRD_Decision_Status</w:t>
+            </w:r>
+            <w:proofErr w:type="spellEnd"/>
+            <w:r>
+              <w:rPr>
+                <w:rFonts w:ascii="Arial" w:hAnsi="Arial" w:cs="Arial"/>
+                <w:szCs w:val="24"/>
+              </w:rPr>
+              <w:t>}</w:t>
             </w:r>
           </w:p>
         </w:tc>
@@ -5090,7 +5589,23 @@
                 <w:rFonts w:ascii="Arial" w:hAnsi="Arial" w:cs="Arial"/>
                 <w:szCs w:val="24"/>
               </w:rPr>
-              <w:t>{Others_Case_Number}</w:t>
+              <w:t>{</w:t>
+            </w:r>
+            <w:proofErr w:type="spellStart"/>
+            <w:r>
+              <w:rPr>
+                <w:rFonts w:ascii="Arial" w:hAnsi="Arial" w:cs="Arial"/>
+                <w:szCs w:val="24"/>
+              </w:rPr>
+              <w:t>Others_Case_Number</w:t>
+            </w:r>
+            <w:proofErr w:type="spellEnd"/>
+            <w:r>
+              <w:rPr>
+                <w:rFonts w:ascii="Arial" w:hAnsi="Arial" w:cs="Arial"/>
+                <w:szCs w:val="24"/>
+              </w:rPr>
+              <w:t>}</w:t>
             </w:r>
           </w:p>
         </w:tc>
@@ -5112,7 +5627,23 @@
                 <w:rFonts w:ascii="Arial" w:hAnsi="Arial" w:cs="Arial"/>
                 <w:szCs w:val="24"/>
               </w:rPr>
-              <w:t>{Others_Offense}</w:t>
+              <w:t>{</w:t>
+            </w:r>
+            <w:proofErr w:type="spellStart"/>
+            <w:r>
+              <w:rPr>
+                <w:rFonts w:ascii="Arial" w:hAnsi="Arial" w:cs="Arial"/>
+                <w:szCs w:val="24"/>
+              </w:rPr>
+              <w:t>Others_Offense</w:t>
+            </w:r>
+            <w:proofErr w:type="spellEnd"/>
+            <w:r>
+              <w:rPr>
+                <w:rFonts w:ascii="Arial" w:hAnsi="Arial" w:cs="Arial"/>
+                <w:szCs w:val="24"/>
+              </w:rPr>
+              <w:t>}</w:t>
             </w:r>
           </w:p>
         </w:tc>
@@ -5134,7 +5665,23 @@
                 <w:rFonts w:ascii="Arial" w:hAnsi="Arial" w:cs="Arial"/>
                 <w:szCs w:val="24"/>
               </w:rPr>
-              <w:t>{Others_Date_Charged}</w:t>
+              <w:t>{</w:t>
+            </w:r>
+            <w:proofErr w:type="spellStart"/>
+            <w:r>
+              <w:rPr>
+                <w:rFonts w:ascii="Arial" w:hAnsi="Arial" w:cs="Arial"/>
+                <w:szCs w:val="24"/>
+              </w:rPr>
+              <w:t>Others_Date_Charged</w:t>
+            </w:r>
+            <w:proofErr w:type="spellEnd"/>
+            <w:r>
+              <w:rPr>
+                <w:rFonts w:ascii="Arial" w:hAnsi="Arial" w:cs="Arial"/>
+                <w:szCs w:val="24"/>
+              </w:rPr>
+              <w:t>}</w:t>
             </w:r>
           </w:p>
         </w:tc>
@@ -5156,7 +5703,23 @@
                 <w:rFonts w:ascii="Arial" w:hAnsi="Arial" w:cs="Arial"/>
                 <w:szCs w:val="24"/>
               </w:rPr>
-              <w:t>{Others_Decision_Status}</w:t>
+              <w:t>{</w:t>
+            </w:r>
+            <w:proofErr w:type="spellStart"/>
+            <w:r>
+              <w:rPr>
+                <w:rFonts w:ascii="Arial" w:hAnsi="Arial" w:cs="Arial"/>
+                <w:szCs w:val="24"/>
+              </w:rPr>
+              <w:t>Others_Decision_Status</w:t>
+            </w:r>
+            <w:proofErr w:type="spellEnd"/>
+            <w:r>
+              <w:rPr>
+                <w:rFonts w:ascii="Arial" w:hAnsi="Arial" w:cs="Arial"/>
+                <w:szCs w:val="24"/>
+              </w:rPr>
+              <w:t>}</w:t>
             </w:r>
           </w:p>
         </w:tc>
@@ -5181,7 +5744,47 @@
           <w:sz w:val="18"/>
           <w:szCs w:val="26"/>
         </w:rPr>
-        <w:t xml:space="preserve">The Office reserves the right to submit supplemental report once records verification from the institution and/or law-enforcement agencies yields derogatory result or previous criminal records. Also attach the Sinumpaang Salaysay. </w:t>
+        <w:t xml:space="preserve">The Office reserves the right to submit supplemental report once records verification from the institution and/or law-enforcement agencies yields derogatory result or previous criminal records. Also attach the </w:t>
+      </w:r>
+      <w:proofErr w:type="spellStart"/>
+      <w:r>
+        <w:rPr>
+          <w:rFonts w:ascii="Arial" w:hAnsi="Arial" w:cs="Arial"/>
+          <w:i/>
+          <w:sz w:val="18"/>
+          <w:szCs w:val="26"/>
+        </w:rPr>
+        <w:t>Sinumpaang</w:t>
+      </w:r>
+      <w:proofErr w:type="spellEnd"/>
+      <w:r>
+        <w:rPr>
+          <w:rFonts w:ascii="Arial" w:hAnsi="Arial" w:cs="Arial"/>
+          <w:i/>
+          <w:sz w:val="18"/>
+          <w:szCs w:val="26"/>
+        </w:rPr>
+        <w:t xml:space="preserve"> </w:t>
+      </w:r>
+      <w:proofErr w:type="spellStart"/>
+      <w:r>
+        <w:rPr>
+          <w:rFonts w:ascii="Arial" w:hAnsi="Arial" w:cs="Arial"/>
+          <w:i/>
+          <w:sz w:val="18"/>
+          <w:szCs w:val="26"/>
+        </w:rPr>
+        <w:t>Salaysay</w:t>
+      </w:r>
+      <w:proofErr w:type="spellEnd"/>
+      <w:r>
+        <w:rPr>
+          <w:rFonts w:ascii="Arial" w:hAnsi="Arial" w:cs="Arial"/>
+          <w:i/>
+          <w:sz w:val="18"/>
+          <w:szCs w:val="26"/>
+        </w:rPr>
+        <w:t xml:space="preserve">. </w:t>
       </w:r>
     </w:p>
     <w:p>
@@ -5964,7 +6567,27 @@
                 <w:szCs w:val="22"/>
                 <w:lang w:val="en-PH" w:eastAsia="en-PH"/>
               </w:rPr>
-              <w:t>{Status_Poor}</w:t>
+              <w:t>{</w:t>
+            </w:r>
+            <w:proofErr w:type="spellStart"/>
+            <w:r>
+              <w:rPr>
+                <w:rFonts w:ascii="Arial" w:hAnsi="Arial" w:cs="Arial"/>
+                <w:sz w:val="22"/>
+                <w:szCs w:val="22"/>
+                <w:lang w:val="en-PH" w:eastAsia="en-PH"/>
+              </w:rPr>
+              <w:t>Status_Poor</w:t>
+            </w:r>
+            <w:proofErr w:type="spellEnd"/>
+            <w:r>
+              <w:rPr>
+                <w:rFonts w:ascii="Arial" w:hAnsi="Arial" w:cs="Arial"/>
+                <w:sz w:val="22"/>
+                <w:szCs w:val="22"/>
+                <w:lang w:val="en-PH" w:eastAsia="en-PH"/>
+              </w:rPr>
+              <w:t>}</w:t>
             </w:r>
             <w:r>
               <w:rPr>
@@ -6060,7 +6683,27 @@
                 <w:szCs w:val="22"/>
                 <w:lang w:val="en-PH" w:eastAsia="en-PH"/>
               </w:rPr>
-              <w:t>{Relationship_Very_Satisfactory}</w:t>
+              <w:t>{</w:t>
+            </w:r>
+            <w:proofErr w:type="spellStart"/>
+            <w:r>
+              <w:rPr>
+                <w:rFonts w:ascii="Arial" w:hAnsi="Arial" w:cs="Arial"/>
+                <w:sz w:val="22"/>
+                <w:szCs w:val="22"/>
+                <w:lang w:val="en-PH" w:eastAsia="en-PH"/>
+              </w:rPr>
+              <w:t>Relationship_Very_Satisfactory</w:t>
+            </w:r>
+            <w:proofErr w:type="spellEnd"/>
+            <w:r>
+              <w:rPr>
+                <w:rFonts w:ascii="Arial" w:hAnsi="Arial" w:cs="Arial"/>
+                <w:sz w:val="22"/>
+                <w:szCs w:val="22"/>
+                <w:lang w:val="en-PH" w:eastAsia="en-PH"/>
+              </w:rPr>
+              <w:t>}</w:t>
             </w:r>
             <w:r>
               <w:rPr>
@@ -6156,7 +6799,27 @@
                 <w:szCs w:val="22"/>
                 <w:lang w:val="en-PH" w:eastAsia="en-PH"/>
               </w:rPr>
-              <w:t>{Reputation_Very_Satisfactory}</w:t>
+              <w:t>{</w:t>
+            </w:r>
+            <w:proofErr w:type="spellStart"/>
+            <w:r>
+              <w:rPr>
+                <w:rFonts w:ascii="Arial" w:hAnsi="Arial" w:cs="Arial"/>
+                <w:sz w:val="22"/>
+                <w:szCs w:val="22"/>
+                <w:lang w:val="en-PH" w:eastAsia="en-PH"/>
+              </w:rPr>
+              <w:t>Reputation_Very_Satisfactory</w:t>
+            </w:r>
+            <w:proofErr w:type="spellEnd"/>
+            <w:r>
+              <w:rPr>
+                <w:rFonts w:ascii="Arial" w:hAnsi="Arial" w:cs="Arial"/>
+                <w:sz w:val="22"/>
+                <w:szCs w:val="22"/>
+                <w:lang w:val="en-PH" w:eastAsia="en-PH"/>
+              </w:rPr>
+              <w:t>}</w:t>
             </w:r>
             <w:r>
               <w:rPr>
@@ -6282,17 +6945,38 @@
                 <w:szCs w:val="22"/>
                 <w:lang w:val="en-PH" w:eastAsia="en-PH"/>
               </w:rPr>
-              <w:t>{Status_</w:t>
-            </w:r>
-            <w:r>
-              <w:rPr>
-                <w:rFonts w:ascii="Arial" w:hAnsi="Arial" w:cs="Arial"/>
-                <w:sz w:val="22"/>
-                <w:szCs w:val="22"/>
-                <w:lang w:val="en-PH" w:eastAsia="en-PH"/>
-              </w:rPr>
-              <w:t>Low_Income</w:t>
-            </w:r>
+              <w:t>{</w:t>
+            </w:r>
+            <w:proofErr w:type="spellStart"/>
+            <w:r>
+              <w:rPr>
+                <w:rFonts w:ascii="Arial" w:hAnsi="Arial" w:cs="Arial"/>
+                <w:sz w:val="22"/>
+                <w:szCs w:val="22"/>
+                <w:lang w:val="en-PH" w:eastAsia="en-PH"/>
+              </w:rPr>
+              <w:t>Status_</w:t>
+            </w:r>
+            <w:r>
+              <w:rPr>
+                <w:rFonts w:ascii="Arial" w:hAnsi="Arial" w:cs="Arial"/>
+                <w:sz w:val="22"/>
+                <w:szCs w:val="22"/>
+                <w:lang w:val="en-PH" w:eastAsia="en-PH"/>
+              </w:rPr>
+              <w:t>Low_</w:t>
+            </w:r>
+            <w:proofErr w:type="gramStart"/>
+            <w:r>
+              <w:rPr>
+                <w:rFonts w:ascii="Arial" w:hAnsi="Arial" w:cs="Arial"/>
+                <w:sz w:val="22"/>
+                <w:szCs w:val="22"/>
+                <w:lang w:val="en-PH" w:eastAsia="en-PH"/>
+              </w:rPr>
+              <w:t>Income</w:t>
+            </w:r>
+            <w:proofErr w:type="spellEnd"/>
             <w:r>
               <w:rPr>
                 <w:rFonts w:ascii="Arial" w:hAnsi="Arial" w:cs="Arial"/>
@@ -6309,7 +6993,17 @@
                 <w:szCs w:val="22"/>
                 <w:lang w:val="en-PH" w:eastAsia="en-PH"/>
               </w:rPr>
-              <w:t xml:space="preserve">Low-income Class (but </w:t>
+              <w:t>Low</w:t>
+            </w:r>
+            <w:proofErr w:type="gramEnd"/>
+            <w:r>
+              <w:rPr>
+                <w:rFonts w:ascii="Arial" w:hAnsi="Arial" w:cs="Arial"/>
+                <w:sz w:val="22"/>
+                <w:szCs w:val="22"/>
+                <w:lang w:val="en-PH" w:eastAsia="en-PH"/>
+              </w:rPr>
+              <w:t xml:space="preserve">-income Class (but </w:t>
             </w:r>
           </w:p>
           <w:p>
@@ -6416,7 +7110,27 @@
                 <w:szCs w:val="22"/>
                 <w:lang w:val="en-PH" w:eastAsia="en-PH"/>
               </w:rPr>
-              <w:t>{Relationship_Satisfactory}</w:t>
+              <w:t>{</w:t>
+            </w:r>
+            <w:proofErr w:type="spellStart"/>
+            <w:r>
+              <w:rPr>
+                <w:rFonts w:ascii="Arial" w:hAnsi="Arial" w:cs="Arial"/>
+                <w:sz w:val="22"/>
+                <w:szCs w:val="22"/>
+                <w:lang w:val="en-PH" w:eastAsia="en-PH"/>
+              </w:rPr>
+              <w:t>Relationship_Satisfactory</w:t>
+            </w:r>
+            <w:proofErr w:type="spellEnd"/>
+            <w:r>
+              <w:rPr>
+                <w:rFonts w:ascii="Arial" w:hAnsi="Arial" w:cs="Arial"/>
+                <w:sz w:val="22"/>
+                <w:szCs w:val="22"/>
+                <w:lang w:val="en-PH" w:eastAsia="en-PH"/>
+              </w:rPr>
+              <w:t>}</w:t>
             </w:r>
             <w:r>
               <w:rPr>
@@ -6511,7 +7225,27 @@
                 <w:szCs w:val="22"/>
                 <w:lang w:val="en-PH" w:eastAsia="en-PH"/>
               </w:rPr>
-              <w:t>{Reputation_Satisfactory}</w:t>
+              <w:t>{</w:t>
+            </w:r>
+            <w:proofErr w:type="spellStart"/>
+            <w:r>
+              <w:rPr>
+                <w:rFonts w:ascii="Arial" w:hAnsi="Arial" w:cs="Arial"/>
+                <w:sz w:val="22"/>
+                <w:szCs w:val="22"/>
+                <w:lang w:val="en-PH" w:eastAsia="en-PH"/>
+              </w:rPr>
+              <w:t>Reputation_Satisfactory</w:t>
+            </w:r>
+            <w:proofErr w:type="spellEnd"/>
+            <w:r>
+              <w:rPr>
+                <w:rFonts w:ascii="Arial" w:hAnsi="Arial" w:cs="Arial"/>
+                <w:sz w:val="22"/>
+                <w:szCs w:val="22"/>
+                <w:lang w:val="en-PH" w:eastAsia="en-PH"/>
+              </w:rPr>
+              <w:t>}</w:t>
             </w:r>
             <w:r>
               <w:rPr>
@@ -6709,7 +7443,27 @@
                 <w:szCs w:val="22"/>
                 <w:lang w:val="en-PH" w:eastAsia="en-PH"/>
               </w:rPr>
-              <w:t>{Relationship_Poor}</w:t>
+              <w:t>{</w:t>
+            </w:r>
+            <w:proofErr w:type="spellStart"/>
+            <w:r>
+              <w:rPr>
+                <w:rFonts w:ascii="Arial" w:hAnsi="Arial" w:cs="Arial"/>
+                <w:sz w:val="22"/>
+                <w:szCs w:val="22"/>
+                <w:lang w:val="en-PH" w:eastAsia="en-PH"/>
+              </w:rPr>
+              <w:t>Relationship_Poor</w:t>
+            </w:r>
+            <w:proofErr w:type="spellEnd"/>
+            <w:r>
+              <w:rPr>
+                <w:rFonts w:ascii="Arial" w:hAnsi="Arial" w:cs="Arial"/>
+                <w:sz w:val="22"/>
+                <w:szCs w:val="22"/>
+                <w:lang w:val="en-PH" w:eastAsia="en-PH"/>
+              </w:rPr>
+              <w:t>}</w:t>
             </w:r>
             <w:r>
               <w:rPr>
@@ -6800,7 +7554,27 @@
                 <w:szCs w:val="22"/>
                 <w:lang w:val="en-PH" w:eastAsia="en-PH"/>
               </w:rPr>
-              <w:t>{Reputation_Poor}</w:t>
+              <w:t>{</w:t>
+            </w:r>
+            <w:proofErr w:type="spellStart"/>
+            <w:r>
+              <w:rPr>
+                <w:rFonts w:ascii="Arial" w:hAnsi="Arial" w:cs="Arial"/>
+                <w:sz w:val="22"/>
+                <w:szCs w:val="22"/>
+                <w:lang w:val="en-PH" w:eastAsia="en-PH"/>
+              </w:rPr>
+              <w:t>Reputation_Poor</w:t>
+            </w:r>
+            <w:proofErr w:type="spellEnd"/>
+            <w:r>
+              <w:rPr>
+                <w:rFonts w:ascii="Arial" w:hAnsi="Arial" w:cs="Arial"/>
+                <w:sz w:val="22"/>
+                <w:szCs w:val="22"/>
+                <w:lang w:val="en-PH" w:eastAsia="en-PH"/>
+              </w:rPr>
+              <w:t>}</w:t>
             </w:r>
             <w:r>
               <w:rPr>
@@ -6925,7 +7699,17 @@
                 <w:szCs w:val="22"/>
                 <w:lang w:val="en-PH" w:eastAsia="en-PH"/>
               </w:rPr>
-              <w:t>{Status_</w:t>
+              <w:t>{</w:t>
+            </w:r>
+            <w:proofErr w:type="spellStart"/>
+            <w:r>
+              <w:rPr>
+                <w:rFonts w:ascii="Arial" w:hAnsi="Arial" w:cs="Arial"/>
+                <w:sz w:val="22"/>
+                <w:szCs w:val="22"/>
+                <w:lang w:val="en-PH" w:eastAsia="en-PH"/>
+              </w:rPr>
+              <w:t>Status_</w:t>
             </w:r>
             <w:r>
               <w:rPr>
@@ -6936,6 +7720,7 @@
               </w:rPr>
               <w:t>Low_Middle</w:t>
             </w:r>
+            <w:proofErr w:type="spellEnd"/>
             <w:r>
               <w:rPr>
                 <w:rFonts w:ascii="Arial" w:hAnsi="Arial" w:cs="Arial"/>
@@ -7222,7 +8007,17 @@
                 <w:szCs w:val="22"/>
                 <w:lang w:val="en-PH" w:eastAsia="en-PH"/>
               </w:rPr>
-              <w:t>{Status_</w:t>
+              <w:t>{</w:t>
+            </w:r>
+            <w:proofErr w:type="spellStart"/>
+            <w:r>
+              <w:rPr>
+                <w:rFonts w:ascii="Arial" w:hAnsi="Arial" w:cs="Arial"/>
+                <w:sz w:val="22"/>
+                <w:szCs w:val="22"/>
+                <w:lang w:val="en-PH" w:eastAsia="en-PH"/>
+              </w:rPr>
+              <w:t>Status_</w:t>
             </w:r>
             <w:r>
               <w:rPr>
@@ -7233,6 +8028,7 @@
               </w:rPr>
               <w:t>Middle_Middle</w:t>
             </w:r>
+            <w:proofErr w:type="spellEnd"/>
             <w:r>
               <w:rPr>
                 <w:rFonts w:ascii="Arial" w:hAnsi="Arial" w:cs="Arial"/>
@@ -7540,7 +8336,17 @@
                 <w:szCs w:val="22"/>
                 <w:lang w:val="en-PH" w:eastAsia="en-PH"/>
               </w:rPr>
-              <w:t>{Status_</w:t>
+              <w:t>{</w:t>
+            </w:r>
+            <w:proofErr w:type="spellStart"/>
+            <w:r>
+              <w:rPr>
+                <w:rFonts w:ascii="Arial" w:hAnsi="Arial" w:cs="Arial"/>
+                <w:sz w:val="22"/>
+                <w:szCs w:val="22"/>
+                <w:lang w:val="en-PH" w:eastAsia="en-PH"/>
+              </w:rPr>
+              <w:t>Status_</w:t>
             </w:r>
             <w:r>
               <w:rPr>
@@ -7551,6 +8357,7 @@
               </w:rPr>
               <w:t>Upper_Middle</w:t>
             </w:r>
+            <w:proofErr w:type="spellEnd"/>
             <w:r>
               <w:rPr>
                 <w:rFonts w:ascii="Arial" w:hAnsi="Arial" w:cs="Arial"/>
@@ -7857,17 +8664,38 @@
                 <w:szCs w:val="22"/>
                 <w:lang w:val="en-PH" w:eastAsia="en-PH"/>
               </w:rPr>
-              <w:t>{Status_</w:t>
-            </w:r>
-            <w:r>
-              <w:rPr>
-                <w:rFonts w:ascii="Arial" w:hAnsi="Arial" w:cs="Arial"/>
-                <w:sz w:val="22"/>
-                <w:szCs w:val="22"/>
-                <w:lang w:val="en-PH" w:eastAsia="en-PH"/>
-              </w:rPr>
-              <w:t>Upper_Income</w:t>
-            </w:r>
+              <w:t>{</w:t>
+            </w:r>
+            <w:proofErr w:type="spellStart"/>
+            <w:r>
+              <w:rPr>
+                <w:rFonts w:ascii="Arial" w:hAnsi="Arial" w:cs="Arial"/>
+                <w:sz w:val="22"/>
+                <w:szCs w:val="22"/>
+                <w:lang w:val="en-PH" w:eastAsia="en-PH"/>
+              </w:rPr>
+              <w:t>Status_</w:t>
+            </w:r>
+            <w:r>
+              <w:rPr>
+                <w:rFonts w:ascii="Arial" w:hAnsi="Arial" w:cs="Arial"/>
+                <w:sz w:val="22"/>
+                <w:szCs w:val="22"/>
+                <w:lang w:val="en-PH" w:eastAsia="en-PH"/>
+              </w:rPr>
+              <w:t>Upper_</w:t>
+            </w:r>
+            <w:proofErr w:type="gramStart"/>
+            <w:r>
+              <w:rPr>
+                <w:rFonts w:ascii="Arial" w:hAnsi="Arial" w:cs="Arial"/>
+                <w:sz w:val="22"/>
+                <w:szCs w:val="22"/>
+                <w:lang w:val="en-PH" w:eastAsia="en-PH"/>
+              </w:rPr>
+              <w:t>Income</w:t>
+            </w:r>
+            <w:proofErr w:type="spellEnd"/>
             <w:r>
               <w:rPr>
                 <w:rFonts w:ascii="Arial" w:hAnsi="Arial" w:cs="Arial"/>
@@ -7884,7 +8712,17 @@
                 <w:szCs w:val="22"/>
                 <w:lang w:val="en-PH" w:eastAsia="en-PH"/>
               </w:rPr>
-              <w:t xml:space="preserve">Upper-income Class (but </w:t>
+              <w:t>Upper</w:t>
+            </w:r>
+            <w:proofErr w:type="gramEnd"/>
+            <w:r>
+              <w:rPr>
+                <w:rFonts w:ascii="Arial" w:hAnsi="Arial" w:cs="Arial"/>
+                <w:sz w:val="22"/>
+                <w:szCs w:val="22"/>
+                <w:lang w:val="en-PH" w:eastAsia="en-PH"/>
+              </w:rPr>
+              <w:t xml:space="preserve">-income Class (but </w:t>
             </w:r>
           </w:p>
           <w:p>
@@ -8164,7 +9002,17 @@
                 <w:szCs w:val="22"/>
                 <w:lang w:val="en-PH" w:eastAsia="en-PH"/>
               </w:rPr>
-              <w:t>{Status_</w:t>
+              <w:t>{</w:t>
+            </w:r>
+            <w:proofErr w:type="spellStart"/>
+            <w:r>
+              <w:rPr>
+                <w:rFonts w:ascii="Arial" w:hAnsi="Arial" w:cs="Arial"/>
+                <w:sz w:val="22"/>
+                <w:szCs w:val="22"/>
+                <w:lang w:val="en-PH" w:eastAsia="en-PH"/>
+              </w:rPr>
+              <w:t>Status_</w:t>
             </w:r>
             <w:r>
               <w:rPr>
@@ -8175,6 +9023,7 @@
               </w:rPr>
               <w:t>Rich</w:t>
             </w:r>
+            <w:proofErr w:type="spellEnd"/>
             <w:r>
               <w:rPr>
                 <w:rFonts w:ascii="Arial" w:hAnsi="Arial" w:cs="Arial"/>
@@ -9066,7 +9915,27 @@
                 <w:szCs w:val="22"/>
                 <w:lang w:val="en-PH" w:eastAsia="en-PH"/>
               </w:rPr>
-              <w:t>{Support_Very_Satisfactory}</w:t>
+              <w:t>{</w:t>
+            </w:r>
+            <w:proofErr w:type="spellStart"/>
+            <w:r>
+              <w:rPr>
+                <w:rFonts w:ascii="Arial" w:hAnsi="Arial" w:cs="Arial"/>
+                <w:sz w:val="22"/>
+                <w:szCs w:val="22"/>
+                <w:lang w:val="en-PH" w:eastAsia="en-PH"/>
+              </w:rPr>
+              <w:t>Support_Very_Satisfactory</w:t>
+            </w:r>
+            <w:proofErr w:type="spellEnd"/>
+            <w:r>
+              <w:rPr>
+                <w:rFonts w:ascii="Arial" w:hAnsi="Arial" w:cs="Arial"/>
+                <w:sz w:val="22"/>
+                <w:szCs w:val="22"/>
+                <w:lang w:val="en-PH" w:eastAsia="en-PH"/>
+              </w:rPr>
+              <w:t>}</w:t>
             </w:r>
             <w:r>
               <w:rPr>
@@ -9185,7 +10054,27 @@
                 <w:szCs w:val="22"/>
                 <w:lang w:val="en-PH" w:eastAsia="en-PH"/>
               </w:rPr>
-              <w:t>{Community_Very_Satisfactory}</w:t>
+              <w:t>{</w:t>
+            </w:r>
+            <w:proofErr w:type="spellStart"/>
+            <w:r>
+              <w:rPr>
+                <w:rFonts w:ascii="Arial" w:hAnsi="Arial" w:cs="Arial"/>
+                <w:sz w:val="22"/>
+                <w:szCs w:val="22"/>
+                <w:lang w:val="en-PH" w:eastAsia="en-PH"/>
+              </w:rPr>
+              <w:t>Community_Very_Satisfactory</w:t>
+            </w:r>
+            <w:proofErr w:type="spellEnd"/>
+            <w:r>
+              <w:rPr>
+                <w:rFonts w:ascii="Arial" w:hAnsi="Arial" w:cs="Arial"/>
+                <w:sz w:val="22"/>
+                <w:szCs w:val="22"/>
+                <w:lang w:val="en-PH" w:eastAsia="en-PH"/>
+              </w:rPr>
+              <w:t>}</w:t>
             </w:r>
             <w:r>
               <w:rPr>
@@ -9281,7 +10170,27 @@
                 <w:szCs w:val="22"/>
                 <w:lang w:val="en-PH" w:eastAsia="en-PH"/>
               </w:rPr>
-              <w:t>{WellBeing_Very_Satisfactory}</w:t>
+              <w:t>{</w:t>
+            </w:r>
+            <w:proofErr w:type="spellStart"/>
+            <w:r>
+              <w:rPr>
+                <w:rFonts w:ascii="Arial" w:hAnsi="Arial" w:cs="Arial"/>
+                <w:sz w:val="22"/>
+                <w:szCs w:val="22"/>
+                <w:lang w:val="en-PH" w:eastAsia="en-PH"/>
+              </w:rPr>
+              <w:t>WellBeing_Very_Satisfactory</w:t>
+            </w:r>
+            <w:proofErr w:type="spellEnd"/>
+            <w:r>
+              <w:rPr>
+                <w:rFonts w:ascii="Arial" w:hAnsi="Arial" w:cs="Arial"/>
+                <w:sz w:val="22"/>
+                <w:szCs w:val="22"/>
+                <w:lang w:val="en-PH" w:eastAsia="en-PH"/>
+              </w:rPr>
+              <w:t>}</w:t>
             </w:r>
             <w:r>
               <w:rPr>
@@ -9406,7 +10315,27 @@
                 <w:szCs w:val="22"/>
                 <w:lang w:val="en-PH" w:eastAsia="en-PH"/>
               </w:rPr>
-              <w:t>{Support_Satisfactory}</w:t>
+              <w:t>{</w:t>
+            </w:r>
+            <w:proofErr w:type="spellStart"/>
+            <w:r>
+              <w:rPr>
+                <w:rFonts w:ascii="Arial" w:hAnsi="Arial" w:cs="Arial"/>
+                <w:sz w:val="22"/>
+                <w:szCs w:val="22"/>
+                <w:lang w:val="en-PH" w:eastAsia="en-PH"/>
+              </w:rPr>
+              <w:t>Support_Satisfactory</w:t>
+            </w:r>
+            <w:proofErr w:type="spellEnd"/>
+            <w:r>
+              <w:rPr>
+                <w:rFonts w:ascii="Arial" w:hAnsi="Arial" w:cs="Arial"/>
+                <w:sz w:val="22"/>
+                <w:szCs w:val="22"/>
+                <w:lang w:val="en-PH" w:eastAsia="en-PH"/>
+              </w:rPr>
+              <w:t>}</w:t>
             </w:r>
             <w:r>
               <w:rPr>
@@ -9525,7 +10454,27 @@
                 <w:szCs w:val="22"/>
                 <w:lang w:val="en-PH" w:eastAsia="en-PH"/>
               </w:rPr>
-              <w:t>{Community_Satisfactory}</w:t>
+              <w:t>{</w:t>
+            </w:r>
+            <w:proofErr w:type="spellStart"/>
+            <w:r>
+              <w:rPr>
+                <w:rFonts w:ascii="Arial" w:hAnsi="Arial" w:cs="Arial"/>
+                <w:sz w:val="22"/>
+                <w:szCs w:val="22"/>
+                <w:lang w:val="en-PH" w:eastAsia="en-PH"/>
+              </w:rPr>
+              <w:t>Community_Satisfactory</w:t>
+            </w:r>
+            <w:proofErr w:type="spellEnd"/>
+            <w:r>
+              <w:rPr>
+                <w:rFonts w:ascii="Arial" w:hAnsi="Arial" w:cs="Arial"/>
+                <w:sz w:val="22"/>
+                <w:szCs w:val="22"/>
+                <w:lang w:val="en-PH" w:eastAsia="en-PH"/>
+              </w:rPr>
+              <w:t>}</w:t>
             </w:r>
             <w:r>
               <w:rPr>
@@ -9621,7 +10570,27 @@
                 <w:szCs w:val="22"/>
                 <w:lang w:val="en-PH" w:eastAsia="en-PH"/>
               </w:rPr>
-              <w:t>{WellBeing_Satisfactory}</w:t>
+              <w:t>{</w:t>
+            </w:r>
+            <w:proofErr w:type="spellStart"/>
+            <w:r>
+              <w:rPr>
+                <w:rFonts w:ascii="Arial" w:hAnsi="Arial" w:cs="Arial"/>
+                <w:sz w:val="22"/>
+                <w:szCs w:val="22"/>
+                <w:lang w:val="en-PH" w:eastAsia="en-PH"/>
+              </w:rPr>
+              <w:t>WellBeing_Satisfactory</w:t>
+            </w:r>
+            <w:proofErr w:type="spellEnd"/>
+            <w:r>
+              <w:rPr>
+                <w:rFonts w:ascii="Arial" w:hAnsi="Arial" w:cs="Arial"/>
+                <w:sz w:val="22"/>
+                <w:szCs w:val="22"/>
+                <w:lang w:val="en-PH" w:eastAsia="en-PH"/>
+              </w:rPr>
+              <w:t>}</w:t>
             </w:r>
             <w:r>
               <w:rPr>
@@ -9746,7 +10715,27 @@
                 <w:szCs w:val="22"/>
                 <w:lang w:val="en-PH" w:eastAsia="en-PH"/>
               </w:rPr>
-              <w:t>{Support_Poor}</w:t>
+              <w:t>{</w:t>
+            </w:r>
+            <w:proofErr w:type="spellStart"/>
+            <w:r>
+              <w:rPr>
+                <w:rFonts w:ascii="Arial" w:hAnsi="Arial" w:cs="Arial"/>
+                <w:sz w:val="22"/>
+                <w:szCs w:val="22"/>
+                <w:lang w:val="en-PH" w:eastAsia="en-PH"/>
+              </w:rPr>
+              <w:t>Support_Poor</w:t>
+            </w:r>
+            <w:proofErr w:type="spellEnd"/>
+            <w:r>
+              <w:rPr>
+                <w:rFonts w:ascii="Arial" w:hAnsi="Arial" w:cs="Arial"/>
+                <w:sz w:val="22"/>
+                <w:szCs w:val="22"/>
+                <w:lang w:val="en-PH" w:eastAsia="en-PH"/>
+              </w:rPr>
+              <w:t>}</w:t>
             </w:r>
             <w:r>
               <w:rPr>
@@ -9865,7 +10854,27 @@
                 <w:szCs w:val="22"/>
                 <w:lang w:val="en-PH" w:eastAsia="en-PH"/>
               </w:rPr>
-              <w:t>{Community_Poor}</w:t>
+              <w:t>{</w:t>
+            </w:r>
+            <w:proofErr w:type="spellStart"/>
+            <w:r>
+              <w:rPr>
+                <w:rFonts w:ascii="Arial" w:hAnsi="Arial" w:cs="Arial"/>
+                <w:sz w:val="22"/>
+                <w:szCs w:val="22"/>
+                <w:lang w:val="en-PH" w:eastAsia="en-PH"/>
+              </w:rPr>
+              <w:t>Community_Poor</w:t>
+            </w:r>
+            <w:proofErr w:type="spellEnd"/>
+            <w:r>
+              <w:rPr>
+                <w:rFonts w:ascii="Arial" w:hAnsi="Arial" w:cs="Arial"/>
+                <w:sz w:val="22"/>
+                <w:szCs w:val="22"/>
+                <w:lang w:val="en-PH" w:eastAsia="en-PH"/>
+              </w:rPr>
+              <w:t>}</w:t>
             </w:r>
             <w:r>
               <w:rPr>
@@ -9961,7 +10970,27 @@
                 <w:szCs w:val="22"/>
                 <w:lang w:val="en-PH" w:eastAsia="en-PH"/>
               </w:rPr>
-              <w:t>{WellBeing_Poor}</w:t>
+              <w:t>{</w:t>
+            </w:r>
+            <w:proofErr w:type="spellStart"/>
+            <w:r>
+              <w:rPr>
+                <w:rFonts w:ascii="Arial" w:hAnsi="Arial" w:cs="Arial"/>
+                <w:sz w:val="22"/>
+                <w:szCs w:val="22"/>
+                <w:lang w:val="en-PH" w:eastAsia="en-PH"/>
+              </w:rPr>
+              <w:t>WellBeing_Poor</w:t>
+            </w:r>
+            <w:proofErr w:type="spellEnd"/>
+            <w:r>
+              <w:rPr>
+                <w:rFonts w:ascii="Arial" w:hAnsi="Arial" w:cs="Arial"/>
+                <w:sz w:val="22"/>
+                <w:szCs w:val="22"/>
+                <w:lang w:val="en-PH" w:eastAsia="en-PH"/>
+              </w:rPr>
+              <w:t>}</w:t>
             </w:r>
             <w:r>
               <w:rPr>
@@ -10059,20 +11088,32 @@
         <w:jc w:val="both"/>
         <w:rPr>
           <w:rFonts w:ascii="Arial" w:hAnsi="Arial" w:cs="Arial"/>
+          <w:sz w:val="22"/>
+          <w:szCs w:val="22"/>
+        </w:rPr>
+      </w:pPr>
+      <w:r>
+        <w:rPr>
+          <w:rFonts w:ascii="Arial" w:hAnsi="Arial" w:cs="Arial"/>
+          <w:sz w:val="22"/>
+          <w:szCs w:val="22"/>
+        </w:rPr>
+        <w:t>{Circumstances}</w:t>
+      </w:r>
+    </w:p>
+    <w:p>
+      <w:pPr>
+        <w:suppressAutoHyphens w:val="0"/>
+        <w:ind w:firstLine="720"/>
+        <w:jc w:val="both"/>
+        <w:rPr>
+          <w:rFonts w:ascii="Arial" w:hAnsi="Arial" w:cs="Arial"/>
           <w:color w:val="EE0000"/>
           <w:sz w:val="21"/>
           <w:szCs w:val="21"/>
           <w:lang w:val="en-PH"/>
         </w:rPr>
       </w:pPr>
-      <w:r>
-        <w:rPr>
-          <w:rFonts w:ascii="Arial" w:hAnsi="Arial" w:cs="Arial"/>
-          <w:sz w:val="22"/>
-          <w:szCs w:val="22"/>
-        </w:rPr>
-        <w:t>{Circumstances}</w:t>
-      </w:r>
     </w:p>
     <w:p>
       <w:pPr>
@@ -10194,7 +11235,25 @@
           <w:sz w:val="21"/>
           <w:szCs w:val="21"/>
         </w:rPr>
-        <w:t>Therapeutic Community Ladderized Program; and/or</w:t>
+        <w:t xml:space="preserve">Therapeutic Community </w:t>
+      </w:r>
+      <w:proofErr w:type="spellStart"/>
+      <w:r>
+        <w:rPr>
+          <w:rFonts w:ascii="Arial" w:hAnsi="Arial" w:cs="Arial"/>
+          <w:sz w:val="21"/>
+          <w:szCs w:val="21"/>
+        </w:rPr>
+        <w:t>Ladderized</w:t>
+      </w:r>
+      <w:proofErr w:type="spellEnd"/>
+      <w:r>
+        <w:rPr>
+          <w:rFonts w:ascii="Arial" w:hAnsi="Arial" w:cs="Arial"/>
+          <w:sz w:val="21"/>
+          <w:szCs w:val="21"/>
+        </w:rPr>
+        <w:t xml:space="preserve"> Program; and/or</w:t>
       </w:r>
     </w:p>
     <w:p>
@@ -10308,7 +11367,47 @@
           <w:sz w:val="22"/>
           <w:szCs w:val="22"/>
         </w:rPr>
-        <w:t>{Last_Name}, {First_Name} {Middle_Name}</w:t>
+        <w:t>{</w:t>
+      </w:r>
+      <w:proofErr w:type="spellStart"/>
+      <w:r>
+        <w:rPr>
+          <w:rFonts w:ascii="Arial" w:hAnsi="Arial" w:cs="Arial"/>
+          <w:b/>
+          <w:sz w:val="22"/>
+          <w:szCs w:val="22"/>
+        </w:rPr>
+        <w:t>Last_Name</w:t>
+      </w:r>
+      <w:proofErr w:type="spellEnd"/>
+      <w:r>
+        <w:rPr>
+          <w:rFonts w:ascii="Arial" w:hAnsi="Arial" w:cs="Arial"/>
+          <w:b/>
+          <w:sz w:val="22"/>
+          <w:szCs w:val="22"/>
+        </w:rPr>
+        <w:t>}, {</w:t>
+      </w:r>
+      <w:proofErr w:type="spellStart"/>
+      <w:r>
+        <w:rPr>
+          <w:rFonts w:ascii="Arial" w:hAnsi="Arial" w:cs="Arial"/>
+          <w:b/>
+          <w:sz w:val="22"/>
+          <w:szCs w:val="22"/>
+        </w:rPr>
+        <w:t>First_Name</w:t>
+      </w:r>
+      <w:proofErr w:type="spellEnd"/>
+      <w:r>
+        <w:rPr>
+          <w:rFonts w:ascii="Arial" w:hAnsi="Arial" w:cs="Arial"/>
+          <w:b/>
+          <w:sz w:val="22"/>
+          <w:szCs w:val="22"/>
+        </w:rPr>
+        <w:t>} {Middle_Name}</w:t>
       </w:r>
       <w:r>
         <w:rPr>
@@ -10471,7 +11570,27 @@
           <w:sz w:val="22"/>
           <w:szCs w:val="22"/>
         </w:rPr>
-        <w:t xml:space="preserve"> IBP Building, E.B. Aumentado St., Tagbilaran City, Bohol</w:t>
+        <w:t xml:space="preserve"> IBP Building, E.B. </w:t>
+      </w:r>
+      <w:proofErr w:type="spellStart"/>
+      <w:r>
+        <w:rPr>
+          <w:rFonts w:ascii="Arial" w:hAnsi="Arial" w:cs="Arial"/>
+          <w:b/>
+          <w:sz w:val="22"/>
+          <w:szCs w:val="22"/>
+        </w:rPr>
+        <w:t>Aumentado</w:t>
+      </w:r>
+      <w:proofErr w:type="spellEnd"/>
+      <w:r>
+        <w:rPr>
+          <w:rFonts w:ascii="Arial" w:hAnsi="Arial" w:cs="Arial"/>
+          <w:b/>
+          <w:sz w:val="22"/>
+          <w:szCs w:val="22"/>
+        </w:rPr>
+        <w:t xml:space="preserve"> St., Tagbilaran City, Bohol</w:t>
       </w:r>
       <w:r>
         <w:rPr>
@@ -10670,8 +11789,9 @@
           <w:szCs w:val="22"/>
           <w:lang w:eastAsia="zh-CN"/>
         </w:rPr>
-        <w:t>{Community_Service_Hours}</w:t>
+        <w:t>{</w:t>
       </w:r>
+      <w:proofErr w:type="spellStart"/>
       <w:r>
         <w:rPr>
           <w:rFonts w:ascii="Arial" w:hAnsi="Arial" w:cs="Arial"/>
@@ -10680,6 +11800,27 @@
           <w:szCs w:val="22"/>
           <w:lang w:eastAsia="zh-CN"/>
         </w:rPr>
+        <w:t>Community_Service_Hours</w:t>
+      </w:r>
+      <w:proofErr w:type="spellEnd"/>
+      <w:r>
+        <w:rPr>
+          <w:rFonts w:ascii="Arial" w:hAnsi="Arial" w:cs="Arial"/>
+          <w:b/>
+          <w:sz w:val="22"/>
+          <w:szCs w:val="22"/>
+          <w:lang w:eastAsia="zh-CN"/>
+        </w:rPr>
+        <w:t>}</w:t>
+      </w:r>
+      <w:r>
+        <w:rPr>
+          <w:rFonts w:ascii="Arial" w:hAnsi="Arial" w:cs="Arial"/>
+          <w:b/>
+          <w:sz w:val="22"/>
+          <w:szCs w:val="22"/>
+          <w:lang w:eastAsia="zh-CN"/>
+        </w:rPr>
         <w:t xml:space="preserve"> </w:t>
       </w:r>
       <w:r>
@@ -10699,7 +11840,29 @@
           <w:szCs w:val="22"/>
           <w:lang w:val="en-AU" w:eastAsia="zh-CN"/>
         </w:rPr>
-        <w:t>{Community_Service_Type}</w:t>
+        <w:t>{</w:t>
+      </w:r>
+      <w:proofErr w:type="spellStart"/>
+      <w:r>
+        <w:rPr>
+          <w:rFonts w:ascii="Arial" w:hAnsi="Arial" w:cs="Arial"/>
+          <w:b/>
+          <w:sz w:val="22"/>
+          <w:szCs w:val="22"/>
+          <w:lang w:val="en-AU" w:eastAsia="zh-CN"/>
+        </w:rPr>
+        <w:t>Community_Service_Type</w:t>
+      </w:r>
+      <w:proofErr w:type="spellEnd"/>
+      <w:r>
+        <w:rPr>
+          <w:rFonts w:ascii="Arial" w:hAnsi="Arial" w:cs="Arial"/>
+          <w:b/>
+          <w:sz w:val="22"/>
+          <w:szCs w:val="22"/>
+          <w:lang w:val="en-AU" w:eastAsia="zh-CN"/>
+        </w:rPr>
+        <w:t>}</w:t>
       </w:r>
       <w:r>
         <w:rPr>
@@ -10810,7 +11973,25 @@
           <w:sz w:val="22"/>
           <w:szCs w:val="22"/>
         </w:rPr>
-        <w:t>He shall participate in the Training on Therapeutic Community Ladderized Program;</w:t>
+        <w:t xml:space="preserve">He shall participate in the Training on Therapeutic Community </w:t>
+      </w:r>
+      <w:proofErr w:type="spellStart"/>
+      <w:r>
+        <w:rPr>
+          <w:rFonts w:ascii="Arial" w:hAnsi="Arial" w:cs="Arial"/>
+          <w:sz w:val="22"/>
+          <w:szCs w:val="22"/>
+        </w:rPr>
+        <w:t>Ladderized</w:t>
+      </w:r>
+      <w:proofErr w:type="spellEnd"/>
+      <w:r>
+        <w:rPr>
+          <w:rFonts w:ascii="Arial" w:hAnsi="Arial" w:cs="Arial"/>
+          <w:sz w:val="22"/>
+          <w:szCs w:val="22"/>
+        </w:rPr>
+        <w:t xml:space="preserve"> Program;</w:t>
       </w:r>
     </w:p>
     <w:p>
@@ -12194,7 +13375,57 @@
         <w:szCs w:val="24"/>
         <w:lang w:val="en-PH"/>
       </w:rPr>
-      <w:t>{Last_Name}, {First_Name}</w:t>
+      <w:t>{</w:t>
+    </w:r>
+    <w:proofErr w:type="spellStart"/>
+    <w:r>
+      <w:rPr>
+        <w:rFonts w:ascii="Arial" w:hAnsi="Arial" w:cs="Arial"/>
+        <w:sz w:val="22"/>
+        <w:szCs w:val="24"/>
+        <w:lang w:val="en-PH"/>
+      </w:rPr>
+      <w:t>Last_Name</w:t>
+    </w:r>
+    <w:proofErr w:type="spellEnd"/>
+    <w:r>
+      <w:rPr>
+        <w:rFonts w:ascii="Arial" w:hAnsi="Arial" w:cs="Arial"/>
+        <w:sz w:val="22"/>
+        <w:szCs w:val="24"/>
+        <w:lang w:val="en-PH"/>
+      </w:rPr>
+      <w:t>}, {</w:t>
+    </w:r>
+    <w:proofErr w:type="spellStart"/>
+    <w:r>
+      <w:rPr>
+        <w:rFonts w:ascii="Arial" w:hAnsi="Arial" w:cs="Arial"/>
+        <w:sz w:val="22"/>
+        <w:szCs w:val="24"/>
+        <w:lang w:val="en-PH"/>
+      </w:rPr>
+      <w:t>First_</w:t>
+    </w:r>
+    <w:proofErr w:type="gramStart"/>
+    <w:r>
+      <w:rPr>
+        <w:rFonts w:ascii="Arial" w:hAnsi="Arial" w:cs="Arial"/>
+        <w:sz w:val="22"/>
+        <w:szCs w:val="24"/>
+        <w:lang w:val="en-PH"/>
+      </w:rPr>
+      <w:t>Name</w:t>
+    </w:r>
+    <w:proofErr w:type="spellEnd"/>
+    <w:r>
+      <w:rPr>
+        <w:rFonts w:ascii="Arial" w:hAnsi="Arial" w:cs="Arial"/>
+        <w:sz w:val="22"/>
+        <w:szCs w:val="24"/>
+        <w:lang w:val="en-PH"/>
+      </w:rPr>
+      <w:t>}</w:t>
     </w:r>
     <w:r>
       <w:rPr>
@@ -12203,7 +13434,17 @@
         <w:szCs w:val="24"/>
         <w:lang w:val="en-PH"/>
       </w:rPr>
-      <w:t xml:space="preserve">          </w:t>
+      <w:t xml:space="preserve">   </w:t>
+    </w:r>
+    <w:proofErr w:type="gramEnd"/>
+    <w:r>
+      <w:rPr>
+        <w:rFonts w:ascii="Arial" w:hAnsi="Arial" w:cs="Arial"/>
+        <w:sz w:val="22"/>
+        <w:szCs w:val="24"/>
+        <w:lang w:val="en-PH"/>
+      </w:rPr>
+      <w:t xml:space="preserve">       </w:t>
     </w:r>
     <w:r>
       <w:rPr>
@@ -12262,7 +13503,27 @@
         <w:sz w:val="22"/>
         <w:szCs w:val="24"/>
       </w:rPr>
-      <w:t>{Investigation_Docket_Number}</w:t>
+      <w:t>{</w:t>
+    </w:r>
+    <w:proofErr w:type="spellStart"/>
+    <w:r>
+      <w:rPr>
+        <w:rFonts w:ascii="Arial" w:hAnsi="Arial" w:cs="Arial"/>
+        <w:color w:val="000000"/>
+        <w:sz w:val="22"/>
+        <w:szCs w:val="24"/>
+      </w:rPr>
+      <w:t>Investigation_Docket_Number</w:t>
+    </w:r>
+    <w:proofErr w:type="spellEnd"/>
+    <w:r>
+      <w:rPr>
+        <w:rFonts w:ascii="Arial" w:hAnsi="Arial" w:cs="Arial"/>
+        <w:color w:val="000000"/>
+        <w:sz w:val="22"/>
+        <w:szCs w:val="24"/>
+      </w:rPr>
+      <w:t>}</w:t>
     </w:r>
   </w:p>
   <w:p>
@@ -12296,7 +13557,29 @@
         <w:sz w:val="22"/>
         <w:szCs w:val="24"/>
       </w:rPr>
-      <w:t>{Criminal_Case_Number}</w:t>
+      <w:t>{</w:t>
+    </w:r>
+    <w:proofErr w:type="spellStart"/>
+    <w:r>
+      <w:rPr>
+        <w:rFonts w:ascii="Arial" w:hAnsi="Arial" w:cs="Arial"/>
+        <w:bCs/>
+        <w:color w:val="000000"/>
+        <w:sz w:val="22"/>
+        <w:szCs w:val="24"/>
+      </w:rPr>
+      <w:t>Criminal_Case_Number</w:t>
+    </w:r>
+    <w:proofErr w:type="spellEnd"/>
+    <w:r>
+      <w:rPr>
+        <w:rFonts w:ascii="Arial" w:hAnsi="Arial" w:cs="Arial"/>
+        <w:bCs/>
+        <w:color w:val="000000"/>
+        <w:sz w:val="22"/>
+        <w:szCs w:val="24"/>
+      </w:rPr>
+      <w:t>}</w:t>
     </w:r>
     <w:r>
       <w:rPr>
@@ -15137,6 +16420,7 @@
   <w:style w:type="character" w:default="1" w:styleId="DefaultParagraphFont">
     <w:name w:val="Default Paragraph Font"/>
     <w:uiPriority w:val="1"/>
+    <w:semiHidden/>
     <w:unhideWhenUsed/>
   </w:style>
   <w:style w:type="table" w:default="1" w:styleId="TableNormal">

</xml_diff>

<commit_message>
feat: add fields for preparer and reviewer information in Section IV and update PSIR template
</commit_message>
<xml_diff>
--- a/templates/PSIR.docx
+++ b/templates/PSIR.docx
@@ -333,7 +333,39 @@
           <w:szCs w:val="24"/>
           <w:lang w:val="en-PH"/>
         </w:rPr>
-        <w:t xml:space="preserve"> SPPO FAITH KIRSTIE T. YAM</w:t>
+        <w:t xml:space="preserve"> </w:t>
+      </w:r>
+      <w:r>
+        <w:rPr>
+          <w:rFonts w:ascii="Arial" w:hAnsi="Arial" w:cs="Arial"/>
+          <w:b/>
+          <w:sz w:val="24"/>
+          <w:szCs w:val="24"/>
+          <w:lang w:val="en-PH"/>
+        </w:rPr>
+        <w:t>{</w:t>
+      </w:r>
+      <w:proofErr w:type="spellStart"/>
+      <w:r>
+        <w:rPr>
+          <w:rFonts w:ascii="Arial" w:hAnsi="Arial" w:cs="Arial"/>
+          <w:b/>
+          <w:sz w:val="24"/>
+          <w:szCs w:val="24"/>
+          <w:lang w:val="en-PH"/>
+        </w:rPr>
+        <w:t>Prepared_By_Name</w:t>
+      </w:r>
+      <w:proofErr w:type="spellEnd"/>
+      <w:r>
+        <w:rPr>
+          <w:rFonts w:ascii="Arial" w:hAnsi="Arial" w:cs="Arial"/>
+          <w:b/>
+          <w:sz w:val="24"/>
+          <w:szCs w:val="24"/>
+          <w:lang w:val="en-PH"/>
+        </w:rPr>
+        <w:t>}</w:t>
       </w:r>
       <w:r>
         <w:rPr>
@@ -536,7 +568,39 @@
           <w:szCs w:val="24"/>
           <w:lang w:val="en-PH"/>
         </w:rPr>
-        <w:t xml:space="preserve">       CIRILO R. MARAMBA, JR.</w:t>
+        <w:t xml:space="preserve">       </w:t>
+      </w:r>
+      <w:r>
+        <w:rPr>
+          <w:rFonts w:ascii="Arial" w:hAnsi="Arial" w:cs="Arial"/>
+          <w:b/>
+          <w:sz w:val="24"/>
+          <w:szCs w:val="24"/>
+          <w:lang w:val="en-PH"/>
+        </w:rPr>
+        <w:t>{</w:t>
+      </w:r>
+      <w:proofErr w:type="spellStart"/>
+      <w:r>
+        <w:rPr>
+          <w:rFonts w:ascii="Arial" w:hAnsi="Arial" w:cs="Arial"/>
+          <w:b/>
+          <w:sz w:val="24"/>
+          <w:szCs w:val="24"/>
+          <w:lang w:val="en-PH"/>
+        </w:rPr>
+        <w:t>Reviewed_By_Name</w:t>
+      </w:r>
+      <w:proofErr w:type="spellEnd"/>
+      <w:r>
+        <w:rPr>
+          <w:rFonts w:ascii="Arial" w:hAnsi="Arial" w:cs="Arial"/>
+          <w:b/>
+          <w:sz w:val="24"/>
+          <w:szCs w:val="24"/>
+          <w:lang w:val="en-PH"/>
+        </w:rPr>
+        <w:t>}</w:t>
       </w:r>
     </w:p>
     <w:p>
@@ -549,7 +613,7 @@
           <w:bCs/>
           <w:sz w:val="24"/>
           <w:szCs w:val="24"/>
-          <w:lang w:val="en-PH"/>
+          <w:lang w:val="fr-FR"/>
         </w:rPr>
       </w:pPr>
       <w:r>
@@ -560,8 +624,54 @@
           <w:szCs w:val="24"/>
           <w:lang w:val="en-PH"/>
         </w:rPr>
-        <w:t>Chief Probation and Parole Officer</w:t>
+        <w:t xml:space="preserve">   </w:t>
       </w:r>
+      <w:r>
+        <w:rPr>
+          <w:rFonts w:ascii="Arial" w:hAnsi="Arial" w:cs="Arial"/>
+          <w:bCs/>
+          <w:sz w:val="24"/>
+          <w:szCs w:val="24"/>
+          <w:lang w:val="fr-FR"/>
+        </w:rPr>
+        <w:t>{</w:t>
+      </w:r>
+      <w:proofErr w:type="spellStart"/>
+      <w:r>
+        <w:rPr>
+          <w:rFonts w:ascii="Arial" w:hAnsi="Arial" w:cs="Arial"/>
+          <w:bCs/>
+          <w:sz w:val="24"/>
+          <w:szCs w:val="24"/>
+          <w:lang w:val="fr-FR"/>
+        </w:rPr>
+        <w:t>Reviewed_By_Designation</w:t>
+      </w:r>
+      <w:proofErr w:type="spellEnd"/>
+      <w:r>
+        <w:rPr>
+          <w:rFonts w:ascii="Arial" w:hAnsi="Arial" w:cs="Arial"/>
+          <w:bCs/>
+          <w:sz w:val="24"/>
+          <w:szCs w:val="24"/>
+          <w:lang w:val="fr-FR"/>
+        </w:rPr>
+        <w:t>}</w:t>
+      </w:r>
+    </w:p>
+    <w:p>
+      <w:pPr>
+        <w:spacing w:line="276" w:lineRule="auto"/>
+        <w:ind w:left="4680" w:firstLine="720"/>
+        <w:jc w:val="both"/>
+        <w:rPr>
+          <w:rFonts w:ascii="Arial" w:hAnsi="Arial" w:cs="Arial"/>
+          <w:bCs/>
+          <w:sz w:val="24"/>
+          <w:szCs w:val="24"/>
+          <w:lang w:val="en-PH"/>
+        </w:rPr>
+      </w:pPr>
     </w:p>
     <w:p>
       <w:pPr>
@@ -755,7 +865,7 @@
                     <pic:cNvPicPr/>
                   </pic:nvPicPr>
                   <pic:blipFill>
-                    <a:blip r:embed="rId7" cstate="print"/>
+                    <a:blip r:embed="rId8" cstate="print"/>
                     <a:srcRect/>
                     <a:stretch/>
                   </pic:blipFill>
@@ -1136,7 +1246,7 @@
                                             <pic:cNvPicPr/>
                                           </pic:nvPicPr>
                                           <pic:blipFill>
-                                            <a:blip r:embed="rId8" cstate="print"/>
+                                            <a:blip r:embed="rId9" cstate="print"/>
                                             <a:srcRect/>
                                             <a:stretch/>
                                           </pic:blipFill>
@@ -1164,7 +1274,7 @@
                                 </w:rPr>
                                 <w:t xml:space="preserve"> </w:t>
                               </w:r>
-                              <w:hyperlink r:id="rId9" w:history="1">
+                              <w:hyperlink r:id="rId10" w:history="1">
                                 <w:r>
                                   <w:rPr>
                                     <w:rStyle w:val="Hyperlink"/>
@@ -1216,7 +1326,7 @@
                           <pic:cNvPicPr/>
                         </pic:nvPicPr>
                         <pic:blipFill>
-                          <a:blip r:embed="rId10" cstate="print"/>
+                          <a:blip r:embed="rId11" cstate="print"/>
                           <a:srcRect/>
                           <a:stretch/>
                         </pic:blipFill>
@@ -1380,7 +1490,7 @@
                                       <pic:cNvPicPr/>
                                     </pic:nvPicPr>
                                     <pic:blipFill>
-                                      <a:blip r:embed="rId11" cstate="print"/>
+                                      <a:blip r:embed="rId9" cstate="print"/>
                                       <a:srcRect/>
                                       <a:stretch/>
                                     </pic:blipFill>
@@ -5876,7 +5986,6 @@
           <w:sz w:val="27"/>
           <w:szCs w:val="27"/>
         </w:rPr>
-        <w:lastRenderedPageBreak/>
         <w:t>SOCIO-ECONIMIC BACKGROUND</w:t>
       </w:r>
     </w:p>
@@ -11726,6 +11835,7 @@
           <w:sz w:val="22"/>
           <w:szCs w:val="22"/>
         </w:rPr>
+        <w:lastRenderedPageBreak/>
         <w:t>He shall secure a written permit to travel outside the jurisdiction of the Parole and Probation Office from the Chief Probation and Parole Officer, or from the Court if such travel exceeds thirty (30) days;</w:t>
       </w:r>
     </w:p>
@@ -11778,7 +11888,6 @@
           <w:szCs w:val="22"/>
           <w:lang w:eastAsia="zh-CN"/>
         </w:rPr>
-        <w:lastRenderedPageBreak/>
         <w:t xml:space="preserve">He shall conduct </w:t>
       </w:r>
       <w:r>
@@ -12302,7 +12411,29 @@
                 <w:szCs w:val="22"/>
                 <w:u w:val="single"/>
               </w:rPr>
-              <w:t>SPPO FAITH KIRSTIE T. YAM</w:t>
+              <w:t>{</w:t>
+            </w:r>
+            <w:proofErr w:type="spellStart"/>
+            <w:r>
+              <w:rPr>
+                <w:rFonts w:ascii="Arial" w:hAnsi="Arial" w:cs="Arial"/>
+                <w:b/>
+                <w:sz w:val="22"/>
+                <w:szCs w:val="22"/>
+                <w:u w:val="single"/>
+              </w:rPr>
+              <w:t>Prepared_By_Name</w:t>
+            </w:r>
+            <w:proofErr w:type="spellEnd"/>
+            <w:r>
+              <w:rPr>
+                <w:rFonts w:ascii="Arial" w:hAnsi="Arial" w:cs="Arial"/>
+                <w:b/>
+                <w:sz w:val="22"/>
+                <w:szCs w:val="22"/>
+                <w:u w:val="single"/>
+              </w:rPr>
+              <w:t>}</w:t>
             </w:r>
           </w:p>
         </w:tc>
@@ -12345,7 +12476,33 @@
                 <w:u w:val="single"/>
                 <w:lang w:eastAsia="zh-CN"/>
               </w:rPr>
-              <w:t>CIRILO R. MARAMBA, JR.</w:t>
+              <w:t>{</w:t>
+            </w:r>
+            <w:proofErr w:type="spellStart"/>
+            <w:r>
+              <w:rPr>
+                <w:rFonts w:ascii="Arial" w:hAnsi="Arial" w:cs="Arial"/>
+                <w:b/>
+                <w:bCs/>
+                <w:sz w:val="22"/>
+                <w:szCs w:val="22"/>
+                <w:u w:val="single"/>
+                <w:lang w:eastAsia="zh-CN"/>
+              </w:rPr>
+              <w:t>Reviewed_By_Name</w:t>
+            </w:r>
+            <w:proofErr w:type="spellEnd"/>
+            <w:r>
+              <w:rPr>
+                <w:rFonts w:ascii="Arial" w:hAnsi="Arial" w:cs="Arial"/>
+                <w:b/>
+                <w:bCs/>
+                <w:sz w:val="22"/>
+                <w:szCs w:val="22"/>
+                <w:u w:val="single"/>
+                <w:lang w:eastAsia="zh-CN"/>
+              </w:rPr>
+              <w:t>}</w:t>
             </w:r>
           </w:p>
         </w:tc>
@@ -12372,7 +12529,25 @@
                 <w:sz w:val="22"/>
                 <w:szCs w:val="22"/>
               </w:rPr>
-              <w:t>Investigating Officer</w:t>
+              <w:t>{</w:t>
+            </w:r>
+            <w:proofErr w:type="spellStart"/>
+            <w:r>
+              <w:rPr>
+                <w:rFonts w:ascii="Arial" w:hAnsi="Arial" w:cs="Arial"/>
+                <w:sz w:val="22"/>
+                <w:szCs w:val="22"/>
+              </w:rPr>
+              <w:t>Prepared_By_Designation</w:t>
+            </w:r>
+            <w:proofErr w:type="spellEnd"/>
+            <w:r>
+              <w:rPr>
+                <w:rFonts w:ascii="Arial" w:hAnsi="Arial" w:cs="Arial"/>
+                <w:sz w:val="22"/>
+                <w:szCs w:val="22"/>
+              </w:rPr>
+              <w:t>}</w:t>
             </w:r>
           </w:p>
         </w:tc>
@@ -12396,7 +12571,33 @@
                 <w:sz w:val="22"/>
                 <w:szCs w:val="22"/>
               </w:rPr>
-              <w:t xml:space="preserve">                  Chief Probation and Parole Officer</w:t>
+              <w:t xml:space="preserve">                  </w:t>
+            </w:r>
+            <w:r>
+              <w:rPr>
+                <w:rFonts w:ascii="Arial" w:hAnsi="Arial" w:cs="Arial"/>
+                <w:sz w:val="22"/>
+                <w:szCs w:val="22"/>
+              </w:rPr>
+              <w:t>{</w:t>
+            </w:r>
+            <w:proofErr w:type="spellStart"/>
+            <w:r>
+              <w:rPr>
+                <w:rFonts w:ascii="Arial" w:hAnsi="Arial" w:cs="Arial"/>
+                <w:sz w:val="22"/>
+                <w:szCs w:val="22"/>
+              </w:rPr>
+              <w:t>Reviewed_By_Designation</w:t>
+            </w:r>
+            <w:proofErr w:type="spellEnd"/>
+            <w:r>
+              <w:rPr>
+                <w:rFonts w:ascii="Arial" w:hAnsi="Arial" w:cs="Arial"/>
+                <w:sz w:val="22"/>
+                <w:szCs w:val="22"/>
+              </w:rPr>
+              <w:t>}</w:t>
             </w:r>
           </w:p>
         </w:tc>
@@ -12429,11 +12630,31 @@
             <w:r>
               <w:rPr>
                 <w:rFonts w:ascii="Arial" w:hAnsi="Arial" w:cs="Arial"/>
+                <w:sz w:val="22"/>
+                <w:szCs w:val="22"/>
+                <w:lang w:eastAsia="zh-CN"/>
+              </w:rPr>
+              <w:t>{</w:t>
+            </w:r>
+            <w:proofErr w:type="spellStart"/>
+            <w:r>
+              <w:rPr>
+                <w:rFonts w:ascii="Arial" w:hAnsi="Arial" w:cs="Arial"/>
                 <w:noProof/>
                 <w:sz w:val="22"/>
                 <w:szCs w:val="22"/>
               </w:rPr>
-              <w:t>February 13, 2026</w:t>
+              <w:t>Prepared_By_Date</w:t>
+            </w:r>
+            <w:proofErr w:type="spellEnd"/>
+            <w:r>
+              <w:rPr>
+                <w:rFonts w:ascii="Arial" w:hAnsi="Arial" w:cs="Arial"/>
+                <w:noProof/>
+                <w:sz w:val="22"/>
+                <w:szCs w:val="22"/>
+              </w:rPr>
+              <w:t>}</w:t>
             </w:r>
           </w:p>
         </w:tc>
@@ -12470,7 +12691,7 @@
                 <w:szCs w:val="22"/>
                 <w:lang w:eastAsia="zh-CN"/>
               </w:rPr>
-              <w:t>February 13, 2026</w:t>
+              <w:t>{Reviewed_By_Date}</w:t>
             </w:r>
           </w:p>
         </w:tc>
@@ -12485,7 +12706,7 @@
           <w:headerReference w:type="first" r:id="rId16"/>
           <w:footerReference w:type="first" r:id="rId17"/>
           <w:pgSz w:w="12242" w:h="18728" w:code="5"/>
-          <w:pgMar w:top="1440" w:right="1080" w:bottom="1170" w:left="1080" w:header="450" w:footer="709" w:gutter="0"/>
+          <w:pgMar w:top="1440" w:right="1080" w:bottom="1166" w:left="1080" w:header="446" w:footer="706" w:gutter="0"/>
           <w:pgNumType w:start="0"/>
           <w:cols w:space="708"/>
           <w:titlePg/>
@@ -13475,7 +13696,7 @@
         <w:lang w:val="en-PH"/>
       </w:rPr>
       <w:tab/>
-      <w:t xml:space="preserve">         </w:t>
+      <w:t xml:space="preserve">   </w:t>
     </w:r>
     <w:r>
       <w:rPr>
@@ -14207,7 +14428,7 @@
                                     <pic:cNvPicPr/>
                                   </pic:nvPicPr>
                                   <pic:blipFill>
-                                    <a:blip r:embed="rId6" cstate="print"/>
+                                    <a:blip r:embed="rId1" cstate="print"/>
                                     <a:srcRect/>
                                     <a:stretch/>
                                   </pic:blipFill>
@@ -14237,7 +14458,7 @@
                         </w:rPr>
                         <w:t xml:space="preserve"> </w:t>
                       </w:r>
-                      <w:hyperlink r:id="rId7" w:history="1">
+                      <w:hyperlink r:id="rId6" w:history="1">
                         <w:r>
                           <w:rPr>
                             <w:rStyle w:val="Hyperlink"/>
@@ -14270,7 +14491,7 @@
                         </w:rPr>
                         <w:t xml:space="preserve">Website: </w:t>
                       </w:r>
-                      <w:hyperlink r:id="rId8" w:history="1">
+                      <w:hyperlink r:id="rId7" w:history="1">
                         <w:r>
                           <w:rPr>
                             <w:rFonts w:ascii="Arial" w:hAnsi="Arial" w:cs="Arial"/>
@@ -14314,10 +14535,10 @@
                 <o:lock v:ext="edit" aspectratio="t"/>
               </v:shapetype>
               <v:shape id="Image" o:spid="_x0000_s1034" type="#_x0000_t75" style="position:absolute;left:2232;top:-3101;width:9366;height:9143;visibility:visible;mso-wrap-style:square" o:gfxdata="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">
-                <v:imagedata r:id="rId9" o:title=""/>
+                <v:imagedata r:id="rId8" o:title=""/>
               </v:shape>
               <v:shape id="Image" o:spid="_x0000_s1035" type="#_x0000_t75" style="position:absolute;left:54290;top:-3101;width:8903;height:8324;visibility:visible;mso-wrap-style:square" o:gfxdata="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">
-                <v:imagedata r:id="rId10" o:title=""/>
+                <v:imagedata r:id="rId9" o:title=""/>
               </v:shape>
               <v:line id="Straight Connector 179351327" o:spid="_x0000_s1036" style="position:absolute;visibility:visible;mso-wrap-style:square" from="-1378,8905" to="67015,8905" o:connectortype="straight" o:gfxdata="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" strokecolor="#eb613d" strokeweight=".51mm"/>
             </v:group>
@@ -15257,7 +15478,7 @@
                                     <pic:cNvPicPr/>
                                   </pic:nvPicPr>
                                   <pic:blipFill>
-                                    <a:blip r:embed="rId6" cstate="print"/>
+                                    <a:blip r:embed="rId1" cstate="print"/>
                                     <a:srcRect/>
                                     <a:stretch/>
                                   </pic:blipFill>
@@ -15287,7 +15508,7 @@
                         </w:rPr>
                         <w:t xml:space="preserve"> </w:t>
                       </w:r>
-                      <w:hyperlink r:id="rId7" w:history="1">
+                      <w:hyperlink r:id="rId6" w:history="1">
                         <w:r>
                           <w:rPr>
                             <w:rStyle w:val="Hyperlink"/>
@@ -15320,7 +15541,7 @@
                         </w:rPr>
                         <w:t xml:space="preserve">Website: </w:t>
                       </w:r>
-                      <w:hyperlink r:id="rId8" w:history="1">
+                      <w:hyperlink r:id="rId7" w:history="1">
                         <w:r>
                           <w:rPr>
                             <w:rFonts w:ascii="Arial" w:hAnsi="Arial" w:cs="Arial"/>
@@ -15364,10 +15585,10 @@
                 <o:lock v:ext="edit" aspectratio="t"/>
               </v:shapetype>
               <v:shape id="Image" o:spid="_x0000_s1040" type="#_x0000_t75" style="position:absolute;left:2232;top:-3101;width:9366;height:9143;visibility:visible;mso-wrap-style:square" o:gfxdata="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">
-                <v:imagedata r:id="rId9" o:title=""/>
+                <v:imagedata r:id="rId8" o:title=""/>
               </v:shape>
               <v:shape id="Image" o:spid="_x0000_s1041" type="#_x0000_t75" style="position:absolute;left:54290;top:-3101;width:8903;height:8324;visibility:visible;mso-wrap-style:square" o:gfxdata="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">
-                <v:imagedata r:id="rId10" o:title=""/>
+                <v:imagedata r:id="rId9" o:title=""/>
               </v:shape>
               <v:line id="Straight Connector 324931324" o:spid="_x0000_s1042" style="position:absolute;visibility:visible;mso-wrap-style:square" from="-1378,8905" to="67015,8905" o:connectortype="straight" o:gfxdata="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" strokecolor="#eb613d" strokeweight=".51mm"/>
             </v:group>
@@ -16420,7 +16641,6 @@
   <w:style w:type="character" w:default="1" w:styleId="DefaultParagraphFont">
     <w:name w:val="Default Paragraph Font"/>
     <w:uiPriority w:val="1"/>
-    <w:semiHidden/>
     <w:unhideWhenUsed/>
   </w:style>
   <w:style w:type="table" w:default="1" w:styleId="TableNormal">
@@ -16872,4 +17092,16 @@
   <a:objectDefaults/>
   <a:extraClrSchemeLst/>
 </a:theme>
+</file>
+
+<file path=customXml/item1.xml><?xml version="1.0" encoding="utf-8"?>
+<b:Sources xmlns:b="http://schemas.openxmlformats.org/officeDocument/2006/bibliography" xmlns="http://schemas.openxmlformats.org/officeDocument/2006/bibliography" SelectedStyle="\APASixthEditionOfficeOnline.xsl" StyleName="APA" Version="6"/>
+</file>
+
+<file path=customXml/itemProps1.xml><?xml version="1.0" encoding="utf-8"?>
+<ds:datastoreItem xmlns:ds="http://schemas.openxmlformats.org/officeDocument/2006/customXml" ds:itemID="{AEFB8D07-0D0A-47CA-BB7B-5277A4D3BB6B}">
+  <ds:schemaRefs>
+    <ds:schemaRef ds:uri="http://schemas.openxmlformats.org/officeDocument/2006/bibliography"/>
+  </ds:schemaRefs>
+</ds:datastoreItem>
 </file>
</xml_diff>

<commit_message>
feat: update PSIR template
</commit_message>
<xml_diff>
--- a/templates/PSIR.docx
+++ b/templates/PSIR.docx
@@ -295,7 +295,27 @@
           <w:szCs w:val="24"/>
           <w:lang w:val="en-PH"/>
         </w:rPr>
-        <w:t>{Date_Received}</w:t>
+        <w:t>{Date_Rec</w:t>
+      </w:r>
+      <w:r>
+        <w:rPr>
+          <w:rFonts w:ascii="Arial" w:hAnsi="Arial" w:cs="Arial"/>
+          <w:noProof/>
+          <w:sz w:val="24"/>
+          <w:szCs w:val="24"/>
+          <w:lang w:val="en-PH"/>
+        </w:rPr>
+        <w:t>ie</w:t>
+      </w:r>
+      <w:r>
+        <w:rPr>
+          <w:rFonts w:ascii="Arial" w:hAnsi="Arial" w:cs="Arial"/>
+          <w:noProof/>
+          <w:sz w:val="24"/>
+          <w:szCs w:val="24"/>
+          <w:lang w:val="en-PH"/>
+        </w:rPr>
+        <w:t>ved}</w:t>
       </w:r>
       <w:r>
         <w:rPr>
@@ -423,6 +443,18 @@
           <w:lang w:val="en-PH"/>
         </w:rPr>
         <w:t>{First_Name}</w:t>
+      </w:r>
+      <w:r>
+        <w:rPr>
+          <w:rFonts w:ascii="Arial" w:hAnsi="Arial" w:cs="Arial"/>
+          <w:b/>
+          <w:bCs/>
+          <w:noProof/>
+          <w:sz w:val="24"/>
+          <w:szCs w:val="24"/>
+          <w:lang w:val="en-PH"/>
+        </w:rPr>
+        <w:t xml:space="preserve"> y {Middle_Name}</w:t>
       </w:r>
       <w:r>
         <w:rPr>
@@ -1490,7 +1522,7 @@
                                       <pic:cNvPicPr/>
                                     </pic:nvPicPr>
                                     <pic:blipFill>
-                                      <a:blip r:embed="rId9" cstate="print"/>
+                                      <a:blip r:embed="rId12" cstate="print"/>
                                       <a:srcRect/>
                                       <a:stretch/>
                                     </pic:blipFill>
@@ -1518,7 +1550,7 @@
                           </w:rPr>
                           <w:t xml:space="preserve"> </w:t>
                         </w:r>
-                        <w:hyperlink r:id="rId12" w:history="1">
+                        <w:hyperlink r:id="rId13" w:history="1">
                           <w:r>
                             <w:rPr>
                               <w:rStyle w:val="Hyperlink"/>
@@ -1578,7 +1610,7 @@
                   <o:lock v:ext="edit" aspectratio="t"/>
                 </v:shapetype>
                 <v:shape id="Image" o:spid="_x0000_s1031" type="#_x0000_t75" style="position:absolute;top:4191;width:9239;height:9048;visibility:visible;mso-wrap-style:square" o:gfxdata="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">
-                  <v:imagedata r:id="rId13" o:title=""/>
+                  <v:imagedata r:id="rId14" o:title=""/>
                 </v:shape>
               </v:group>
             </w:pict>
@@ -3897,16 +3929,16 @@
         <w:tblLook w:val="0680" w:firstRow="0" w:lastRow="0" w:firstColumn="1" w:lastColumn="0" w:noHBand="1" w:noVBand="1"/>
       </w:tblPr>
       <w:tblGrid>
-        <w:gridCol w:w="1615"/>
+        <w:gridCol w:w="1474"/>
         <w:gridCol w:w="296"/>
-        <w:gridCol w:w="1239"/>
-        <w:gridCol w:w="1167"/>
-        <w:gridCol w:w="2947"/>
-        <w:gridCol w:w="267"/>
-        <w:gridCol w:w="823"/>
+        <w:gridCol w:w="3231"/>
+        <w:gridCol w:w="676"/>
+        <w:gridCol w:w="1704"/>
+        <w:gridCol w:w="248"/>
+        <w:gridCol w:w="815"/>
         <w:gridCol w:w="296"/>
-        <w:gridCol w:w="2000"/>
-        <w:gridCol w:w="296"/>
+        <w:gridCol w:w="1970"/>
+        <w:gridCol w:w="236"/>
       </w:tblGrid>
       <w:tr>
         <w:trPr>
@@ -5078,14 +5110,68 @@
                 <w:szCs w:val="24"/>
               </w:rPr>
             </w:pPr>
+            <w:proofErr w:type="gramStart"/>
             <w:r>
               <w:rPr>
                 <w:rFonts w:ascii="Arial" w:hAnsi="Arial" w:cs="Arial"/>
                 <w:sz w:val="24"/>
                 <w:szCs w:val="24"/>
               </w:rPr>
-              <w:t xml:space="preserve">Address:    </w:t>
-            </w:r>
+              <w:t>Address:</w:t>
+            </w:r>
+            <w:r>
+              <w:rPr>
+                <w:rFonts w:ascii="Arial" w:hAnsi="Arial" w:cs="Arial"/>
+                <w:sz w:val="24"/>
+                <w:szCs w:val="24"/>
+              </w:rPr>
+              <w:t>{</w:t>
+            </w:r>
+            <w:proofErr w:type="spellStart"/>
+            <w:proofErr w:type="gramEnd"/>
+            <w:r>
+              <w:rPr>
+                <w:rFonts w:ascii="Arial" w:hAnsi="Arial" w:cs="Arial"/>
+                <w:sz w:val="24"/>
+                <w:szCs w:val="24"/>
+              </w:rPr>
+              <w:t>Complet</w:t>
+            </w:r>
+            <w:r>
+              <w:rPr>
+                <w:rFonts w:ascii="Arial" w:hAnsi="Arial" w:cs="Arial"/>
+                <w:sz w:val="24"/>
+                <w:szCs w:val="24"/>
+              </w:rPr>
+              <w:t>e_</w:t>
+            </w:r>
+            <w:proofErr w:type="gramStart"/>
+            <w:r>
+              <w:rPr>
+                <w:rFonts w:ascii="Arial" w:hAnsi="Arial" w:cs="Arial"/>
+                <w:sz w:val="24"/>
+                <w:szCs w:val="24"/>
+              </w:rPr>
+              <w:t>Adress</w:t>
+            </w:r>
+            <w:proofErr w:type="spellEnd"/>
+            <w:r>
+              <w:rPr>
+                <w:rFonts w:ascii="Arial" w:hAnsi="Arial" w:cs="Arial"/>
+                <w:sz w:val="24"/>
+                <w:szCs w:val="24"/>
+              </w:rPr>
+              <w:t>}</w:t>
+            </w:r>
+            <w:r>
+              <w:rPr>
+                <w:rFonts w:ascii="Arial" w:hAnsi="Arial" w:cs="Arial"/>
+                <w:sz w:val="24"/>
+                <w:szCs w:val="24"/>
+              </w:rPr>
+              <w:t xml:space="preserve">   </w:t>
+            </w:r>
+            <w:proofErr w:type="gramEnd"/>
           </w:p>
         </w:tc>
         <w:tc>
@@ -11824,6 +11910,7 @@
           <w:sz w:val="22"/>
           <w:szCs w:val="22"/>
         </w:rPr>
+        <w:lastRenderedPageBreak/>
         <w:t xml:space="preserve">He shall reside at </w:t>
       </w:r>
       <w:r>
@@ -11901,7 +11988,6 @@
           <w:sz w:val="22"/>
           <w:szCs w:val="22"/>
         </w:rPr>
-        <w:lastRenderedPageBreak/>
         <w:t>He shall secure a written permit to travel outside the jurisdiction of the Parole and Probation Office from the Chief Probation and Parole Officer, or from the Court if such travel exceeds thirty (30) days;</w:t>
       </w:r>
     </w:p>
@@ -11996,6 +12082,16 @@
           <w:szCs w:val="22"/>
           <w:lang w:eastAsia="zh-CN"/>
         </w:rPr>
+        <w:t xml:space="preserve"> Hours</w:t>
+      </w:r>
+      <w:r>
+        <w:rPr>
+          <w:rFonts w:ascii="Arial" w:hAnsi="Arial" w:cs="Arial"/>
+          <w:b/>
+          <w:sz w:val="22"/>
+          <w:szCs w:val="22"/>
+          <w:lang w:eastAsia="zh-CN"/>
+        </w:rPr>
         <w:t xml:space="preserve"> </w:t>
       </w:r>
       <w:r>
@@ -12038,6 +12134,16 @@
           <w:lang w:val="en-AU" w:eastAsia="zh-CN"/>
         </w:rPr>
         <w:t>}</w:t>
+      </w:r>
+      <w:r>
+        <w:rPr>
+          <w:rFonts w:ascii="Arial" w:hAnsi="Arial" w:cs="Arial"/>
+          <w:b/>
+          <w:sz w:val="22"/>
+          <w:szCs w:val="22"/>
+          <w:lang w:val="en-AU" w:eastAsia="zh-CN"/>
+        </w:rPr>
+        <w:t xml:space="preserve"> fruit-bearing trees, trees that can be used as lumber</w:t>
       </w:r>
       <w:r>
         <w:rPr>
@@ -12767,10 +12873,10 @@
     <w:p>
       <w:pPr>
         <w:sectPr>
-          <w:headerReference w:type="default" r:id="rId14"/>
-          <w:footerReference w:type="default" r:id="rId15"/>
-          <w:headerReference w:type="first" r:id="rId16"/>
-          <w:footerReference w:type="first" r:id="rId17"/>
+          <w:headerReference w:type="default" r:id="rId15"/>
+          <w:footerReference w:type="default" r:id="rId16"/>
+          <w:headerReference w:type="first" r:id="rId17"/>
+          <w:footerReference w:type="first" r:id="rId18"/>
           <w:pgSz w:w="12242" w:h="18728" w:code="5"/>
           <w:pgMar w:top="1440" w:right="1080" w:bottom="1166" w:left="1080" w:header="446" w:footer="706" w:gutter="0"/>
           <w:pgNumType w:start="0"/>
@@ -12782,10 +12888,10 @@
     </w:p>
     <w:p/>
     <w:sectPr>
-      <w:headerReference w:type="default" r:id="rId18"/>
-      <w:footerReference w:type="default" r:id="rId19"/>
-      <w:headerReference w:type="first" r:id="rId20"/>
-      <w:footerReference w:type="first" r:id="rId21"/>
+      <w:headerReference w:type="default" r:id="rId19"/>
+      <w:footerReference w:type="default" r:id="rId20"/>
+      <w:headerReference w:type="first" r:id="rId21"/>
+      <w:footerReference w:type="first" r:id="rId22"/>
       <w:type w:val="continuous"/>
       <w:pgSz w:w="12242" w:h="18728" w:code="5"/>
       <w:pgMar w:top="1440" w:right="1080" w:bottom="1170" w:left="1080" w:header="450" w:footer="709" w:gutter="0"/>
@@ -13692,17 +13798,7 @@
         <w:szCs w:val="24"/>
         <w:lang w:val="en-PH"/>
       </w:rPr>
-      <w:t>First_</w:t>
-    </w:r>
-    <w:proofErr w:type="gramStart"/>
-    <w:r>
-      <w:rPr>
-        <w:rFonts w:ascii="Arial" w:hAnsi="Arial" w:cs="Arial"/>
-        <w:sz w:val="22"/>
-        <w:szCs w:val="24"/>
-        <w:lang w:val="en-PH"/>
-      </w:rPr>
-      <w:t>Name</w:t>
+      <w:t>First_Name</w:t>
     </w:r>
     <w:proofErr w:type="spellEnd"/>
     <w:r>
@@ -13721,6 +13817,25 @@
         <w:szCs w:val="24"/>
         <w:lang w:val="en-PH"/>
       </w:rPr>
+      <w:t xml:space="preserve"> {Middle_</w:t>
+    </w:r>
+    <w:proofErr w:type="gramStart"/>
+    <w:r>
+      <w:rPr>
+        <w:rFonts w:ascii="Arial" w:hAnsi="Arial" w:cs="Arial"/>
+        <w:sz w:val="22"/>
+        <w:szCs w:val="24"/>
+        <w:lang w:val="en-PH"/>
+      </w:rPr>
+      <w:t>Name}</w:t>
+    </w:r>
+    <w:r>
+      <w:rPr>
+        <w:rFonts w:ascii="Arial" w:hAnsi="Arial" w:cs="Arial"/>
+        <w:sz w:val="22"/>
+        <w:szCs w:val="24"/>
+        <w:lang w:val="en-PH"/>
+      </w:rPr>
       <w:t xml:space="preserve">   </w:t>
     </w:r>
     <w:proofErr w:type="gramEnd"/>
@@ -13731,38 +13846,7 @@
         <w:szCs w:val="24"/>
         <w:lang w:val="en-PH"/>
       </w:rPr>
-      <w:t xml:space="preserve">       </w:t>
-    </w:r>
-    <w:r>
-      <w:rPr>
-        <w:rFonts w:ascii="Arial" w:hAnsi="Arial" w:cs="Arial"/>
-        <w:noProof/>
-        <w:sz w:val="22"/>
-        <w:szCs w:val="24"/>
-        <w:lang w:val="en-PH"/>
-      </w:rPr>
-      <w:tab/>
-    </w:r>
-    <w:r>
-      <w:rPr>
-        <w:rFonts w:ascii="Arial" w:hAnsi="Arial" w:cs="Arial"/>
-        <w:noProof/>
-        <w:sz w:val="22"/>
-        <w:szCs w:val="24"/>
-        <w:lang w:val="en-PH"/>
-      </w:rPr>
-      <w:tab/>
-    </w:r>
-    <w:r>
-      <w:rPr>
-        <w:rFonts w:ascii="Arial" w:hAnsi="Arial" w:cs="Arial"/>
-        <w:noProof/>
-        <w:sz w:val="22"/>
-        <w:szCs w:val="24"/>
-        <w:lang w:val="en-PH"/>
-      </w:rPr>
-      <w:tab/>
-      <w:t xml:space="preserve">   </w:t>
+      <w:t xml:space="preserve"> </w:t>
     </w:r>
     <w:r>
       <w:rPr>
@@ -13772,16 +13856,18 @@
         <w:sz w:val="22"/>
         <w:szCs w:val="24"/>
       </w:rPr>
-      <w:t>Investigation Docket No.:</w:t>
+      <w:t xml:space="preserve">Investigation Docket </w:t>
     </w:r>
+    <w:proofErr w:type="gramStart"/>
     <w:r>
       <w:rPr>
         <w:rFonts w:ascii="Arial" w:hAnsi="Arial" w:cs="Arial"/>
+        <w:b/>
         <w:color w:val="000000"/>
         <w:sz w:val="22"/>
         <w:szCs w:val="24"/>
       </w:rPr>
-      <w:t xml:space="preserve"> </w:t>
+      <w:t>No.:</w:t>
     </w:r>
     <w:r>
       <w:rPr>
@@ -13793,6 +13879,7 @@
       <w:t>{</w:t>
     </w:r>
     <w:proofErr w:type="spellStart"/>
+    <w:proofErr w:type="gramEnd"/>
     <w:r>
       <w:rPr>
         <w:rFonts w:ascii="Arial" w:hAnsi="Arial" w:cs="Arial"/>
@@ -14494,7 +14581,7 @@
                                     <pic:cNvPicPr/>
                                   </pic:nvPicPr>
                                   <pic:blipFill>
-                                    <a:blip r:embed="rId1" cstate="print"/>
+                                    <a:blip r:embed="rId6" cstate="print"/>
                                     <a:srcRect/>
                                     <a:stretch/>
                                   </pic:blipFill>
@@ -14524,7 +14611,7 @@
                         </w:rPr>
                         <w:t xml:space="preserve"> </w:t>
                       </w:r>
-                      <w:hyperlink r:id="rId6" w:history="1">
+                      <w:hyperlink r:id="rId7" w:history="1">
                         <w:r>
                           <w:rPr>
                             <w:rStyle w:val="Hyperlink"/>
@@ -14557,7 +14644,7 @@
                         </w:rPr>
                         <w:t xml:space="preserve">Website: </w:t>
                       </w:r>
-                      <w:hyperlink r:id="rId7" w:history="1">
+                      <w:hyperlink r:id="rId8" w:history="1">
                         <w:r>
                           <w:rPr>
                             <w:rFonts w:ascii="Arial" w:hAnsi="Arial" w:cs="Arial"/>
@@ -14601,10 +14688,10 @@
                 <o:lock v:ext="edit" aspectratio="t"/>
               </v:shapetype>
               <v:shape id="Image" o:spid="_x0000_s1034" type="#_x0000_t75" style="position:absolute;left:2232;top:-3101;width:9366;height:9143;visibility:visible;mso-wrap-style:square" o:gfxdata="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">
-                <v:imagedata r:id="rId8" o:title=""/>
+                <v:imagedata r:id="rId9" o:title=""/>
               </v:shape>
               <v:shape id="Image" o:spid="_x0000_s1035" type="#_x0000_t75" style="position:absolute;left:54290;top:-3101;width:8903;height:8324;visibility:visible;mso-wrap-style:square" o:gfxdata="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">
-                <v:imagedata r:id="rId9" o:title=""/>
+                <v:imagedata r:id="rId10" o:title=""/>
               </v:shape>
               <v:line id="Straight Connector 179351327" o:spid="_x0000_s1036" style="position:absolute;visibility:visible;mso-wrap-style:square" from="-1378,8905" to="67015,8905" o:connectortype="straight" o:gfxdata="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" strokecolor="#eb613d" strokeweight=".51mm"/>
             </v:group>
@@ -15544,7 +15631,7 @@
                                     <pic:cNvPicPr/>
                                   </pic:nvPicPr>
                                   <pic:blipFill>
-                                    <a:blip r:embed="rId1" cstate="print"/>
+                                    <a:blip r:embed="rId6" cstate="print"/>
                                     <a:srcRect/>
                                     <a:stretch/>
                                   </pic:blipFill>
@@ -15574,7 +15661,7 @@
                         </w:rPr>
                         <w:t xml:space="preserve"> </w:t>
                       </w:r>
-                      <w:hyperlink r:id="rId6" w:history="1">
+                      <w:hyperlink r:id="rId7" w:history="1">
                         <w:r>
                           <w:rPr>
                             <w:rStyle w:val="Hyperlink"/>
@@ -15607,7 +15694,7 @@
                         </w:rPr>
                         <w:t xml:space="preserve">Website: </w:t>
                       </w:r>
-                      <w:hyperlink r:id="rId7" w:history="1">
+                      <w:hyperlink r:id="rId8" w:history="1">
                         <w:r>
                           <w:rPr>
                             <w:rFonts w:ascii="Arial" w:hAnsi="Arial" w:cs="Arial"/>
@@ -15651,10 +15738,10 @@
                 <o:lock v:ext="edit" aspectratio="t"/>
               </v:shapetype>
               <v:shape id="Image" o:spid="_x0000_s1040" type="#_x0000_t75" style="position:absolute;left:2232;top:-3101;width:9366;height:9143;visibility:visible;mso-wrap-style:square" o:gfxdata="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">
-                <v:imagedata r:id="rId8" o:title=""/>
+                <v:imagedata r:id="rId9" o:title=""/>
               </v:shape>
               <v:shape id="Image" o:spid="_x0000_s1041" type="#_x0000_t75" style="position:absolute;left:54290;top:-3101;width:8903;height:8324;visibility:visible;mso-wrap-style:square" o:gfxdata="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">
-                <v:imagedata r:id="rId9" o:title=""/>
+                <v:imagedata r:id="rId10" o:title=""/>
               </v:shape>
               <v:line id="Straight Connector 324931324" o:spid="_x0000_s1042" style="position:absolute;visibility:visible;mso-wrap-style:square" from="-1378,8905" to="67015,8905" o:connectortype="straight" o:gfxdata="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" strokecolor="#eb613d" strokeweight=".51mm"/>
             </v:group>
@@ -16707,6 +16794,7 @@
   <w:style w:type="character" w:default="1" w:styleId="DefaultParagraphFont">
     <w:name w:val="Default Paragraph Font"/>
     <w:uiPriority w:val="1"/>
+    <w:semiHidden/>
     <w:unhideWhenUsed/>
   </w:style>
   <w:style w:type="table" w:default="1" w:styleId="TableNormal">

</xml_diff>